<commit_message>
John/prog fix uat uplink disable (#209)
* Fix programmer, add ability to toggle parts of UAT reception

* Fix ADSBee 1421 programmer firwmare to stop it from stomping on device settings in flash.
* Add ability to turn off UAT uplink reception with AT+SUBG_MODE

* Remove webpage map interpolation and update datasheet with new AT commands

* Improve baud rate display on webpage console
</commit_message>
<xml_diff>
--- a/word/datasheet_adsbee_m1421.docx
+++ b/word/datasheet_adsbee_m1421.docx
@@ -1,14 +1,16 @@
 
 <file path=word/document.xml><?xml version="1.0" encoding="utf-8"?>
-<w:document xmlns:wpc="http://schemas.microsoft.com/office/word/2010/wordprocessingCanvas" xmlns:cx="http://schemas.microsoft.com/office/drawing/2014/chartex" xmlns:cx1="http://schemas.microsoft.com/office/drawing/2015/9/8/chartex" xmlns:cx2="http://schemas.microsoft.com/office/drawing/2015/10/21/chartex" xmlns:cx3="http://schemas.microsoft.com/office/drawing/2016/5/9/chartex" xmlns:cx4="http://schemas.microsoft.com/office/drawing/2016/5/10/chartex" xmlns:cx5="http://schemas.microsoft.com/office/drawing/2016/5/11/chartex" xmlns:cx6="http://schemas.microsoft.com/office/drawing/2016/5/12/chartex" xmlns:cx7="http://schemas.microsoft.com/office/drawing/2016/5/13/chartex" xmlns:cx8="http://schemas.microsoft.com/office/drawing/2016/5/14/chartex" xmlns:mc="http://schemas.openxmlformats.org/markup-compatibility/2006" xmlns:m="http://schemas.openxmlformats.org/officeDocument/2006/math" xmlns:aink="http://schemas.microsoft.com/office/drawing/2016/ink" xmlns:am3d="http://schemas.microsoft.com/office/drawing/2017/model3d" xmlns:oel="http://schemas.microsoft.com/office/2019/extlst" xmlns:r="http://schemas.openxmlformats.org/officeDocument/2006/relationships" xmlns:wp14="http://schemas.microsoft.com/office/word/2010/wordprocessingDrawing" xmlns:wp="http://schemas.openxmlformats.org/drawingml/2006/wordprocessingDrawing" xmlns:wpg="http://schemas.microsoft.com/office/word/2010/wordprocessingGroup" xmlns:wpi="http://schemas.microsoft.com/office/word/2010/wordprocessingInk" xmlns:wps="http://schemas.microsoft.com/office/word/2010/wordprocessingShape" xmlns:o="urn:schemas-microsoft-com:office:office" xmlns:v="urn:schemas-microsoft-com:vml" xmlns:w10="urn:schemas-microsoft-com:office:word" xmlns:w="http://schemas.openxmlformats.org/wordprocessingml/2006/main" xmlns:w14="http://schemas.microsoft.com/office/word/2010/wordml" xmlns:w15="http://schemas.microsoft.com/office/word/2012/wordml" xmlns:w16cei="http://schemas.microsoft.com/office/word/2026/wordml/cei" xmlns:w16cex="http://schemas.microsoft.com/office/word/2018/wordml/cex" xmlns:w16cid="http://schemas.microsoft.com/office/word/2016/wordml/cid" xmlns:w16="http://schemas.microsoft.com/office/word/2018/wordml" xmlns:w16sdtdh="http://schemas.microsoft.com/office/word/2020/wordml/sdtdatahash" xmlns:w16sdtfl="http://schemas.microsoft.com/office/word/2024/wordml/sdtformatlock" xmlns:w16se="http://schemas.microsoft.com/office/word/2015/wordml/symex" xmlns:w16du="http://schemas.microsoft.com/office/word/2023/wordml/word16du" xmlns:wne="http://schemas.microsoft.com/office/word/2006/wordml" mc:Ignorable="w14 w15 w16se w16cid w16 w16cex w16sdtdh w16sdtfl w16du wp14">
+<w:document xmlns:wpc="http://schemas.microsoft.com/office/word/2010/wordprocessingCanvas" xmlns:cx="http://schemas.microsoft.com/office/drawing/2014/chartex" xmlns:cx1="http://schemas.microsoft.com/office/drawing/2015/9/8/chartex" xmlns:cx2="http://schemas.microsoft.com/office/drawing/2015/10/21/chartex" xmlns:cx3="http://schemas.microsoft.com/office/drawing/2016/5/9/chartex" xmlns:cx4="http://schemas.microsoft.com/office/drawing/2016/5/10/chartex" xmlns:cx5="http://schemas.microsoft.com/office/drawing/2016/5/11/chartex" xmlns:cx6="http://schemas.microsoft.com/office/drawing/2016/5/12/chartex" xmlns:cx7="http://schemas.microsoft.com/office/drawing/2016/5/13/chartex" xmlns:cx8="http://schemas.microsoft.com/office/drawing/2016/5/14/chartex" xmlns:mc="http://schemas.openxmlformats.org/markup-compatibility/2006" xmlns:m="http://schemas.openxmlformats.org/officeDocument/2006/math" xmlns:aink="http://schemas.microsoft.com/office/drawing/2016/ink" xmlns:am3d="http://schemas.microsoft.com/office/drawing/2017/model3d" xmlns:oel="http://schemas.microsoft.com/office/2019/extlst" xmlns:r="http://schemas.openxmlformats.org/officeDocument/2006/relationships" xmlns:wp14="http://schemas.microsoft.com/office/word/2010/wordprocessingDrawing" xmlns:wp="http://schemas.openxmlformats.org/drawingml/2006/wordprocessingDrawing" xmlns:wpg="http://schemas.microsoft.com/office/word/2010/wordprocessingGroup" xmlns:wpi="http://schemas.microsoft.com/office/word/2010/wordprocessingInk" xmlns:wps="http://schemas.microsoft.com/office/word/2010/wordprocessingShape" xmlns:o="urn:schemas-microsoft-com:office:office" xmlns:v="urn:schemas-microsoft-com:vml" xmlns:w10="urn:schemas-microsoft-com:office:word" xmlns:w="http://schemas.openxmlformats.org/wordprocessingml/2006/main" xmlns:w14="http://schemas.microsoft.com/office/word/2010/wordml" xmlns:w15="http://schemas.microsoft.com/office/word/2012/wordml" xmlns:w16cex="http://schemas.microsoft.com/office/word/2018/wordml/cex" xmlns:w16cid="http://schemas.microsoft.com/office/word/2016/wordml/cid" xmlns:w16="http://schemas.microsoft.com/office/word/2018/wordml" xmlns:w16sdtdh="http://schemas.microsoft.com/office/word/2020/wordml/sdtdatahash" xmlns:w16sdtfl="http://schemas.microsoft.com/office/word/2024/wordml/sdtformatlock" xmlns:w16se="http://schemas.microsoft.com/office/word/2015/wordml/symex" xmlns:w16du="http://schemas.microsoft.com/office/word/2023/wordml/word16du" xmlns:wne="http://schemas.microsoft.com/office/word/2006/wordml" mc:Ignorable="w14 w15 w16se w16cid w16 w16cex w16sdtdh w16sdtfl w16du wp14">
   <w:body>
     <w:p>
       <w:pPr>
         <w:sectPr>
           <w:headerReference w:type="even" r:id="rId8"/>
           <w:headerReference w:type="default" r:id="rId9"/>
-          <w:footerReference w:type="default" r:id="rId10"/>
-          <w:headerReference w:type="first" r:id="rId11"/>
+          <w:footerReference w:type="even" r:id="rId10"/>
+          <w:footerReference w:type="default" r:id="rId11"/>
+          <w:headerReference w:type="first" r:id="rId12"/>
+          <w:footerReference w:type="first" r:id="rId13"/>
           <w:pgSz w:w="12240" w:h="15840"/>
           <w:pgMar w:top="720" w:right="720" w:bottom="720" w:left="720" w:header="288" w:footer="288" w:gutter="0"/>
           <w:cols w:space="720"/>
@@ -19,7 +21,7 @@
         <w:rPr>
           <w:noProof/>
         </w:rPr>
-        <w:pict w14:anchorId="20DC0ED6">
+        <w:pict w14:anchorId="55593ECA">
           <v:shapetype id="_x0000_t202" coordsize="21600,21600" o:spt="202" path="m,l,21600r21600,l21600,xe">
             <v:stroke joinstyle="miter"/>
             <v:path gradientshapeok="t" o:connecttype="rect"/>
@@ -91,7 +93,7 @@
                     <pic:cNvPicPr/>
                   </pic:nvPicPr>
                   <pic:blipFill>
-                    <a:blip r:embed="rId12"/>
+                    <a:blip r:embed="rId14"/>
                     <a:stretch>
                       <a:fillRect/>
                     </a:stretch>
@@ -131,7 +133,7 @@
                     <pic:cNvPicPr/>
                   </pic:nvPicPr>
                   <pic:blipFill>
-                    <a:blip r:embed="rId13"/>
+                    <a:blip r:embed="rId15"/>
                     <a:stretch>
                       <a:fillRect/>
                     </a:stretch>
@@ -156,7 +158,7 @@
       <w:pPr>
         <w:pStyle w:val="IgnoredHeading"/>
       </w:pPr>
-      <w:bookmarkStart w:id="0" w:name="_Toc236385920"/>
+      <w:bookmarkStart w:id="0" w:name="_Toc237911174"/>
       <w:r>
         <w:t>Features</w:t>
       </w:r>
@@ -238,7 +240,7 @@
       <w:r>
         <w:br w:type="column"/>
       </w:r>
-      <w:bookmarkStart w:id="1" w:name="_Toc236385921"/>
+      <w:bookmarkStart w:id="1" w:name="_Toc237911175"/>
       <w:r>
         <w:t>Applications</w:t>
       </w:r>
@@ -272,7 +274,7 @@
       <w:pPr>
         <w:pStyle w:val="IgnoredHeading"/>
       </w:pPr>
-      <w:bookmarkStart w:id="2" w:name="_Toc236385922"/>
+      <w:bookmarkStart w:id="2" w:name="_Toc237911176"/>
       <w:r>
         <w:t>Quick Specs</w:t>
       </w:r>
@@ -311,13 +313,7 @@
               <w:t>9</w:t>
             </w:r>
             <w:r>
-              <w:t>mA</w:t>
-            </w:r>
-            <w:r>
-              <w:t>*</w:t>
-            </w:r>
-            <w:r>
-              <w:t xml:space="preserve"> @ 1.8-3.3V</w:t>
+              <w:t>mA @ 1.8-3.3V</w:t>
             </w:r>
           </w:p>
         </w:tc>
@@ -353,9 +349,6 @@
             <w:r>
               <w:t>dBm</w:t>
             </w:r>
-            <w:r>
-              <w:t>*</w:t>
-            </w:r>
           </w:p>
           <w:p>
             <w:r>
@@ -365,7 +358,7 @@
               <w:t>87</w:t>
             </w:r>
             <w:r>
-              <w:t>dBm*</w:t>
+              <w:t>dBm</w:t>
             </w:r>
           </w:p>
         </w:tc>
@@ -387,12 +380,12 @@
           </w:tcPr>
           <w:p>
             <w:r>
-              <w:t>Mode S: 90dBm*</w:t>
-            </w:r>
-          </w:p>
-          <w:p>
-            <w:r>
-              <w:t>UAT: 87dBm*</w:t>
+              <w:t>Mode S: 90dBm</w:t>
+            </w:r>
+          </w:p>
+          <w:p>
+            <w:r>
+              <w:t>UAT: 87dBm</w:t>
             </w:r>
           </w:p>
         </w:tc>
@@ -478,15 +471,6 @@
           <w:docGrid w:linePitch="360"/>
         </w:sectPr>
       </w:pPr>
-      <w:r>
-        <w:t>* = subject to change</w:t>
-      </w:r>
-      <w:r>
-        <w:t xml:space="preserve"> during validatio</w:t>
-      </w:r>
-      <w:r>
-        <w:t>n</w:t>
-      </w:r>
     </w:p>
     <w:p/>
     <w:sdt>
@@ -550,7 +534,7 @@
           <w:r>
             <w:fldChar w:fldCharType="separate"/>
           </w:r>
-          <w:hyperlink w:anchor="_Toc236385920" w:history="1">
+          <w:hyperlink w:anchor="_Toc237911174" w:history="1">
             <w:r>
               <w:rPr>
                 <w:rStyle w:val="Hyperlink"/>
@@ -577,7 +561,7 @@
                 <w:noProof/>
                 <w:webHidden/>
               </w:rPr>
-              <w:instrText xml:space="preserve"> PAGEREF _Toc236385920 \h </w:instrText>
+              <w:instrText xml:space="preserve"> PAGEREF _Toc237911174 \h </w:instrText>
             </w:r>
             <w:r>
               <w:rPr>
@@ -622,7 +606,7 @@
               <w:lang w:eastAsia="zh-CN"/>
             </w:rPr>
           </w:pPr>
-          <w:hyperlink w:anchor="_Toc236385921" w:history="1">
+          <w:hyperlink w:anchor="_Toc237911175" w:history="1">
             <w:r>
               <w:rPr>
                 <w:rStyle w:val="Hyperlink"/>
@@ -649,7 +633,7 @@
                 <w:noProof/>
                 <w:webHidden/>
               </w:rPr>
-              <w:instrText xml:space="preserve"> PAGEREF _Toc236385921 \h </w:instrText>
+              <w:instrText xml:space="preserve"> PAGEREF _Toc237911175 \h </w:instrText>
             </w:r>
             <w:r>
               <w:rPr>
@@ -694,7 +678,7 @@
               <w:lang w:eastAsia="zh-CN"/>
             </w:rPr>
           </w:pPr>
-          <w:hyperlink w:anchor="_Toc236385922" w:history="1">
+          <w:hyperlink w:anchor="_Toc237911176" w:history="1">
             <w:r>
               <w:rPr>
                 <w:rStyle w:val="Hyperlink"/>
@@ -721,7 +705,7 @@
                 <w:noProof/>
                 <w:webHidden/>
               </w:rPr>
-              <w:instrText xml:space="preserve"> PAGEREF _Toc236385922 \h </w:instrText>
+              <w:instrText xml:space="preserve"> PAGEREF _Toc237911176 \h </w:instrText>
             </w:r>
             <w:r>
               <w:rPr>
@@ -766,7 +750,7 @@
               <w:lang w:eastAsia="zh-CN"/>
             </w:rPr>
           </w:pPr>
-          <w:hyperlink w:anchor="_Toc236385923" w:history="1">
+          <w:hyperlink w:anchor="_Toc237911177" w:history="1">
             <w:r>
               <w:rPr>
                 <w:rStyle w:val="Hyperlink"/>
@@ -793,7 +777,7 @@
                 <w:noProof/>
                 <w:webHidden/>
               </w:rPr>
-              <w:instrText xml:space="preserve"> PAGEREF _Toc236385923 \h </w:instrText>
+              <w:instrText xml:space="preserve"> PAGEREF _Toc237911177 \h </w:instrText>
             </w:r>
             <w:r>
               <w:rPr>
@@ -839,7 +823,7 @@
               <w:lang w:eastAsia="zh-CN"/>
             </w:rPr>
           </w:pPr>
-          <w:hyperlink w:anchor="_Toc236385924" w:history="1">
+          <w:hyperlink w:anchor="_Toc237911178" w:history="1">
             <w:r>
               <w:rPr>
                 <w:rStyle w:val="Hyperlink"/>
@@ -883,7 +867,7 @@
                 <w:noProof/>
                 <w:webHidden/>
               </w:rPr>
-              <w:instrText xml:space="preserve"> PAGEREF _Toc236385924 \h </w:instrText>
+              <w:instrText xml:space="preserve"> PAGEREF _Toc237911178 \h </w:instrText>
             </w:r>
             <w:r>
               <w:rPr>
@@ -929,7 +913,7 @@
               <w:lang w:eastAsia="zh-CN"/>
             </w:rPr>
           </w:pPr>
-          <w:hyperlink w:anchor="_Toc236385925" w:history="1">
+          <w:hyperlink w:anchor="_Toc237911179" w:history="1">
             <w:r>
               <w:rPr>
                 <w:rStyle w:val="Hyperlink"/>
@@ -973,7 +957,7 @@
                 <w:noProof/>
                 <w:webHidden/>
               </w:rPr>
-              <w:instrText xml:space="preserve"> PAGEREF _Toc236385925 \h </w:instrText>
+              <w:instrText xml:space="preserve"> PAGEREF _Toc237911179 \h </w:instrText>
             </w:r>
             <w:r>
               <w:rPr>
@@ -1019,7 +1003,7 @@
               <w:lang w:eastAsia="zh-CN"/>
             </w:rPr>
           </w:pPr>
-          <w:hyperlink w:anchor="_Toc236385926" w:history="1">
+          <w:hyperlink w:anchor="_Toc237911180" w:history="1">
             <w:r>
               <w:rPr>
                 <w:rStyle w:val="Hyperlink"/>
@@ -1063,7 +1047,7 @@
                 <w:noProof/>
                 <w:webHidden/>
               </w:rPr>
-              <w:instrText xml:space="preserve"> PAGEREF _Toc236385926 \h </w:instrText>
+              <w:instrText xml:space="preserve"> PAGEREF _Toc237911180 \h </w:instrText>
             </w:r>
             <w:r>
               <w:rPr>
@@ -1109,7 +1093,7 @@
               <w:lang w:eastAsia="zh-CN"/>
             </w:rPr>
           </w:pPr>
-          <w:hyperlink w:anchor="_Toc236385927" w:history="1">
+          <w:hyperlink w:anchor="_Toc237911181" w:history="1">
             <w:r>
               <w:rPr>
                 <w:rStyle w:val="Hyperlink"/>
@@ -1153,7 +1137,7 @@
                 <w:noProof/>
                 <w:webHidden/>
               </w:rPr>
-              <w:instrText xml:space="preserve"> PAGEREF _Toc236385927 \h </w:instrText>
+              <w:instrText xml:space="preserve"> PAGEREF _Toc237911181 \h </w:instrText>
             </w:r>
             <w:r>
               <w:rPr>
@@ -1199,7 +1183,7 @@
               <w:lang w:eastAsia="zh-CN"/>
             </w:rPr>
           </w:pPr>
-          <w:hyperlink w:anchor="_Toc236385928" w:history="1">
+          <w:hyperlink w:anchor="_Toc237911182" w:history="1">
             <w:r>
               <w:rPr>
                 <w:rStyle w:val="Hyperlink"/>
@@ -1243,7 +1227,7 @@
                 <w:noProof/>
                 <w:webHidden/>
               </w:rPr>
-              <w:instrText xml:space="preserve"> PAGEREF _Toc236385928 \h </w:instrText>
+              <w:instrText xml:space="preserve"> PAGEREF _Toc237911182 \h </w:instrText>
             </w:r>
             <w:r>
               <w:rPr>
@@ -1289,7 +1273,7 @@
               <w:lang w:eastAsia="zh-CN"/>
             </w:rPr>
           </w:pPr>
-          <w:hyperlink w:anchor="_Toc236385929" w:history="1">
+          <w:hyperlink w:anchor="_Toc237911183" w:history="1">
             <w:r>
               <w:rPr>
                 <w:rStyle w:val="Hyperlink"/>
@@ -1333,7 +1317,7 @@
                 <w:noProof/>
                 <w:webHidden/>
               </w:rPr>
-              <w:instrText xml:space="preserve"> PAGEREF _Toc236385929 \h </w:instrText>
+              <w:instrText xml:space="preserve"> PAGEREF _Toc237911183 \h </w:instrText>
             </w:r>
             <w:r>
               <w:rPr>
@@ -1379,7 +1363,7 @@
               <w:lang w:eastAsia="zh-CN"/>
             </w:rPr>
           </w:pPr>
-          <w:hyperlink w:anchor="_Toc236385930" w:history="1">
+          <w:hyperlink w:anchor="_Toc237911184" w:history="1">
             <w:r>
               <w:rPr>
                 <w:rStyle w:val="Hyperlink"/>
@@ -1423,7 +1407,7 @@
                 <w:noProof/>
                 <w:webHidden/>
               </w:rPr>
-              <w:instrText xml:space="preserve"> PAGEREF _Toc236385930 \h </w:instrText>
+              <w:instrText xml:space="preserve"> PAGEREF _Toc237911184 \h </w:instrText>
             </w:r>
             <w:r>
               <w:rPr>
@@ -1469,7 +1453,7 @@
               <w:lang w:eastAsia="zh-CN"/>
             </w:rPr>
           </w:pPr>
-          <w:hyperlink w:anchor="_Toc236385931" w:history="1">
+          <w:hyperlink w:anchor="_Toc237911185" w:history="1">
             <w:r>
               <w:rPr>
                 <w:rStyle w:val="Hyperlink"/>
@@ -1513,7 +1497,7 @@
                 <w:noProof/>
                 <w:webHidden/>
               </w:rPr>
-              <w:instrText xml:space="preserve"> PAGEREF _Toc236385931 \h </w:instrText>
+              <w:instrText xml:space="preserve"> PAGEREF _Toc237911185 \h </w:instrText>
             </w:r>
             <w:r>
               <w:rPr>
@@ -1559,7 +1543,7 @@
               <w:lang w:eastAsia="zh-CN"/>
             </w:rPr>
           </w:pPr>
-          <w:hyperlink w:anchor="_Toc236385932" w:history="1">
+          <w:hyperlink w:anchor="_Toc237911186" w:history="1">
             <w:r>
               <w:rPr>
                 <w:rStyle w:val="Hyperlink"/>
@@ -1603,7 +1587,7 @@
                 <w:noProof/>
                 <w:webHidden/>
               </w:rPr>
-              <w:instrText xml:space="preserve"> PAGEREF _Toc236385932 \h </w:instrText>
+              <w:instrText xml:space="preserve"> PAGEREF _Toc237911186 \h </w:instrText>
             </w:r>
             <w:r>
               <w:rPr>
@@ -1649,7 +1633,7 @@
               <w:lang w:eastAsia="zh-CN"/>
             </w:rPr>
           </w:pPr>
-          <w:hyperlink w:anchor="_Toc236385933" w:history="1">
+          <w:hyperlink w:anchor="_Toc237911187" w:history="1">
             <w:r>
               <w:rPr>
                 <w:rStyle w:val="Hyperlink"/>
@@ -1693,7 +1677,7 @@
                 <w:noProof/>
                 <w:webHidden/>
               </w:rPr>
-              <w:instrText xml:space="preserve"> PAGEREF _Toc236385933 \h </w:instrText>
+              <w:instrText xml:space="preserve"> PAGEREF _Toc237911187 \h </w:instrText>
             </w:r>
             <w:r>
               <w:rPr>
@@ -1739,7 +1723,7 @@
               <w:lang w:eastAsia="zh-CN"/>
             </w:rPr>
           </w:pPr>
-          <w:hyperlink w:anchor="_Toc236385934" w:history="1">
+          <w:hyperlink w:anchor="_Toc237911188" w:history="1">
             <w:r>
               <w:rPr>
                 <w:rStyle w:val="Hyperlink"/>
@@ -1783,7 +1767,7 @@
                 <w:noProof/>
                 <w:webHidden/>
               </w:rPr>
-              <w:instrText xml:space="preserve"> PAGEREF _Toc236385934 \h </w:instrText>
+              <w:instrText xml:space="preserve"> PAGEREF _Toc237911188 \h </w:instrText>
             </w:r>
             <w:r>
               <w:rPr>
@@ -1829,7 +1813,7 @@
               <w:lang w:eastAsia="zh-CN"/>
             </w:rPr>
           </w:pPr>
-          <w:hyperlink w:anchor="_Toc236385935" w:history="1">
+          <w:hyperlink w:anchor="_Toc237911189" w:history="1">
             <w:r>
               <w:rPr>
                 <w:rStyle w:val="Hyperlink"/>
@@ -1873,7 +1857,7 @@
                 <w:noProof/>
                 <w:webHidden/>
               </w:rPr>
-              <w:instrText xml:space="preserve"> PAGEREF _Toc236385935 \h </w:instrText>
+              <w:instrText xml:space="preserve"> PAGEREF _Toc237911189 \h </w:instrText>
             </w:r>
             <w:r>
               <w:rPr>
@@ -1919,7 +1903,7 @@
               <w:lang w:eastAsia="zh-CN"/>
             </w:rPr>
           </w:pPr>
-          <w:hyperlink w:anchor="_Toc236385936" w:history="1">
+          <w:hyperlink w:anchor="_Toc237911190" w:history="1">
             <w:r>
               <w:rPr>
                 <w:rStyle w:val="Hyperlink"/>
@@ -1963,7 +1947,7 @@
                 <w:noProof/>
                 <w:webHidden/>
               </w:rPr>
-              <w:instrText xml:space="preserve"> PAGEREF _Toc236385936 \h </w:instrText>
+              <w:instrText xml:space="preserve"> PAGEREF _Toc237911190 \h </w:instrText>
             </w:r>
             <w:r>
               <w:rPr>
@@ -2009,7 +1993,7 @@
               <w:lang w:eastAsia="zh-CN"/>
             </w:rPr>
           </w:pPr>
-          <w:hyperlink w:anchor="_Toc236385937" w:history="1">
+          <w:hyperlink w:anchor="_Toc237911191" w:history="1">
             <w:r>
               <w:rPr>
                 <w:rStyle w:val="Hyperlink"/>
@@ -2053,7 +2037,7 @@
                 <w:noProof/>
                 <w:webHidden/>
               </w:rPr>
-              <w:instrText xml:space="preserve"> PAGEREF _Toc236385937 \h </w:instrText>
+              <w:instrText xml:space="preserve"> PAGEREF _Toc237911191 \h </w:instrText>
             </w:r>
             <w:r>
               <w:rPr>
@@ -2099,7 +2083,7 @@
               <w:lang w:eastAsia="zh-CN"/>
             </w:rPr>
           </w:pPr>
-          <w:hyperlink w:anchor="_Toc236385938" w:history="1">
+          <w:hyperlink w:anchor="_Toc237911192" w:history="1">
             <w:r>
               <w:rPr>
                 <w:rStyle w:val="Hyperlink"/>
@@ -2143,7 +2127,7 @@
                 <w:noProof/>
                 <w:webHidden/>
               </w:rPr>
-              <w:instrText xml:space="preserve"> PAGEREF _Toc236385938 \h </w:instrText>
+              <w:instrText xml:space="preserve"> PAGEREF _Toc237911192 \h </w:instrText>
             </w:r>
             <w:r>
               <w:rPr>
@@ -2189,7 +2173,7 @@
               <w:lang w:eastAsia="zh-CN"/>
             </w:rPr>
           </w:pPr>
-          <w:hyperlink w:anchor="_Toc236385939" w:history="1">
+          <w:hyperlink w:anchor="_Toc237911193" w:history="1">
             <w:r>
               <w:rPr>
                 <w:rStyle w:val="Hyperlink"/>
@@ -2233,7 +2217,7 @@
                 <w:noProof/>
                 <w:webHidden/>
               </w:rPr>
-              <w:instrText xml:space="preserve"> PAGEREF _Toc236385939 \h </w:instrText>
+              <w:instrText xml:space="preserve"> PAGEREF _Toc237911193 \h </w:instrText>
             </w:r>
             <w:r>
               <w:rPr>
@@ -2279,7 +2263,7 @@
               <w:lang w:eastAsia="zh-CN"/>
             </w:rPr>
           </w:pPr>
-          <w:hyperlink w:anchor="_Toc236385940" w:history="1">
+          <w:hyperlink w:anchor="_Toc237911194" w:history="1">
             <w:r>
               <w:rPr>
                 <w:rStyle w:val="Hyperlink"/>
@@ -2323,7 +2307,7 @@
                 <w:noProof/>
                 <w:webHidden/>
               </w:rPr>
-              <w:instrText xml:space="preserve"> PAGEREF _Toc236385940 \h </w:instrText>
+              <w:instrText xml:space="preserve"> PAGEREF _Toc237911194 \h </w:instrText>
             </w:r>
             <w:r>
               <w:rPr>
@@ -2369,7 +2353,7 @@
               <w:lang w:eastAsia="zh-CN"/>
             </w:rPr>
           </w:pPr>
-          <w:hyperlink w:anchor="_Toc236385941" w:history="1">
+          <w:hyperlink w:anchor="_Toc237911195" w:history="1">
             <w:r>
               <w:rPr>
                 <w:rStyle w:val="Hyperlink"/>
@@ -2413,7 +2397,7 @@
                 <w:noProof/>
                 <w:webHidden/>
               </w:rPr>
-              <w:instrText xml:space="preserve"> PAGEREF _Toc236385941 \h </w:instrText>
+              <w:instrText xml:space="preserve"> PAGEREF _Toc237911195 \h </w:instrText>
             </w:r>
             <w:r>
               <w:rPr>
@@ -2459,7 +2443,7 @@
               <w:lang w:eastAsia="zh-CN"/>
             </w:rPr>
           </w:pPr>
-          <w:hyperlink w:anchor="_Toc236385942" w:history="1">
+          <w:hyperlink w:anchor="_Toc237911196" w:history="1">
             <w:r>
               <w:rPr>
                 <w:rStyle w:val="Hyperlink"/>
@@ -2503,7 +2487,7 @@
                 <w:noProof/>
                 <w:webHidden/>
               </w:rPr>
-              <w:instrText xml:space="preserve"> PAGEREF _Toc236385942 \h </w:instrText>
+              <w:instrText xml:space="preserve"> PAGEREF _Toc237911196 \h </w:instrText>
             </w:r>
             <w:r>
               <w:rPr>
@@ -2549,7 +2533,7 @@
               <w:lang w:eastAsia="zh-CN"/>
             </w:rPr>
           </w:pPr>
-          <w:hyperlink w:anchor="_Toc236385943" w:history="1">
+          <w:hyperlink w:anchor="_Toc237911197" w:history="1">
             <w:r>
               <w:rPr>
                 <w:rStyle w:val="Hyperlink"/>
@@ -2593,7 +2577,7 @@
                 <w:noProof/>
                 <w:webHidden/>
               </w:rPr>
-              <w:instrText xml:space="preserve"> PAGEREF _Toc236385943 \h </w:instrText>
+              <w:instrText xml:space="preserve"> PAGEREF _Toc237911197 \h </w:instrText>
             </w:r>
             <w:r>
               <w:rPr>
@@ -2639,7 +2623,7 @@
               <w:lang w:eastAsia="zh-CN"/>
             </w:rPr>
           </w:pPr>
-          <w:hyperlink w:anchor="_Toc236385944" w:history="1">
+          <w:hyperlink w:anchor="_Toc237911198" w:history="1">
             <w:r>
               <w:rPr>
                 <w:rStyle w:val="Hyperlink"/>
@@ -2683,7 +2667,7 @@
                 <w:noProof/>
                 <w:webHidden/>
               </w:rPr>
-              <w:instrText xml:space="preserve"> PAGEREF _Toc236385944 \h </w:instrText>
+              <w:instrText xml:space="preserve"> PAGEREF _Toc237911198 \h </w:instrText>
             </w:r>
             <w:r>
               <w:rPr>
@@ -2729,7 +2713,7 @@
               <w:lang w:eastAsia="zh-CN"/>
             </w:rPr>
           </w:pPr>
-          <w:hyperlink w:anchor="_Toc236385945" w:history="1">
+          <w:hyperlink w:anchor="_Toc237911199" w:history="1">
             <w:r>
               <w:rPr>
                 <w:rStyle w:val="Hyperlink"/>
@@ -2773,7 +2757,7 @@
                 <w:noProof/>
                 <w:webHidden/>
               </w:rPr>
-              <w:instrText xml:space="preserve"> PAGEREF _Toc236385945 \h </w:instrText>
+              <w:instrText xml:space="preserve"> PAGEREF _Toc237911199 \h </w:instrText>
             </w:r>
             <w:r>
               <w:rPr>
@@ -2819,7 +2803,7 @@
               <w:lang w:eastAsia="zh-CN"/>
             </w:rPr>
           </w:pPr>
-          <w:hyperlink w:anchor="_Toc236385946" w:history="1">
+          <w:hyperlink w:anchor="_Toc237911200" w:history="1">
             <w:r>
               <w:rPr>
                 <w:rStyle w:val="Hyperlink"/>
@@ -2863,7 +2847,7 @@
                 <w:noProof/>
                 <w:webHidden/>
               </w:rPr>
-              <w:instrText xml:space="preserve"> PAGEREF _Toc236385946 \h </w:instrText>
+              <w:instrText xml:space="preserve"> PAGEREF _Toc237911200 \h </w:instrText>
             </w:r>
             <w:r>
               <w:rPr>
@@ -2909,7 +2893,7 @@
               <w:lang w:eastAsia="zh-CN"/>
             </w:rPr>
           </w:pPr>
-          <w:hyperlink w:anchor="_Toc236385947" w:history="1">
+          <w:hyperlink w:anchor="_Toc237911201" w:history="1">
             <w:r>
               <w:rPr>
                 <w:rStyle w:val="Hyperlink"/>
@@ -2953,7 +2937,7 @@
                 <w:noProof/>
                 <w:webHidden/>
               </w:rPr>
-              <w:instrText xml:space="preserve"> PAGEREF _Toc236385947 \h </w:instrText>
+              <w:instrText xml:space="preserve"> PAGEREF _Toc237911201 \h </w:instrText>
             </w:r>
             <w:r>
               <w:rPr>
@@ -2999,7 +2983,7 @@
               <w:lang w:eastAsia="zh-CN"/>
             </w:rPr>
           </w:pPr>
-          <w:hyperlink w:anchor="_Toc236385948" w:history="1">
+          <w:hyperlink w:anchor="_Toc237911202" w:history="1">
             <w:r>
               <w:rPr>
                 <w:rStyle w:val="Hyperlink"/>
@@ -3043,7 +3027,7 @@
                 <w:noProof/>
                 <w:webHidden/>
               </w:rPr>
-              <w:instrText xml:space="preserve"> PAGEREF _Toc236385948 \h </w:instrText>
+              <w:instrText xml:space="preserve"> PAGEREF _Toc237911202 \h </w:instrText>
             </w:r>
             <w:r>
               <w:rPr>
@@ -3089,7 +3073,7 @@
               <w:lang w:eastAsia="zh-CN"/>
             </w:rPr>
           </w:pPr>
-          <w:hyperlink w:anchor="_Toc236385949" w:history="1">
+          <w:hyperlink w:anchor="_Toc237911203" w:history="1">
             <w:r>
               <w:rPr>
                 <w:rStyle w:val="Hyperlink"/>
@@ -3133,7 +3117,7 @@
                 <w:noProof/>
                 <w:webHidden/>
               </w:rPr>
-              <w:instrText xml:space="preserve"> PAGEREF _Toc236385949 \h </w:instrText>
+              <w:instrText xml:space="preserve"> PAGEREF _Toc237911203 \h </w:instrText>
             </w:r>
             <w:r>
               <w:rPr>
@@ -3179,7 +3163,7 @@
               <w:lang w:eastAsia="zh-CN"/>
             </w:rPr>
           </w:pPr>
-          <w:hyperlink w:anchor="_Toc236385950" w:history="1">
+          <w:hyperlink w:anchor="_Toc237911204" w:history="1">
             <w:r>
               <w:rPr>
                 <w:rStyle w:val="Hyperlink"/>
@@ -3223,7 +3207,7 @@
                 <w:noProof/>
                 <w:webHidden/>
               </w:rPr>
-              <w:instrText xml:space="preserve"> PAGEREF _Toc236385950 \h </w:instrText>
+              <w:instrText xml:space="preserve"> PAGEREF _Toc237911204 \h </w:instrText>
             </w:r>
             <w:r>
               <w:rPr>
@@ -3269,7 +3253,7 @@
               <w:lang w:eastAsia="zh-CN"/>
             </w:rPr>
           </w:pPr>
-          <w:hyperlink w:anchor="_Toc236385951" w:history="1">
+          <w:hyperlink w:anchor="_Toc237911205" w:history="1">
             <w:r>
               <w:rPr>
                 <w:rStyle w:val="Hyperlink"/>
@@ -3313,7 +3297,7 @@
                 <w:noProof/>
                 <w:webHidden/>
               </w:rPr>
-              <w:instrText xml:space="preserve"> PAGEREF _Toc236385951 \h </w:instrText>
+              <w:instrText xml:space="preserve"> PAGEREF _Toc237911205 \h </w:instrText>
             </w:r>
             <w:r>
               <w:rPr>
@@ -3359,7 +3343,7 @@
               <w:lang w:eastAsia="zh-CN"/>
             </w:rPr>
           </w:pPr>
-          <w:hyperlink w:anchor="_Toc236385952" w:history="1">
+          <w:hyperlink w:anchor="_Toc237911206" w:history="1">
             <w:r>
               <w:rPr>
                 <w:rStyle w:val="Hyperlink"/>
@@ -3403,7 +3387,7 @@
                 <w:noProof/>
                 <w:webHidden/>
               </w:rPr>
-              <w:instrText xml:space="preserve"> PAGEREF _Toc236385952 \h </w:instrText>
+              <w:instrText xml:space="preserve"> PAGEREF _Toc237911206 \h </w:instrText>
             </w:r>
             <w:r>
               <w:rPr>
@@ -3449,7 +3433,7 @@
               <w:lang w:eastAsia="zh-CN"/>
             </w:rPr>
           </w:pPr>
-          <w:hyperlink w:anchor="_Toc236385953" w:history="1">
+          <w:hyperlink w:anchor="_Toc237911207" w:history="1">
             <w:r>
               <w:rPr>
                 <w:rStyle w:val="Hyperlink"/>
@@ -3493,7 +3477,7 @@
                 <w:noProof/>
                 <w:webHidden/>
               </w:rPr>
-              <w:instrText xml:space="preserve"> PAGEREF _Toc236385953 \h </w:instrText>
+              <w:instrText xml:space="preserve"> PAGEREF _Toc237911207 \h </w:instrText>
             </w:r>
             <w:r>
               <w:rPr>
@@ -3539,7 +3523,7 @@
               <w:lang w:eastAsia="zh-CN"/>
             </w:rPr>
           </w:pPr>
-          <w:hyperlink w:anchor="_Toc236385954" w:history="1">
+          <w:hyperlink w:anchor="_Toc237911208" w:history="1">
             <w:r>
               <w:rPr>
                 <w:rStyle w:val="Hyperlink"/>
@@ -3583,7 +3567,7 @@
                 <w:noProof/>
                 <w:webHidden/>
               </w:rPr>
-              <w:instrText xml:space="preserve"> PAGEREF _Toc236385954 \h </w:instrText>
+              <w:instrText xml:space="preserve"> PAGEREF _Toc237911208 \h </w:instrText>
             </w:r>
             <w:r>
               <w:rPr>
@@ -3629,7 +3613,7 @@
               <w:lang w:eastAsia="zh-CN"/>
             </w:rPr>
           </w:pPr>
-          <w:hyperlink w:anchor="_Toc236385955" w:history="1">
+          <w:hyperlink w:anchor="_Toc237911209" w:history="1">
             <w:r>
               <w:rPr>
                 <w:rStyle w:val="Hyperlink"/>
@@ -3673,7 +3657,7 @@
                 <w:noProof/>
                 <w:webHidden/>
               </w:rPr>
-              <w:instrText xml:space="preserve"> PAGEREF _Toc236385955 \h </w:instrText>
+              <w:instrText xml:space="preserve"> PAGEREF _Toc237911209 \h </w:instrText>
             </w:r>
             <w:r>
               <w:rPr>
@@ -3719,7 +3703,7 @@
               <w:lang w:eastAsia="zh-CN"/>
             </w:rPr>
           </w:pPr>
-          <w:hyperlink w:anchor="_Toc236385956" w:history="1">
+          <w:hyperlink w:anchor="_Toc237911210" w:history="1">
             <w:r>
               <w:rPr>
                 <w:rStyle w:val="Hyperlink"/>
@@ -3763,7 +3747,7 @@
                 <w:noProof/>
                 <w:webHidden/>
               </w:rPr>
-              <w:instrText xml:space="preserve"> PAGEREF _Toc236385956 \h </w:instrText>
+              <w:instrText xml:space="preserve"> PAGEREF _Toc237911210 \h </w:instrText>
             </w:r>
             <w:r>
               <w:rPr>
@@ -3809,7 +3793,7 @@
               <w:lang w:eastAsia="zh-CN"/>
             </w:rPr>
           </w:pPr>
-          <w:hyperlink w:anchor="_Toc236385957" w:history="1">
+          <w:hyperlink w:anchor="_Toc237911211" w:history="1">
             <w:r>
               <w:rPr>
                 <w:rStyle w:val="Hyperlink"/>
@@ -3853,7 +3837,7 @@
                 <w:noProof/>
                 <w:webHidden/>
               </w:rPr>
-              <w:instrText xml:space="preserve"> PAGEREF _Toc236385957 \h </w:instrText>
+              <w:instrText xml:space="preserve"> PAGEREF _Toc237911211 \h </w:instrText>
             </w:r>
             <w:r>
               <w:rPr>
@@ -3899,7 +3883,7 @@
               <w:lang w:eastAsia="zh-CN"/>
             </w:rPr>
           </w:pPr>
-          <w:hyperlink w:anchor="_Toc236385958" w:history="1">
+          <w:hyperlink w:anchor="_Toc237911212" w:history="1">
             <w:r>
               <w:rPr>
                 <w:rStyle w:val="Hyperlink"/>
@@ -3943,7 +3927,7 @@
                 <w:noProof/>
                 <w:webHidden/>
               </w:rPr>
-              <w:instrText xml:space="preserve"> PAGEREF _Toc236385958 \h </w:instrText>
+              <w:instrText xml:space="preserve"> PAGEREF _Toc237911212 \h </w:instrText>
             </w:r>
             <w:r>
               <w:rPr>
@@ -3989,7 +3973,7 @@
               <w:lang w:eastAsia="zh-CN"/>
             </w:rPr>
           </w:pPr>
-          <w:hyperlink w:anchor="_Toc236385959" w:history="1">
+          <w:hyperlink w:anchor="_Toc237911213" w:history="1">
             <w:r>
               <w:rPr>
                 <w:rStyle w:val="Hyperlink"/>
@@ -4033,7 +4017,7 @@
                 <w:noProof/>
                 <w:webHidden/>
               </w:rPr>
-              <w:instrText xml:space="preserve"> PAGEREF _Toc236385959 \h </w:instrText>
+              <w:instrText xml:space="preserve"> PAGEREF _Toc237911213 \h </w:instrText>
             </w:r>
             <w:r>
               <w:rPr>
@@ -4079,7 +4063,7 @@
               <w:lang w:eastAsia="zh-CN"/>
             </w:rPr>
           </w:pPr>
-          <w:hyperlink w:anchor="_Toc236385960" w:history="1">
+          <w:hyperlink w:anchor="_Toc237911214" w:history="1">
             <w:r>
               <w:rPr>
                 <w:rStyle w:val="Hyperlink"/>
@@ -4123,7 +4107,7 @@
                 <w:noProof/>
                 <w:webHidden/>
               </w:rPr>
-              <w:instrText xml:space="preserve"> PAGEREF _Toc236385960 \h </w:instrText>
+              <w:instrText xml:space="preserve"> PAGEREF _Toc237911214 \h </w:instrText>
             </w:r>
             <w:r>
               <w:rPr>
@@ -4169,7 +4153,7 @@
               <w:lang w:eastAsia="zh-CN"/>
             </w:rPr>
           </w:pPr>
-          <w:hyperlink w:anchor="_Toc236385961" w:history="1">
+          <w:hyperlink w:anchor="_Toc237911215" w:history="1">
             <w:r>
               <w:rPr>
                 <w:rStyle w:val="Hyperlink"/>
@@ -4213,7 +4197,7 @@
                 <w:noProof/>
                 <w:webHidden/>
               </w:rPr>
-              <w:instrText xml:space="preserve"> PAGEREF _Toc236385961 \h </w:instrText>
+              <w:instrText xml:space="preserve"> PAGEREF _Toc237911215 \h </w:instrText>
             </w:r>
             <w:r>
               <w:rPr>
@@ -4259,7 +4243,7 @@
               <w:lang w:eastAsia="zh-CN"/>
             </w:rPr>
           </w:pPr>
-          <w:hyperlink w:anchor="_Toc236385962" w:history="1">
+          <w:hyperlink w:anchor="_Toc237911216" w:history="1">
             <w:r>
               <w:rPr>
                 <w:rStyle w:val="Hyperlink"/>
@@ -4303,7 +4287,7 @@
                 <w:noProof/>
                 <w:webHidden/>
               </w:rPr>
-              <w:instrText xml:space="preserve"> PAGEREF _Toc236385962 \h </w:instrText>
+              <w:instrText xml:space="preserve"> PAGEREF _Toc237911216 \h </w:instrText>
             </w:r>
             <w:r>
               <w:rPr>
@@ -4349,7 +4333,7 @@
               <w:lang w:eastAsia="zh-CN"/>
             </w:rPr>
           </w:pPr>
-          <w:hyperlink w:anchor="_Toc236385963" w:history="1">
+          <w:hyperlink w:anchor="_Toc237911217" w:history="1">
             <w:r>
               <w:rPr>
                 <w:rStyle w:val="Hyperlink"/>
@@ -4393,7 +4377,7 @@
                 <w:noProof/>
                 <w:webHidden/>
               </w:rPr>
-              <w:instrText xml:space="preserve"> PAGEREF _Toc236385963 \h </w:instrText>
+              <w:instrText xml:space="preserve"> PAGEREF _Toc237911217 \h </w:instrText>
             </w:r>
             <w:r>
               <w:rPr>
@@ -4439,7 +4423,7 @@
               <w:lang w:eastAsia="zh-CN"/>
             </w:rPr>
           </w:pPr>
-          <w:hyperlink w:anchor="_Toc236385964" w:history="1">
+          <w:hyperlink w:anchor="_Toc237911218" w:history="1">
             <w:r>
               <w:rPr>
                 <w:rStyle w:val="Hyperlink"/>
@@ -4483,7 +4467,7 @@
                 <w:noProof/>
                 <w:webHidden/>
               </w:rPr>
-              <w:instrText xml:space="preserve"> PAGEREF _Toc236385964 \h </w:instrText>
+              <w:instrText xml:space="preserve"> PAGEREF _Toc237911218 \h </w:instrText>
             </w:r>
             <w:r>
               <w:rPr>
@@ -4529,7 +4513,7 @@
               <w:lang w:eastAsia="zh-CN"/>
             </w:rPr>
           </w:pPr>
-          <w:hyperlink w:anchor="_Toc236385965" w:history="1">
+          <w:hyperlink w:anchor="_Toc237911219" w:history="1">
             <w:r>
               <w:rPr>
                 <w:rStyle w:val="Hyperlink"/>
@@ -4573,7 +4557,7 @@
                 <w:noProof/>
                 <w:webHidden/>
               </w:rPr>
-              <w:instrText xml:space="preserve"> PAGEREF _Toc236385965 \h </w:instrText>
+              <w:instrText xml:space="preserve"> PAGEREF _Toc237911219 \h </w:instrText>
             </w:r>
             <w:r>
               <w:rPr>
@@ -4619,7 +4603,7 @@
               <w:lang w:eastAsia="zh-CN"/>
             </w:rPr>
           </w:pPr>
-          <w:hyperlink w:anchor="_Toc236385966" w:history="1">
+          <w:hyperlink w:anchor="_Toc237911220" w:history="1">
             <w:r>
               <w:rPr>
                 <w:rStyle w:val="Hyperlink"/>
@@ -4663,7 +4647,7 @@
                 <w:noProof/>
                 <w:webHidden/>
               </w:rPr>
-              <w:instrText xml:space="preserve"> PAGEREF _Toc236385966 \h </w:instrText>
+              <w:instrText xml:space="preserve"> PAGEREF _Toc237911220 \h </w:instrText>
             </w:r>
             <w:r>
               <w:rPr>
@@ -4709,7 +4693,7 @@
               <w:lang w:eastAsia="zh-CN"/>
             </w:rPr>
           </w:pPr>
-          <w:hyperlink w:anchor="_Toc236385967" w:history="1">
+          <w:hyperlink w:anchor="_Toc237911221" w:history="1">
             <w:r>
               <w:rPr>
                 <w:rStyle w:val="Hyperlink"/>
@@ -4753,7 +4737,7 @@
                 <w:noProof/>
                 <w:webHidden/>
               </w:rPr>
-              <w:instrText xml:space="preserve"> PAGEREF _Toc236385967 \h </w:instrText>
+              <w:instrText xml:space="preserve"> PAGEREF _Toc237911221 \h </w:instrText>
             </w:r>
             <w:r>
               <w:rPr>
@@ -4799,7 +4783,7 @@
               <w:lang w:eastAsia="zh-CN"/>
             </w:rPr>
           </w:pPr>
-          <w:hyperlink w:anchor="_Toc236385968" w:history="1">
+          <w:hyperlink w:anchor="_Toc237911222" w:history="1">
             <w:r>
               <w:rPr>
                 <w:rStyle w:val="Hyperlink"/>
@@ -4822,7 +4806,7 @@
                 <w:rStyle w:val="Hyperlink"/>
                 <w:noProof/>
               </w:rPr>
-              <w:t>AT+WATCHDOG</w:t>
+              <w:t>AT+SUBG_MODE</w:t>
             </w:r>
             <w:r>
               <w:rPr>
@@ -4843,7 +4827,7 @@
                 <w:noProof/>
                 <w:webHidden/>
               </w:rPr>
-              <w:instrText xml:space="preserve"> PAGEREF _Toc236385968 \h </w:instrText>
+              <w:instrText xml:space="preserve"> PAGEREF _Toc237911222 \h </w:instrText>
             </w:r>
             <w:r>
               <w:rPr>
@@ -4889,7 +4873,7 @@
               <w:lang w:eastAsia="zh-CN"/>
             </w:rPr>
           </w:pPr>
-          <w:hyperlink w:anchor="_Toc236385969" w:history="1">
+          <w:hyperlink w:anchor="_Toc237911223" w:history="1">
             <w:r>
               <w:rPr>
                 <w:rStyle w:val="Hyperlink"/>
@@ -4912,7 +4896,7 @@
                 <w:rStyle w:val="Hyperlink"/>
                 <w:noProof/>
               </w:rPr>
-              <w:t>Configure the Watchdog Timer</w:t>
+              <w:t>Set the Sub-GHz Receiver Mode</w:t>
             </w:r>
             <w:r>
               <w:rPr>
@@ -4933,7 +4917,7 @@
                 <w:noProof/>
                 <w:webHidden/>
               </w:rPr>
-              <w:instrText xml:space="preserve"> PAGEREF _Toc236385969 \h </w:instrText>
+              <w:instrText xml:space="preserve"> PAGEREF _Toc237911223 \h </w:instrText>
             </w:r>
             <w:r>
               <w:rPr>
@@ -4979,7 +4963,7 @@
               <w:lang w:eastAsia="zh-CN"/>
             </w:rPr>
           </w:pPr>
-          <w:hyperlink w:anchor="_Toc236385970" w:history="1">
+          <w:hyperlink w:anchor="_Toc237911224" w:history="1">
             <w:r>
               <w:rPr>
                 <w:rStyle w:val="Hyperlink"/>
@@ -5002,7 +4986,7 @@
                 <w:rStyle w:val="Hyperlink"/>
                 <w:noProof/>
               </w:rPr>
-              <w:t>Query the Watchdog Timer</w:t>
+              <w:t>Query the Sub-GHz Receiver Mode</w:t>
             </w:r>
             <w:r>
               <w:rPr>
@@ -5023,7 +5007,7 @@
                 <w:noProof/>
                 <w:webHidden/>
               </w:rPr>
-              <w:instrText xml:space="preserve"> PAGEREF _Toc236385970 \h </w:instrText>
+              <w:instrText xml:space="preserve"> PAGEREF _Toc237911224 \h </w:instrText>
             </w:r>
             <w:r>
               <w:rPr>
@@ -5044,6 +5028,96 @@
                 <w:webHidden/>
               </w:rPr>
               <w:t>24</w:t>
+            </w:r>
+            <w:r>
+              <w:rPr>
+                <w:noProof/>
+                <w:webHidden/>
+              </w:rPr>
+              <w:fldChar w:fldCharType="end"/>
+            </w:r>
+          </w:hyperlink>
+        </w:p>
+        <w:p>
+          <w:pPr>
+            <w:pStyle w:val="TOC2"/>
+            <w:tabs>
+              <w:tab w:val="left" w:pos="960"/>
+              <w:tab w:val="right" w:leader="dot" w:pos="10790"/>
+            </w:tabs>
+            <w:rPr>
+              <w:rFonts w:eastAsiaTheme="minorEastAsia"/>
+              <w:noProof/>
+              <w:sz w:val="24"/>
+              <w:szCs w:val="24"/>
+              <w:lang w:eastAsia="zh-CN"/>
+            </w:rPr>
+          </w:pPr>
+          <w:hyperlink w:anchor="_Toc237911225" w:history="1">
+            <w:r>
+              <w:rPr>
+                <w:rStyle w:val="Hyperlink"/>
+                <w:noProof/>
+              </w:rPr>
+              <w:t>4.16</w:t>
+            </w:r>
+            <w:r>
+              <w:rPr>
+                <w:rFonts w:eastAsiaTheme="minorEastAsia"/>
+                <w:noProof/>
+                <w:sz w:val="24"/>
+                <w:szCs w:val="24"/>
+                <w:lang w:eastAsia="zh-CN"/>
+              </w:rPr>
+              <w:tab/>
+            </w:r>
+            <w:r>
+              <w:rPr>
+                <w:rStyle w:val="Hyperlink"/>
+                <w:noProof/>
+              </w:rPr>
+              <w:t>AT+WATCHDOG</w:t>
+            </w:r>
+            <w:r>
+              <w:rPr>
+                <w:noProof/>
+                <w:webHidden/>
+              </w:rPr>
+              <w:tab/>
+            </w:r>
+            <w:r>
+              <w:rPr>
+                <w:noProof/>
+                <w:webHidden/>
+              </w:rPr>
+              <w:fldChar w:fldCharType="begin"/>
+            </w:r>
+            <w:r>
+              <w:rPr>
+                <w:noProof/>
+                <w:webHidden/>
+              </w:rPr>
+              <w:instrText xml:space="preserve"> PAGEREF _Toc237911225 \h </w:instrText>
+            </w:r>
+            <w:r>
+              <w:rPr>
+                <w:noProof/>
+                <w:webHidden/>
+              </w:rPr>
+            </w:r>
+            <w:r>
+              <w:rPr>
+                <w:noProof/>
+                <w:webHidden/>
+              </w:rPr>
+              <w:fldChar w:fldCharType="separate"/>
+            </w:r>
+            <w:r>
+              <w:rPr>
+                <w:noProof/>
+                <w:webHidden/>
+              </w:rPr>
+              <w:t>25</w:t>
             </w:r>
             <w:r>
               <w:rPr>
@@ -5069,13 +5143,13 @@
               <w:lang w:eastAsia="zh-CN"/>
             </w:rPr>
           </w:pPr>
-          <w:hyperlink w:anchor="_Toc236385971" w:history="1">
+          <w:hyperlink w:anchor="_Toc237911226" w:history="1">
             <w:r>
               <w:rPr>
                 <w:rStyle w:val="Hyperlink"/>
                 <w:noProof/>
               </w:rPr>
-              <w:t>4.15.3</w:t>
+              <w:t>4.16.1</w:t>
             </w:r>
             <w:r>
               <w:rPr>
@@ -5092,6 +5166,186 @@
                 <w:rStyle w:val="Hyperlink"/>
                 <w:noProof/>
               </w:rPr>
+              <w:t>Configure the Watchdog Timer</w:t>
+            </w:r>
+            <w:r>
+              <w:rPr>
+                <w:noProof/>
+                <w:webHidden/>
+              </w:rPr>
+              <w:tab/>
+            </w:r>
+            <w:r>
+              <w:rPr>
+                <w:noProof/>
+                <w:webHidden/>
+              </w:rPr>
+              <w:fldChar w:fldCharType="begin"/>
+            </w:r>
+            <w:r>
+              <w:rPr>
+                <w:noProof/>
+                <w:webHidden/>
+              </w:rPr>
+              <w:instrText xml:space="preserve"> PAGEREF _Toc237911226 \h </w:instrText>
+            </w:r>
+            <w:r>
+              <w:rPr>
+                <w:noProof/>
+                <w:webHidden/>
+              </w:rPr>
+            </w:r>
+            <w:r>
+              <w:rPr>
+                <w:noProof/>
+                <w:webHidden/>
+              </w:rPr>
+              <w:fldChar w:fldCharType="separate"/>
+            </w:r>
+            <w:r>
+              <w:rPr>
+                <w:noProof/>
+                <w:webHidden/>
+              </w:rPr>
+              <w:t>25</w:t>
+            </w:r>
+            <w:r>
+              <w:rPr>
+                <w:noProof/>
+                <w:webHidden/>
+              </w:rPr>
+              <w:fldChar w:fldCharType="end"/>
+            </w:r>
+          </w:hyperlink>
+        </w:p>
+        <w:p>
+          <w:pPr>
+            <w:pStyle w:val="TOC3"/>
+            <w:tabs>
+              <w:tab w:val="left" w:pos="1440"/>
+              <w:tab w:val="right" w:leader="dot" w:pos="10790"/>
+            </w:tabs>
+            <w:rPr>
+              <w:rFonts w:eastAsiaTheme="minorEastAsia"/>
+              <w:noProof/>
+              <w:sz w:val="24"/>
+              <w:szCs w:val="24"/>
+              <w:lang w:eastAsia="zh-CN"/>
+            </w:rPr>
+          </w:pPr>
+          <w:hyperlink w:anchor="_Toc237911227" w:history="1">
+            <w:r>
+              <w:rPr>
+                <w:rStyle w:val="Hyperlink"/>
+                <w:noProof/>
+              </w:rPr>
+              <w:t>4.16.2</w:t>
+            </w:r>
+            <w:r>
+              <w:rPr>
+                <w:rFonts w:eastAsiaTheme="minorEastAsia"/>
+                <w:noProof/>
+                <w:sz w:val="24"/>
+                <w:szCs w:val="24"/>
+                <w:lang w:eastAsia="zh-CN"/>
+              </w:rPr>
+              <w:tab/>
+            </w:r>
+            <w:r>
+              <w:rPr>
+                <w:rStyle w:val="Hyperlink"/>
+                <w:noProof/>
+              </w:rPr>
+              <w:t>Query the Watchdog Timer</w:t>
+            </w:r>
+            <w:r>
+              <w:rPr>
+                <w:noProof/>
+                <w:webHidden/>
+              </w:rPr>
+              <w:tab/>
+            </w:r>
+            <w:r>
+              <w:rPr>
+                <w:noProof/>
+                <w:webHidden/>
+              </w:rPr>
+              <w:fldChar w:fldCharType="begin"/>
+            </w:r>
+            <w:r>
+              <w:rPr>
+                <w:noProof/>
+                <w:webHidden/>
+              </w:rPr>
+              <w:instrText xml:space="preserve"> PAGEREF _Toc237911227 \h </w:instrText>
+            </w:r>
+            <w:r>
+              <w:rPr>
+                <w:noProof/>
+                <w:webHidden/>
+              </w:rPr>
+            </w:r>
+            <w:r>
+              <w:rPr>
+                <w:noProof/>
+                <w:webHidden/>
+              </w:rPr>
+              <w:fldChar w:fldCharType="separate"/>
+            </w:r>
+            <w:r>
+              <w:rPr>
+                <w:noProof/>
+                <w:webHidden/>
+              </w:rPr>
+              <w:t>25</w:t>
+            </w:r>
+            <w:r>
+              <w:rPr>
+                <w:noProof/>
+                <w:webHidden/>
+              </w:rPr>
+              <w:fldChar w:fldCharType="end"/>
+            </w:r>
+          </w:hyperlink>
+        </w:p>
+        <w:p>
+          <w:pPr>
+            <w:pStyle w:val="TOC3"/>
+            <w:tabs>
+              <w:tab w:val="left" w:pos="1440"/>
+              <w:tab w:val="right" w:leader="dot" w:pos="10790"/>
+            </w:tabs>
+            <w:rPr>
+              <w:rFonts w:eastAsiaTheme="minorEastAsia"/>
+              <w:noProof/>
+              <w:sz w:val="24"/>
+              <w:szCs w:val="24"/>
+              <w:lang w:eastAsia="zh-CN"/>
+            </w:rPr>
+          </w:pPr>
+          <w:hyperlink w:anchor="_Toc237911228" w:history="1">
+            <w:r>
+              <w:rPr>
+                <w:rStyle w:val="Hyperlink"/>
+                <w:noProof/>
+              </w:rPr>
+              <w:t>4.16.3</w:t>
+            </w:r>
+            <w:r>
+              <w:rPr>
+                <w:rFonts w:eastAsiaTheme="minorEastAsia"/>
+                <w:noProof/>
+                <w:sz w:val="24"/>
+                <w:szCs w:val="24"/>
+                <w:lang w:eastAsia="zh-CN"/>
+              </w:rPr>
+              <w:tab/>
+            </w:r>
+            <w:r>
+              <w:rPr>
+                <w:rStyle w:val="Hyperlink"/>
+                <w:noProof/>
+              </w:rPr>
               <w:t>Test the Watchdog Timer</w:t>
             </w:r>
             <w:r>
@@ -5113,7 +5367,7 @@
                 <w:noProof/>
                 <w:webHidden/>
               </w:rPr>
-              <w:instrText xml:space="preserve"> PAGEREF _Toc236385971 \h </w:instrText>
+              <w:instrText xml:space="preserve"> PAGEREF _Toc237911228 \h </w:instrText>
             </w:r>
             <w:r>
               <w:rPr>
@@ -5133,7 +5387,7 @@
                 <w:noProof/>
                 <w:webHidden/>
               </w:rPr>
-              <w:t>24</w:t>
+              <w:t>25</w:t>
             </w:r>
             <w:r>
               <w:rPr>
@@ -5159,7 +5413,7 @@
               <w:lang w:eastAsia="zh-CN"/>
             </w:rPr>
           </w:pPr>
-          <w:hyperlink w:anchor="_Toc236385972" w:history="1">
+          <w:hyperlink w:anchor="_Toc237911229" w:history="1">
             <w:r>
               <w:rPr>
                 <w:rStyle w:val="Hyperlink"/>
@@ -5203,7 +5457,7 @@
                 <w:noProof/>
                 <w:webHidden/>
               </w:rPr>
-              <w:instrText xml:space="preserve"> PAGEREF _Toc236385972 \h </w:instrText>
+              <w:instrText xml:space="preserve"> PAGEREF _Toc237911229 \h </w:instrText>
             </w:r>
             <w:r>
               <w:rPr>
@@ -5223,7 +5477,7 @@
                 <w:noProof/>
                 <w:webHidden/>
               </w:rPr>
-              <w:t>25</w:t>
+              <w:t>26</w:t>
             </w:r>
             <w:r>
               <w:rPr>
@@ -5249,7 +5503,7 @@
               <w:lang w:eastAsia="zh-CN"/>
             </w:rPr>
           </w:pPr>
-          <w:hyperlink w:anchor="_Toc236385973" w:history="1">
+          <w:hyperlink w:anchor="_Toc237911230" w:history="1">
             <w:r>
               <w:rPr>
                 <w:rStyle w:val="Hyperlink"/>
@@ -5293,7 +5547,7 @@
                 <w:noProof/>
                 <w:webHidden/>
               </w:rPr>
-              <w:instrText xml:space="preserve"> PAGEREF _Toc236385973 \h </w:instrText>
+              <w:instrText xml:space="preserve"> PAGEREF _Toc237911230 \h </w:instrText>
             </w:r>
             <w:r>
               <w:rPr>
@@ -5313,7 +5567,7 @@
                 <w:noProof/>
                 <w:webHidden/>
               </w:rPr>
-              <w:t>26</w:t>
+              <w:t>27</w:t>
             </w:r>
             <w:r>
               <w:rPr>
@@ -5339,7 +5593,7 @@
               <w:lang w:eastAsia="zh-CN"/>
             </w:rPr>
           </w:pPr>
-          <w:hyperlink w:anchor="_Toc236385974" w:history="1">
+          <w:hyperlink w:anchor="_Toc237911231" w:history="1">
             <w:r>
               <w:rPr>
                 <w:rStyle w:val="Hyperlink"/>
@@ -5383,7 +5637,7 @@
                 <w:noProof/>
                 <w:webHidden/>
               </w:rPr>
-              <w:instrText xml:space="preserve"> PAGEREF _Toc236385974 \h </w:instrText>
+              <w:instrText xml:space="preserve"> PAGEREF _Toc237911231 \h </w:instrText>
             </w:r>
             <w:r>
               <w:rPr>
@@ -5403,7 +5657,7 @@
                 <w:noProof/>
                 <w:webHidden/>
               </w:rPr>
-              <w:t>26</w:t>
+              <w:t>27</w:t>
             </w:r>
             <w:r>
               <w:rPr>
@@ -5429,7 +5683,7 @@
               <w:lang w:eastAsia="zh-CN"/>
             </w:rPr>
           </w:pPr>
-          <w:hyperlink w:anchor="_Toc236385975" w:history="1">
+          <w:hyperlink w:anchor="_Toc237911232" w:history="1">
             <w:r>
               <w:rPr>
                 <w:rStyle w:val="Hyperlink"/>
@@ -5473,7 +5727,7 @@
                 <w:noProof/>
                 <w:webHidden/>
               </w:rPr>
-              <w:instrText xml:space="preserve"> PAGEREF _Toc236385975 \h </w:instrText>
+              <w:instrText xml:space="preserve"> PAGEREF _Toc237911232 \h </w:instrText>
             </w:r>
             <w:r>
               <w:rPr>
@@ -5493,7 +5747,7 @@
                 <w:noProof/>
                 <w:webHidden/>
               </w:rPr>
-              <w:t>27</w:t>
+              <w:t>28</w:t>
             </w:r>
             <w:r>
               <w:rPr>
@@ -5519,7 +5773,7 @@
               <w:lang w:eastAsia="zh-CN"/>
             </w:rPr>
           </w:pPr>
-          <w:hyperlink w:anchor="_Toc236385976" w:history="1">
+          <w:hyperlink w:anchor="_Toc237911233" w:history="1">
             <w:r>
               <w:rPr>
                 <w:rStyle w:val="Hyperlink"/>
@@ -5563,7 +5817,7 @@
                 <w:noProof/>
                 <w:webHidden/>
               </w:rPr>
-              <w:instrText xml:space="preserve"> PAGEREF _Toc236385976 \h </w:instrText>
+              <w:instrText xml:space="preserve"> PAGEREF _Toc237911233 \h </w:instrText>
             </w:r>
             <w:r>
               <w:rPr>
@@ -5583,7 +5837,7 @@
                 <w:noProof/>
                 <w:webHidden/>
               </w:rPr>
-              <w:t>34</w:t>
+              <w:t>35</w:t>
             </w:r>
             <w:r>
               <w:rPr>
@@ -5609,7 +5863,7 @@
               <w:lang w:eastAsia="zh-CN"/>
             </w:rPr>
           </w:pPr>
-          <w:hyperlink w:anchor="_Toc236385977" w:history="1">
+          <w:hyperlink w:anchor="_Toc237911234" w:history="1">
             <w:r>
               <w:rPr>
                 <w:rStyle w:val="Hyperlink"/>
@@ -5653,7 +5907,7 @@
                 <w:noProof/>
                 <w:webHidden/>
               </w:rPr>
-              <w:instrText xml:space="preserve"> PAGEREF _Toc236385977 \h </w:instrText>
+              <w:instrText xml:space="preserve"> PAGEREF _Toc237911234 \h </w:instrText>
             </w:r>
             <w:r>
               <w:rPr>
@@ -5673,7 +5927,7 @@
                 <w:noProof/>
                 <w:webHidden/>
               </w:rPr>
-              <w:t>36</w:t>
+              <w:t>37</w:t>
             </w:r>
             <w:r>
               <w:rPr>
@@ -5699,7 +5953,7 @@
               <w:lang w:eastAsia="zh-CN"/>
             </w:rPr>
           </w:pPr>
-          <w:hyperlink w:anchor="_Toc236385978" w:history="1">
+          <w:hyperlink w:anchor="_Toc237911235" w:history="1">
             <w:r>
               <w:rPr>
                 <w:rStyle w:val="Hyperlink"/>
@@ -5743,7 +5997,7 @@
                 <w:noProof/>
                 <w:webHidden/>
               </w:rPr>
-              <w:instrText xml:space="preserve"> PAGEREF _Toc236385978 \h </w:instrText>
+              <w:instrText xml:space="preserve"> PAGEREF _Toc237911235 \h </w:instrText>
             </w:r>
             <w:r>
               <w:rPr>
@@ -5763,7 +6017,7 @@
                 <w:noProof/>
                 <w:webHidden/>
               </w:rPr>
-              <w:t>37</w:t>
+              <w:t>38</w:t>
             </w:r>
             <w:r>
               <w:rPr>
@@ -5789,7 +6043,7 @@
               <w:lang w:eastAsia="zh-CN"/>
             </w:rPr>
           </w:pPr>
-          <w:hyperlink w:anchor="_Toc236385979" w:history="1">
+          <w:hyperlink w:anchor="_Toc237911236" w:history="1">
             <w:r>
               <w:rPr>
                 <w:rStyle w:val="Hyperlink"/>
@@ -5833,7 +6087,7 @@
                 <w:noProof/>
                 <w:webHidden/>
               </w:rPr>
-              <w:instrText xml:space="preserve"> PAGEREF _Toc236385979 \h </w:instrText>
+              <w:instrText xml:space="preserve"> PAGEREF _Toc237911236 \h </w:instrText>
             </w:r>
             <w:r>
               <w:rPr>
@@ -5853,7 +6107,7 @@
                 <w:noProof/>
                 <w:webHidden/>
               </w:rPr>
-              <w:t>38</w:t>
+              <w:t>39</w:t>
             </w:r>
             <w:r>
               <w:rPr>
@@ -5879,7 +6133,7 @@
               <w:lang w:eastAsia="zh-CN"/>
             </w:rPr>
           </w:pPr>
-          <w:hyperlink w:anchor="_Toc236385980" w:history="1">
+          <w:hyperlink w:anchor="_Toc237911237" w:history="1">
             <w:r>
               <w:rPr>
                 <w:rStyle w:val="Hyperlink"/>
@@ -5956,7 +6210,7 @@
                 <w:noProof/>
                 <w:webHidden/>
               </w:rPr>
-              <w:instrText xml:space="preserve"> PAGEREF _Toc236385980 \h </w:instrText>
+              <w:instrText xml:space="preserve"> PAGEREF _Toc237911237 \h </w:instrText>
             </w:r>
             <w:r>
               <w:rPr>
@@ -5976,7 +6230,7 @@
                 <w:noProof/>
                 <w:webHidden/>
               </w:rPr>
-              <w:t>38</w:t>
+              <w:t>39</w:t>
             </w:r>
             <w:r>
               <w:rPr>
@@ -6002,7 +6256,7 @@
               <w:lang w:eastAsia="zh-CN"/>
             </w:rPr>
           </w:pPr>
-          <w:hyperlink w:anchor="_Toc236385981" w:history="1">
+          <w:hyperlink w:anchor="_Toc237911238" w:history="1">
             <w:r>
               <w:rPr>
                 <w:rStyle w:val="Hyperlink"/>
@@ -6046,7 +6300,7 @@
                 <w:noProof/>
                 <w:webHidden/>
               </w:rPr>
-              <w:instrText xml:space="preserve"> PAGEREF _Toc236385981 \h </w:instrText>
+              <w:instrText xml:space="preserve"> PAGEREF _Toc237911238 \h </w:instrText>
             </w:r>
             <w:r>
               <w:rPr>
@@ -6066,7 +6320,7 @@
                 <w:noProof/>
                 <w:webHidden/>
               </w:rPr>
-              <w:t>38</w:t>
+              <w:t>39</w:t>
             </w:r>
             <w:r>
               <w:rPr>
@@ -6092,7 +6346,7 @@
               <w:lang w:eastAsia="zh-CN"/>
             </w:rPr>
           </w:pPr>
-          <w:hyperlink w:anchor="_Toc236385982" w:history="1">
+          <w:hyperlink w:anchor="_Toc237911239" w:history="1">
             <w:r>
               <w:rPr>
                 <w:rStyle w:val="Hyperlink"/>
@@ -6136,7 +6390,7 @@
                 <w:noProof/>
                 <w:webHidden/>
               </w:rPr>
-              <w:instrText xml:space="preserve"> PAGEREF _Toc236385982 \h </w:instrText>
+              <w:instrText xml:space="preserve"> PAGEREF _Toc237911239 \h </w:instrText>
             </w:r>
             <w:r>
               <w:rPr>
@@ -6156,7 +6410,7 @@
                 <w:noProof/>
                 <w:webHidden/>
               </w:rPr>
-              <w:t>39</w:t>
+              <w:t>40</w:t>
             </w:r>
             <w:r>
               <w:rPr>
@@ -6182,7 +6436,7 @@
               <w:lang w:eastAsia="zh-CN"/>
             </w:rPr>
           </w:pPr>
-          <w:hyperlink w:anchor="_Toc236385983" w:history="1">
+          <w:hyperlink w:anchor="_Toc237911240" w:history="1">
             <w:r>
               <w:rPr>
                 <w:rStyle w:val="Hyperlink"/>
@@ -6226,7 +6480,7 @@
                 <w:noProof/>
                 <w:webHidden/>
               </w:rPr>
-              <w:instrText xml:space="preserve"> PAGEREF _Toc236385983 \h </w:instrText>
+              <w:instrText xml:space="preserve"> PAGEREF _Toc237911240 \h </w:instrText>
             </w:r>
             <w:r>
               <w:rPr>
@@ -6246,7 +6500,7 @@
                 <w:noProof/>
                 <w:webHidden/>
               </w:rPr>
-              <w:t>39</w:t>
+              <w:t>40</w:t>
             </w:r>
             <w:r>
               <w:rPr>
@@ -6272,7 +6526,7 @@
               <w:lang w:eastAsia="zh-CN"/>
             </w:rPr>
           </w:pPr>
-          <w:hyperlink w:anchor="_Toc236385984" w:history="1">
+          <w:hyperlink w:anchor="_Toc237911241" w:history="1">
             <w:r>
               <w:rPr>
                 <w:rStyle w:val="Hyperlink"/>
@@ -6316,7 +6570,7 @@
                 <w:noProof/>
                 <w:webHidden/>
               </w:rPr>
-              <w:instrText xml:space="preserve"> PAGEREF _Toc236385984 \h </w:instrText>
+              <w:instrText xml:space="preserve"> PAGEREF _Toc237911241 \h </w:instrText>
             </w:r>
             <w:r>
               <w:rPr>
@@ -6336,7 +6590,7 @@
                 <w:noProof/>
                 <w:webHidden/>
               </w:rPr>
-              <w:t>40</w:t>
+              <w:t>41</w:t>
             </w:r>
             <w:r>
               <w:rPr>
@@ -6362,7 +6616,7 @@
               <w:lang w:eastAsia="zh-CN"/>
             </w:rPr>
           </w:pPr>
-          <w:hyperlink w:anchor="_Toc236385985" w:history="1">
+          <w:hyperlink w:anchor="_Toc237911242" w:history="1">
             <w:r>
               <w:rPr>
                 <w:rStyle w:val="Hyperlink"/>
@@ -6406,7 +6660,7 @@
                 <w:noProof/>
                 <w:webHidden/>
               </w:rPr>
-              <w:instrText xml:space="preserve"> PAGEREF _Toc236385985 \h </w:instrText>
+              <w:instrText xml:space="preserve"> PAGEREF _Toc237911242 \h </w:instrText>
             </w:r>
             <w:r>
               <w:rPr>
@@ -6426,7 +6680,7 @@
                 <w:noProof/>
                 <w:webHidden/>
               </w:rPr>
-              <w:t>40</w:t>
+              <w:t>41</w:t>
             </w:r>
             <w:r>
               <w:rPr>
@@ -6452,7 +6706,7 @@
               <w:lang w:eastAsia="zh-CN"/>
             </w:rPr>
           </w:pPr>
-          <w:hyperlink w:anchor="_Toc236385986" w:history="1">
+          <w:hyperlink w:anchor="_Toc237911243" w:history="1">
             <w:r>
               <w:rPr>
                 <w:rStyle w:val="Hyperlink"/>
@@ -6496,7 +6750,7 @@
                 <w:noProof/>
                 <w:webHidden/>
               </w:rPr>
-              <w:instrText xml:space="preserve"> PAGEREF _Toc236385986 \h </w:instrText>
+              <w:instrText xml:space="preserve"> PAGEREF _Toc237911243 \h </w:instrText>
             </w:r>
             <w:r>
               <w:rPr>
@@ -6516,7 +6770,7 @@
                 <w:noProof/>
                 <w:webHidden/>
               </w:rPr>
-              <w:t>40</w:t>
+              <w:t>41</w:t>
             </w:r>
             <w:r>
               <w:rPr>
@@ -6542,7 +6796,7 @@
               <w:lang w:eastAsia="zh-CN"/>
             </w:rPr>
           </w:pPr>
-          <w:hyperlink w:anchor="_Toc236385987" w:history="1">
+          <w:hyperlink w:anchor="_Toc237911244" w:history="1">
             <w:r>
               <w:rPr>
                 <w:rStyle w:val="Hyperlink"/>
@@ -6586,7 +6840,7 @@
                 <w:noProof/>
                 <w:webHidden/>
               </w:rPr>
-              <w:instrText xml:space="preserve"> PAGEREF _Toc236385987 \h </w:instrText>
+              <w:instrText xml:space="preserve"> PAGEREF _Toc237911244 \h </w:instrText>
             </w:r>
             <w:r>
               <w:rPr>
@@ -6606,7 +6860,7 @@
                 <w:noProof/>
                 <w:webHidden/>
               </w:rPr>
-              <w:t>41</w:t>
+              <w:t>42</w:t>
             </w:r>
             <w:r>
               <w:rPr>
@@ -6632,7 +6886,7 @@
               <w:lang w:eastAsia="zh-CN"/>
             </w:rPr>
           </w:pPr>
-          <w:hyperlink w:anchor="_Toc236385988" w:history="1">
+          <w:hyperlink w:anchor="_Toc237911245" w:history="1">
             <w:r>
               <w:rPr>
                 <w:rStyle w:val="Hyperlink"/>
@@ -6676,7 +6930,7 @@
                 <w:noProof/>
                 <w:webHidden/>
               </w:rPr>
-              <w:instrText xml:space="preserve"> PAGEREF _Toc236385988 \h </w:instrText>
+              <w:instrText xml:space="preserve"> PAGEREF _Toc237911245 \h </w:instrText>
             </w:r>
             <w:r>
               <w:rPr>
@@ -6696,7 +6950,7 @@
                 <w:noProof/>
                 <w:webHidden/>
               </w:rPr>
-              <w:t>41</w:t>
+              <w:t>42</w:t>
             </w:r>
             <w:r>
               <w:rPr>
@@ -6722,7 +6976,7 @@
               <w:lang w:eastAsia="zh-CN"/>
             </w:rPr>
           </w:pPr>
-          <w:hyperlink w:anchor="_Toc236385989" w:history="1">
+          <w:hyperlink w:anchor="_Toc237911246" w:history="1">
             <w:r>
               <w:rPr>
                 <w:rStyle w:val="Hyperlink"/>
@@ -6766,7 +7020,7 @@
                 <w:noProof/>
                 <w:webHidden/>
               </w:rPr>
-              <w:instrText xml:space="preserve"> PAGEREF _Toc236385989 \h </w:instrText>
+              <w:instrText xml:space="preserve"> PAGEREF _Toc237911246 \h </w:instrText>
             </w:r>
             <w:r>
               <w:rPr>
@@ -6786,7 +7040,7 @@
                 <w:noProof/>
                 <w:webHidden/>
               </w:rPr>
-              <w:t>41</w:t>
+              <w:t>42</w:t>
             </w:r>
             <w:r>
               <w:rPr>
@@ -6812,7 +7066,7 @@
               <w:lang w:eastAsia="zh-CN"/>
             </w:rPr>
           </w:pPr>
-          <w:hyperlink w:anchor="_Toc236385990" w:history="1">
+          <w:hyperlink w:anchor="_Toc237911247" w:history="1">
             <w:r>
               <w:rPr>
                 <w:rStyle w:val="Hyperlink"/>
@@ -6856,7 +7110,7 @@
                 <w:noProof/>
                 <w:webHidden/>
               </w:rPr>
-              <w:instrText xml:space="preserve"> PAGEREF _Toc236385990 \h </w:instrText>
+              <w:instrText xml:space="preserve"> PAGEREF _Toc237911247 \h </w:instrText>
             </w:r>
             <w:r>
               <w:rPr>
@@ -6876,7 +7130,7 @@
                 <w:noProof/>
                 <w:webHidden/>
               </w:rPr>
-              <w:t>42</w:t>
+              <w:t>43</w:t>
             </w:r>
             <w:r>
               <w:rPr>
@@ -6902,7 +7156,7 @@
               <w:lang w:eastAsia="zh-CN"/>
             </w:rPr>
           </w:pPr>
-          <w:hyperlink w:anchor="_Toc236385991" w:history="1">
+          <w:hyperlink w:anchor="_Toc237911248" w:history="1">
             <w:r>
               <w:rPr>
                 <w:rStyle w:val="Hyperlink"/>
@@ -6946,7 +7200,7 @@
                 <w:noProof/>
                 <w:webHidden/>
               </w:rPr>
-              <w:instrText xml:space="preserve"> PAGEREF _Toc236385991 \h </w:instrText>
+              <w:instrText xml:space="preserve"> PAGEREF _Toc237911248 \h </w:instrText>
             </w:r>
             <w:r>
               <w:rPr>
@@ -6966,7 +7220,7 @@
                 <w:noProof/>
                 <w:webHidden/>
               </w:rPr>
-              <w:t>43</w:t>
+              <w:t>44</w:t>
             </w:r>
             <w:r>
               <w:rPr>
@@ -6992,7 +7246,7 @@
               <w:lang w:eastAsia="zh-CN"/>
             </w:rPr>
           </w:pPr>
-          <w:hyperlink w:anchor="_Toc236385992" w:history="1">
+          <w:hyperlink w:anchor="_Toc237911249" w:history="1">
             <w:r>
               <w:rPr>
                 <w:rStyle w:val="Hyperlink"/>
@@ -7036,7 +7290,7 @@
                 <w:noProof/>
                 <w:webHidden/>
               </w:rPr>
-              <w:instrText xml:space="preserve"> PAGEREF _Toc236385992 \h </w:instrText>
+              <w:instrText xml:space="preserve"> PAGEREF _Toc237911249 \h </w:instrText>
             </w:r>
             <w:r>
               <w:rPr>
@@ -7056,7 +7310,7 @@
                 <w:noProof/>
                 <w:webHidden/>
               </w:rPr>
-              <w:t>43</w:t>
+              <w:t>44</w:t>
             </w:r>
             <w:r>
               <w:rPr>
@@ -7082,7 +7336,7 @@
               <w:lang w:eastAsia="zh-CN"/>
             </w:rPr>
           </w:pPr>
-          <w:hyperlink w:anchor="_Toc236385993" w:history="1">
+          <w:hyperlink w:anchor="_Toc237911250" w:history="1">
             <w:r>
               <w:rPr>
                 <w:rStyle w:val="Hyperlink"/>
@@ -7126,7 +7380,7 @@
                 <w:noProof/>
                 <w:webHidden/>
               </w:rPr>
-              <w:instrText xml:space="preserve"> PAGEREF _Toc236385993 \h </w:instrText>
+              <w:instrText xml:space="preserve"> PAGEREF _Toc237911250 \h </w:instrText>
             </w:r>
             <w:r>
               <w:rPr>
@@ -7146,7 +7400,7 @@
                 <w:noProof/>
                 <w:webHidden/>
               </w:rPr>
-              <w:t>44</w:t>
+              <w:t>45</w:t>
             </w:r>
             <w:r>
               <w:rPr>
@@ -7180,7 +7434,7 @@
       <w:pPr>
         <w:pStyle w:val="Heading1"/>
       </w:pPr>
-      <w:bookmarkStart w:id="3" w:name="_Toc236385923"/>
+      <w:bookmarkStart w:id="3" w:name="_Toc237911177"/>
       <w:r>
         <w:t>Revision History</w:t>
       </w:r>
@@ -7188,7 +7442,7 @@
     </w:p>
     <w:p>
       <w:r>
-        <w:t>20260606</w:t>
+        <w:t>20260818</w:t>
       </w:r>
     </w:p>
     <w:p>
@@ -7200,12 +7454,12 @@
         </w:numPr>
       </w:pPr>
       <w:r>
-        <w:t>Documented the serial command interface and reporting protocols. Renamed the 1090 MHz commands to the R1090_ prefix and added RX_STATS.</w:t>
+        <w:t>Added AT+SUBG_MODE for selecting the Sub-GHz receiver mode (UAT_RX / UAT_RX_NO_UPLINK, disables UAT uplink reception). AT+RX_ENABLE now powers the Sub-GHz receiver down when disabled.</w:t>
       </w:r>
     </w:p>
     <w:p>
       <w:r>
-        <w:t>20260516</w:t>
+        <w:t>20260606</w:t>
       </w:r>
     </w:p>
     <w:p>
@@ -7217,12 +7471,12 @@
         </w:numPr>
       </w:pPr>
       <w:r>
-        <w:t>Initial release.</w:t>
+        <w:t>Documented the serial command interface and reporting protocols. Renamed the 1090 MHz commands to the R1090_ prefix and added RX_STATS.</w:t>
       </w:r>
     </w:p>
     <w:p>
       <w:r>
-        <w:t>20260606</w:t>
+        <w:t>20260516</w:t>
       </w:r>
     </w:p>
     <w:p>
@@ -7234,7 +7488,12 @@
         </w:numPr>
       </w:pPr>
       <w:r>
-        <w:t>Add detailed protocol descriptions.</w:t>
+        <w:t>Initial release.</w:t>
+      </w:r>
+    </w:p>
+    <w:p>
+      <w:r>
+        <w:t>20260606</w:t>
       </w:r>
     </w:p>
     <w:p>
@@ -7246,6 +7505,18 @@
         </w:numPr>
       </w:pPr>
       <w:r>
+        <w:t>Add detailed protocol descriptions.</w:t>
+      </w:r>
+    </w:p>
+    <w:p>
+      <w:pPr>
+        <w:pStyle w:val="ListParagraph"/>
+        <w:numPr>
+          <w:ilvl w:val="0"/>
+          <w:numId w:val="5"/>
+        </w:numPr>
+      </w:pPr>
+      <w:r>
         <w:t>Revise power estimate.</w:t>
       </w:r>
       <w:r>
@@ -7260,7 +7531,7 @@
           <w:numId w:val="4"/>
         </w:numPr>
       </w:pPr>
-      <w:bookmarkStart w:id="4" w:name="_Toc236385924"/>
+      <w:bookmarkStart w:id="4" w:name="_Toc237911178"/>
       <w:r>
         <w:lastRenderedPageBreak/>
         <w:t>Overview</w:t>
@@ -7317,7 +7588,7 @@
       <w:r>
         <w:t xml:space="preserve">ADSBee m1421 is built with open-source firmware from Pants for Birds LLC’s </w:t>
       </w:r>
-      <w:hyperlink r:id="rId14" w:history="1">
+      <w:hyperlink r:id="rId16" w:history="1">
         <w:r>
           <w:rPr>
             <w:rStyle w:val="Hyperlink"/>
@@ -7365,7 +7636,7 @@
           <w:numId w:val="4"/>
         </w:numPr>
       </w:pPr>
-      <w:bookmarkStart w:id="5" w:name="_Toc236385925"/>
+      <w:bookmarkStart w:id="5" w:name="_Toc237911179"/>
       <w:r>
         <w:lastRenderedPageBreak/>
         <w:t>Pin Functions</w:t>
@@ -8742,7 +9013,7 @@
                     <pic:cNvPicPr/>
                   </pic:nvPicPr>
                   <pic:blipFill>
-                    <a:blip r:embed="rId15"/>
+                    <a:blip r:embed="rId17"/>
                     <a:stretch>
                       <a:fillRect/>
                     </a:stretch>
@@ -8774,7 +9045,7 @@
           <w:numId w:val="4"/>
         </w:numPr>
       </w:pPr>
-      <w:bookmarkStart w:id="6" w:name="_Toc236385926"/>
+      <w:bookmarkStart w:id="6" w:name="_Toc237911180"/>
       <w:r>
         <w:lastRenderedPageBreak/>
         <w:t>SYNC Pin Functionality</w:t>
@@ -8824,7 +9095,25 @@
         <w:rPr>
           <w:noProof/>
         </w:rPr>
-        <w:pict w14:anchorId="48639C92">
+        <w:fldChar w:fldCharType="begin"/>
+      </w:r>
+      <w:r>
+        <w:rPr>
+          <w:noProof/>
+        </w:rPr>
+        <w:instrText xml:space="preserve"> INCLUDEPICTURE  "http://10.42.2.218/scrprint.png?reload=0&amp;format=0&amp;mode=0" \* MERGEFORMATINET </w:instrText>
+      </w:r>
+      <w:r>
+        <w:rPr>
+          <w:noProof/>
+        </w:rPr>
+        <w:fldChar w:fldCharType="separate"/>
+      </w:r>
+      <w:r>
+        <w:rPr>
+          <w:noProof/>
+        </w:rPr>
+        <w:pict w14:anchorId="71802B14">
           <v:shapetype id="_x0000_t75" coordsize="21600,21600" o:spt="75" o:preferrelative="t" path="m@4@5l@4@11@9@11@9@5xe" filled="f" stroked="f">
             <v:stroke joinstyle="miter"/>
             <v:formulas>
@@ -8844,10 +9133,16 @@
             <v:path o:extrusionok="f" gradientshapeok="t" o:connecttype="rect"/>
             <o:lock v:ext="edit" aspectratio="t"/>
           </v:shapetype>
-          <v:shape id="_x0000_i1025" type="#_x0000_t75" alt="" style="width:540pt;height:347.5pt;mso-width-percent:0;mso-height-percent:0;mso-width-percent:0;mso-height-percent:0">
-            <v:imagedata r:id="rId16" r:href="rId17"/>
+          <v:shape id="_x0000_i1025" type="#_x0000_t75" alt="" style="width:540pt;height:347pt;mso-width-percent:0;mso-height-percent:0;mso-width-percent:0;mso-height-percent:0">
+            <v:imagedata r:id="rId18" r:href="rId19"/>
           </v:shape>
         </w:pict>
+      </w:r>
+      <w:r>
+        <w:rPr>
+          <w:noProof/>
+        </w:rPr>
+        <w:fldChar w:fldCharType="end"/>
       </w:r>
       <w:r>
         <w:rPr>
@@ -8882,7 +9177,7 @@
           <w:numId w:val="4"/>
         </w:numPr>
       </w:pPr>
-      <w:bookmarkStart w:id="7" w:name="_Toc236385927"/>
+      <w:bookmarkStart w:id="7" w:name="_Toc237911181"/>
       <w:r>
         <w:lastRenderedPageBreak/>
         <w:t>Device Form Factor</w:t>
@@ -8897,7 +9192,7 @@
           <w:numId w:val="4"/>
         </w:numPr>
       </w:pPr>
-      <w:bookmarkStart w:id="8" w:name="_Toc236385928"/>
+      <w:bookmarkStart w:id="8" w:name="_Toc237911182"/>
       <w:r>
         <w:t>Module Dimensions</w:t>
       </w:r>
@@ -8924,7 +9219,7 @@
                     <pic:cNvPicPr/>
                   </pic:nvPicPr>
                   <pic:blipFill>
-                    <a:blip r:embed="rId18"/>
+                    <a:blip r:embed="rId20"/>
                     <a:stretch>
                       <a:fillRect/>
                     </a:stretch>
@@ -8967,7 +9262,7 @@
           <w:numId w:val="4"/>
         </w:numPr>
       </w:pPr>
-      <w:bookmarkStart w:id="9" w:name="_Toc236385929"/>
+      <w:bookmarkStart w:id="9" w:name="_Toc237911183"/>
       <w:r>
         <w:lastRenderedPageBreak/>
         <w:t>Recommended Footprint</w:t>
@@ -8978,7 +9273,7 @@
       <w:r>
         <w:t xml:space="preserve">A KiCAD footprint is available at: </w:t>
       </w:r>
-      <w:hyperlink r:id="rId19" w:history="1">
+      <w:hyperlink r:id="rId21" w:history="1">
         <w:r>
           <w:rPr>
             <w:rStyle w:val="Hyperlink"/>
@@ -9042,7 +9337,7 @@
                     <pic:cNvPicPr/>
                   </pic:nvPicPr>
                   <pic:blipFill>
-                    <a:blip r:embed="rId20"/>
+                    <a:blip r:embed="rId22"/>
                     <a:stretch>
                       <a:fillRect/>
                     </a:stretch>
@@ -9086,7 +9381,7 @@
           <w:numId w:val="4"/>
         </w:numPr>
       </w:pPr>
-      <w:bookmarkStart w:id="10" w:name="_Toc236385930"/>
+      <w:bookmarkStart w:id="10" w:name="_Toc237911184"/>
       <w:r>
         <w:lastRenderedPageBreak/>
         <w:t>AT Commands</w:t>
@@ -9106,7 +9401,7 @@
           <w:numId w:val="4"/>
         </w:numPr>
       </w:pPr>
-      <w:bookmarkStart w:id="11" w:name="_Toc236385931"/>
+      <w:bookmarkStart w:id="11" w:name="_Toc237911185"/>
       <w:r>
         <w:t>AT+BAUD_RATE</w:t>
       </w:r>
@@ -9130,7 +9425,7 @@
           <w:numId w:val="4"/>
         </w:numPr>
       </w:pPr>
-      <w:bookmarkStart w:id="12" w:name="_Toc236385932"/>
+      <w:bookmarkStart w:id="12" w:name="_Toc237911186"/>
       <w:r>
         <w:t>Set the Console Baud Rate</w:t>
       </w:r>
@@ -9299,7 +9594,7 @@
           <w:numId w:val="4"/>
         </w:numPr>
       </w:pPr>
-      <w:bookmarkStart w:id="13" w:name="_Toc236385933"/>
+      <w:bookmarkStart w:id="13" w:name="_Toc237911187"/>
       <w:r>
         <w:t>Query the Console Baud Rate</w:t>
       </w:r>
@@ -9345,7 +9640,7 @@
           <w:numId w:val="4"/>
         </w:numPr>
       </w:pPr>
-      <w:bookmarkStart w:id="14" w:name="_Toc236385934"/>
+      <w:bookmarkStart w:id="14" w:name="_Toc237911188"/>
       <w:r>
         <w:lastRenderedPageBreak/>
         <w:t>AT+BOOT_UART_BOOTLOADER</w:t>
@@ -9500,7 +9795,7 @@
           <w:numId w:val="4"/>
         </w:numPr>
       </w:pPr>
-      <w:bookmarkStart w:id="15" w:name="_Toc236385935"/>
+      <w:bookmarkStart w:id="15" w:name="_Toc237911189"/>
       <w:r>
         <w:lastRenderedPageBreak/>
         <w:t>AT+DEVICE_INFO</w:t>
@@ -9588,7 +9883,7 @@
           <w:numId w:val="4"/>
         </w:numPr>
       </w:pPr>
-      <w:bookmarkStart w:id="16" w:name="_Toc236385936"/>
+      <w:bookmarkStart w:id="16" w:name="_Toc237911190"/>
       <w:r>
         <w:lastRenderedPageBreak/>
         <w:t>AT+LOG_LEVEL</w:t>
@@ -9608,7 +9903,7 @@
           <w:numId w:val="4"/>
         </w:numPr>
       </w:pPr>
-      <w:bookmarkStart w:id="17" w:name="_Toc236385937"/>
+      <w:bookmarkStart w:id="17" w:name="_Toc237911191"/>
       <w:r>
         <w:t>Set the Log Level</w:t>
       </w:r>
@@ -9745,7 +10040,7 @@
           <w:numId w:val="4"/>
         </w:numPr>
       </w:pPr>
-      <w:bookmarkStart w:id="18" w:name="_Toc236385938"/>
+      <w:bookmarkStart w:id="18" w:name="_Toc237911192"/>
       <w:r>
         <w:t>Query the Log Level</w:t>
       </w:r>
@@ -9790,7 +10085,7 @@
           <w:numId w:val="4"/>
         </w:numPr>
       </w:pPr>
-      <w:bookmarkStart w:id="19" w:name="_Toc236385939"/>
+      <w:bookmarkStart w:id="19" w:name="_Toc237911193"/>
       <w:r>
         <w:lastRenderedPageBreak/>
         <w:t>AT+MAVLINK_ID</w:t>
@@ -9810,7 +10105,7 @@
           <w:numId w:val="4"/>
         </w:numPr>
       </w:pPr>
-      <w:bookmarkStart w:id="20" w:name="_Toc236385940"/>
+      <w:bookmarkStart w:id="20" w:name="_Toc237911194"/>
       <w:r>
         <w:t>Set the MAVLINK System ID and Component ID</w:t>
       </w:r>
@@ -9984,7 +10279,7 @@
           <w:numId w:val="4"/>
         </w:numPr>
       </w:pPr>
-      <w:bookmarkStart w:id="21" w:name="_Toc236385941"/>
+      <w:bookmarkStart w:id="21" w:name="_Toc237911195"/>
       <w:r>
         <w:t>Query the MAVLINK System ID and Component ID</w:t>
       </w:r>
@@ -10038,7 +10333,7 @@
           <w:numId w:val="4"/>
         </w:numPr>
       </w:pPr>
-      <w:bookmarkStart w:id="22" w:name="_Toc236385942"/>
+      <w:bookmarkStart w:id="22" w:name="_Toc237911196"/>
       <w:r>
         <w:lastRenderedPageBreak/>
         <w:t>AT+PROTOCOL_OUT</w:t>
@@ -10058,7 +10353,7 @@
           <w:numId w:val="4"/>
         </w:numPr>
       </w:pPr>
-      <w:bookmarkStart w:id="23" w:name="_Toc236385943"/>
+      <w:bookmarkStart w:id="23" w:name="_Toc237911197"/>
       <w:r>
         <w:t>Set the Reporting Protocol for a Serial Interface</w:t>
       </w:r>
@@ -10227,7 +10522,7 @@
           <w:numId w:val="4"/>
         </w:numPr>
       </w:pPr>
-      <w:bookmarkStart w:id="24" w:name="_Toc236385944"/>
+      <w:bookmarkStart w:id="24" w:name="_Toc237911198"/>
       <w:r>
         <w:t>Query the Reporting Protocol for All Serial Interfaces</w:t>
       </w:r>
@@ -10258,7 +10553,7 @@
           <w:numId w:val="4"/>
         </w:numPr>
       </w:pPr>
-      <w:bookmarkStart w:id="25" w:name="_Toc236385945"/>
+      <w:bookmarkStart w:id="25" w:name="_Toc237911199"/>
       <w:r>
         <w:t>AT+R1090_GAIN</w:t>
       </w:r>
@@ -10286,7 +10581,7 @@
           <w:numId w:val="4"/>
         </w:numPr>
       </w:pPr>
-      <w:bookmarkStart w:id="26" w:name="_Toc236385946"/>
+      <w:bookmarkStart w:id="26" w:name="_Toc237911200"/>
       <w:r>
         <w:t>Set the 1090 MHz Gain</w:t>
       </w:r>
@@ -10429,7 +10724,7 @@
           <w:numId w:val="4"/>
         </w:numPr>
       </w:pPr>
-      <w:bookmarkStart w:id="27" w:name="_Toc236385947"/>
+      <w:bookmarkStart w:id="27" w:name="_Toc237911201"/>
       <w:r>
         <w:t>Query the 1090 MHz Gain</w:t>
       </w:r>
@@ -10475,7 +10770,7 @@
           <w:numId w:val="4"/>
         </w:numPr>
       </w:pPr>
-      <w:bookmarkStart w:id="28" w:name="_Toc236385948"/>
+      <w:bookmarkStart w:id="28" w:name="_Toc237911202"/>
       <w:r>
         <w:lastRenderedPageBreak/>
         <w:t>AT+R1090_PREAMBLE</w:t>
@@ -10501,7 +10796,7 @@
           <w:numId w:val="4"/>
         </w:numPr>
       </w:pPr>
-      <w:bookmarkStart w:id="29" w:name="_Toc236385949"/>
+      <w:bookmarkStart w:id="29" w:name="_Toc237911203"/>
       <w:r>
         <w:t>Set the Preamble Mode</w:t>
       </w:r>
@@ -10638,7 +10933,7 @@
           <w:numId w:val="4"/>
         </w:numPr>
       </w:pPr>
-      <w:bookmarkStart w:id="30" w:name="_Toc236385950"/>
+      <w:bookmarkStart w:id="30" w:name="_Toc237911204"/>
       <w:r>
         <w:t>Query the Preamble Mode</w:t>
       </w:r>
@@ -10684,7 +10979,7 @@
           <w:numId w:val="4"/>
         </w:numPr>
       </w:pPr>
-      <w:bookmarkStart w:id="31" w:name="_Toc236385951"/>
+      <w:bookmarkStart w:id="31" w:name="_Toc237911205"/>
       <w:r>
         <w:lastRenderedPageBreak/>
         <w:t>AT+R1090_RX_BOOST</w:t>
@@ -10704,7 +10999,7 @@
           <w:numId w:val="4"/>
         </w:numPr>
       </w:pPr>
-      <w:bookmarkStart w:id="32" w:name="_Toc236385952"/>
+      <w:bookmarkStart w:id="32" w:name="_Toc237911206"/>
       <w:r>
         <w:t>Set the 1090 MHz RX Boost Level</w:t>
       </w:r>
@@ -10841,7 +11136,7 @@
           <w:numId w:val="4"/>
         </w:numPr>
       </w:pPr>
-      <w:bookmarkStart w:id="33" w:name="_Toc236385953"/>
+      <w:bookmarkStart w:id="33" w:name="_Toc237911207"/>
       <w:r>
         <w:t>Query the 1090 MHz RX Boost Level</w:t>
       </w:r>
@@ -10887,7 +11182,7 @@
           <w:numId w:val="4"/>
         </w:numPr>
       </w:pPr>
-      <w:bookmarkStart w:id="34" w:name="_Toc236385954"/>
+      <w:bookmarkStart w:id="34" w:name="_Toc237911208"/>
       <w:r>
         <w:lastRenderedPageBreak/>
         <w:t>AT+REBOOT</w:t>
@@ -10931,7 +11226,7 @@
           <w:numId w:val="4"/>
         </w:numPr>
       </w:pPr>
-      <w:bookmarkStart w:id="35" w:name="_Toc236385955"/>
+      <w:bookmarkStart w:id="35" w:name="_Toc237911209"/>
       <w:r>
         <w:lastRenderedPageBreak/>
         <w:t>AT+RX_ENABLE</w:t>
@@ -10940,7 +11235,7 @@
     </w:p>
     <w:p>
       <w:r>
-        <w:t>Enables or disables the onboard receivers. The first argument, if present, overrides the others, allowing all receivers to be enabled or disabled at once.</w:t>
+        <w:t>Enables or disables the onboard receivers. The first argument, if present, overrides the others, allowing all receivers to be enabled or disabled at once. Disabling the Sub-GHz receiver powers down the CC1314 RF core; re-enabling it restarts reception in the mode selected by AT+SUBG_MODE.</w:t>
       </w:r>
     </w:p>
     <w:p>
@@ -10951,7 +11246,7 @@
           <w:numId w:val="4"/>
         </w:numPr>
       </w:pPr>
-      <w:bookmarkStart w:id="36" w:name="_Toc236385956"/>
+      <w:bookmarkStart w:id="36" w:name="_Toc237911210"/>
       <w:r>
         <w:t>Enable or Disable the Receiver(s)</w:t>
       </w:r>
@@ -11157,7 +11452,7 @@
           <w:numId w:val="4"/>
         </w:numPr>
       </w:pPr>
-      <w:bookmarkStart w:id="37" w:name="_Toc236385957"/>
+      <w:bookmarkStart w:id="37" w:name="_Toc237911211"/>
       <w:r>
         <w:t>Query Whether the Receiver(s) Are Enabled</w:t>
       </w:r>
@@ -11211,7 +11506,7 @@
           <w:numId w:val="4"/>
         </w:numPr>
       </w:pPr>
-      <w:bookmarkStart w:id="38" w:name="_Toc236385958"/>
+      <w:bookmarkStart w:id="38" w:name="_Toc237911212"/>
       <w:r>
         <w:lastRenderedPageBreak/>
         <w:t>AT+RX_POSITION</w:t>
@@ -11231,7 +11526,7 @@
           <w:numId w:val="4"/>
         </w:numPr>
       </w:pPr>
-      <w:bookmarkStart w:id="39" w:name="_Toc236385959"/>
+      <w:bookmarkStart w:id="39" w:name="_Toc237911213"/>
       <w:r>
         <w:t>Query Receiver Position</w:t>
       </w:r>
@@ -11327,7 +11622,7 @@
           <w:numId w:val="4"/>
         </w:numPr>
       </w:pPr>
-      <w:bookmarkStart w:id="40" w:name="_Toc236385960"/>
+      <w:bookmarkStart w:id="40" w:name="_Toc237911214"/>
       <w:r>
         <w:t>Set Receiver Position</w:t>
       </w:r>
@@ -12003,7 +12298,7 @@
           <w:numId w:val="4"/>
         </w:numPr>
       </w:pPr>
-      <w:bookmarkStart w:id="41" w:name="_Toc236385961"/>
+      <w:bookmarkStart w:id="41" w:name="_Toc237911215"/>
       <w:r>
         <w:lastRenderedPageBreak/>
         <w:t>AT+RX_STATS</w:t>
@@ -12080,7 +12375,7 @@
           <w:numId w:val="4"/>
         </w:numPr>
       </w:pPr>
-      <w:bookmarkStart w:id="42" w:name="_Toc236385962"/>
+      <w:bookmarkStart w:id="42" w:name="_Toc237911216"/>
       <w:r>
         <w:lastRenderedPageBreak/>
         <w:t>AT+SETTINGS</w:t>
@@ -12100,7 +12395,7 @@
           <w:numId w:val="4"/>
         </w:numPr>
       </w:pPr>
-      <w:bookmarkStart w:id="43" w:name="_Toc236385963"/>
+      <w:bookmarkStart w:id="43" w:name="_Toc237911217"/>
       <w:r>
         <w:t>Query Current Settings</w:t>
       </w:r>
@@ -12127,7 +12422,7 @@
           <w:numId w:val="4"/>
         </w:numPr>
       </w:pPr>
-      <w:bookmarkStart w:id="44" w:name="_Toc236385964"/>
+      <w:bookmarkStart w:id="44" w:name="_Toc237911218"/>
       <w:r>
         <w:t>Dump Settings in AT Format</w:t>
       </w:r>
@@ -12163,6 +12458,14 @@
       </w:pPr>
       <w:r>
         <w:t>+RX_ENABLE=1,1,1</w:t>
+      </w:r>
+    </w:p>
+    <w:p>
+      <w:pPr>
+        <w:pStyle w:val="code"/>
+      </w:pPr>
+      <w:r>
+        <w:t>+SUBG_MODE=UAT_RX</w:t>
       </w:r>
     </w:p>
     <w:p>
@@ -12194,7 +12497,7 @@
           <w:numId w:val="4"/>
         </w:numPr>
       </w:pPr>
-      <w:bookmarkStart w:id="45" w:name="_Toc236385965"/>
+      <w:bookmarkStart w:id="45" w:name="_Toc237911219"/>
       <w:r>
         <w:t>Load Settings from Nonvolatile Memory</w:t>
       </w:r>
@@ -12225,7 +12528,7 @@
           <w:numId w:val="4"/>
         </w:numPr>
       </w:pPr>
-      <w:bookmarkStart w:id="46" w:name="_Toc236385966"/>
+      <w:bookmarkStart w:id="46" w:name="_Toc237911220"/>
       <w:r>
         <w:t>Save Settings to Nonvolatile Memory</w:t>
       </w:r>
@@ -12256,7 +12559,7 @@
           <w:numId w:val="4"/>
         </w:numPr>
       </w:pPr>
-      <w:bookmarkStart w:id="47" w:name="_Toc236385967"/>
+      <w:bookmarkStart w:id="47" w:name="_Toc237911221"/>
       <w:r>
         <w:t>Reset Settings to Factory Defaults</w:t>
       </w:r>
@@ -12302,16 +12605,16 @@
           <w:numId w:val="4"/>
         </w:numPr>
       </w:pPr>
-      <w:bookmarkStart w:id="48" w:name="_Toc236385968"/>
+      <w:bookmarkStart w:id="48" w:name="_Toc237911222"/>
       <w:r>
         <w:lastRenderedPageBreak/>
-        <w:t>AT+WATCHDOG</w:t>
+        <w:t>AT+SUBG_MODE</w:t>
       </w:r>
       <w:bookmarkEnd w:id="48"/>
     </w:p>
     <w:p>
       <w:r>
-        <w:t>The watchdog timer automatically resets the device if firmware execution stalls and the timer is no longer serviced, providing automatic recovery from a hard fault. It can be disabled (for example, during breakpoint debugging) and can be self-tested via AT command to verify that it is still active.</w:t>
+        <w:t>Selects the protocol mode of the Sub-GHz receiver. UAT_RX receives 978 MHz UAT ADS-B messages and ground uplink messages (FIS-B / TIS-B). UAT_RX_NO_UPLINK receives UAT ADS-B only: the uplink sync word is disabled at the RF core, so uplink frames are never received or decoded, which reduces receiver airtime and processor load when uplink data is not needed. Defaults to UAT_RX. Additional Sub-GHz protocols may be added as new modes in future firmware. Changes take effect immediately and persist across reboots after AT+SETTINGS=SAVE.</w:t>
       </w:r>
     </w:p>
     <w:p>
@@ -12322,9 +12625,9 @@
           <w:numId w:val="4"/>
         </w:numPr>
       </w:pPr>
-      <w:bookmarkStart w:id="49" w:name="_Toc236385969"/>
-      <w:r>
-        <w:t>Configure the Watchdog Timer</w:t>
+      <w:bookmarkStart w:id="49" w:name="_Toc237911223"/>
+      <w:r>
+        <w:t>Set the Sub-GHz Receiver Mode</w:t>
       </w:r>
       <w:bookmarkEnd w:id="49"/>
     </w:p>
@@ -12333,7 +12636,7 @@
         <w:pStyle w:val="code"/>
       </w:pPr>
       <w:r>
-        <w:t>AT+WATCHDOG=&lt;timeout_sec&gt;</w:t>
+        <w:t>AT+SUBG_MODE=&lt;mode&gt;</w:t>
       </w:r>
     </w:p>
     <w:p>
@@ -12425,6 +12728,209 @@
           </w:tcPr>
           <w:p>
             <w:r>
+              <w:t>mode</w:t>
+            </w:r>
+          </w:p>
+        </w:tc>
+        <w:tc>
+          <w:tcPr>
+            <w:tcW w:w="6160" w:type="dxa"/>
+          </w:tcPr>
+          <w:p>
+            <w:r>
+              <w:t>Sub-GHz receiver protocol mode.</w:t>
+            </w:r>
+          </w:p>
+        </w:tc>
+        <w:tc>
+          <w:tcPr>
+            <w:tcW w:w="2440" w:type="dxa"/>
+          </w:tcPr>
+          <w:p>
+            <w:r>
+              <w:t>UAT_RX, UAT_RX_NO_UPLINK</w:t>
+            </w:r>
+          </w:p>
+        </w:tc>
+      </w:tr>
+    </w:tbl>
+    <w:p>
+      <w:pPr>
+        <w:pStyle w:val="Heading3"/>
+        <w:numPr>
+          <w:ilvl w:val="2"/>
+          <w:numId w:val="4"/>
+        </w:numPr>
+      </w:pPr>
+      <w:bookmarkStart w:id="50" w:name="_Toc237911224"/>
+      <w:r>
+        <w:t>Query the Sub-GHz Receiver Mode</w:t>
+      </w:r>
+      <w:bookmarkEnd w:id="50"/>
+    </w:p>
+    <w:p>
+      <w:pPr>
+        <w:pStyle w:val="code"/>
+      </w:pPr>
+      <w:r>
+        <w:t>AT+SUBG_MODE?</w:t>
+      </w:r>
+    </w:p>
+    <w:p>
+      <w:pPr>
+        <w:pStyle w:val="code"/>
+      </w:pPr>
+      <w:r>
+        <w:t>SUBG_MODE=UAT_RX</w:t>
+      </w:r>
+    </w:p>
+    <w:p/>
+    <w:p>
+      <w:pPr>
+        <w:pStyle w:val="Heading2"/>
+        <w:numPr>
+          <w:ilvl w:val="1"/>
+          <w:numId w:val="4"/>
+        </w:numPr>
+        <w:sectPr>
+          <w:pgSz w:w="12240" w:h="15840"/>
+          <w:pgMar w:top="720" w:right="720" w:bottom="720" w:left="720" w:header="288" w:footer="288" w:gutter="0"/>
+          <w:cols w:space="720"/>
+          <w:docGrid w:linePitch="360"/>
+        </w:sectPr>
+      </w:pPr>
+    </w:p>
+    <w:p>
+      <w:pPr>
+        <w:pStyle w:val="Heading2"/>
+        <w:numPr>
+          <w:ilvl w:val="1"/>
+          <w:numId w:val="4"/>
+        </w:numPr>
+      </w:pPr>
+      <w:bookmarkStart w:id="51" w:name="_Toc237911225"/>
+      <w:r>
+        <w:lastRenderedPageBreak/>
+        <w:t>AT+WATCHDOG</w:t>
+      </w:r>
+      <w:bookmarkEnd w:id="51"/>
+    </w:p>
+    <w:p>
+      <w:r>
+        <w:t>The watchdog timer automatically resets the device if firmware execution stalls and the timer is no longer serviced, providing automatic recovery from a hard fault. It can be disabled (for example, during breakpoint debugging) and can be self-tested via AT command to verify that it is still active.</w:t>
+      </w:r>
+    </w:p>
+    <w:p>
+      <w:pPr>
+        <w:pStyle w:val="Heading3"/>
+        <w:numPr>
+          <w:ilvl w:val="2"/>
+          <w:numId w:val="4"/>
+        </w:numPr>
+      </w:pPr>
+      <w:bookmarkStart w:id="52" w:name="_Toc237911226"/>
+      <w:r>
+        <w:t>Configure the Watchdog Timer</w:t>
+      </w:r>
+      <w:bookmarkEnd w:id="52"/>
+    </w:p>
+    <w:p>
+      <w:pPr>
+        <w:pStyle w:val="code"/>
+      </w:pPr>
+      <w:r>
+        <w:t>AT+WATCHDOG=&lt;timeout_sec&gt;</w:t>
+      </w:r>
+    </w:p>
+    <w:p>
+      <w:pPr>
+        <w:pStyle w:val="code"/>
+      </w:pPr>
+      <w:r>
+        <w:t>OK</w:t>
+      </w:r>
+    </w:p>
+    <w:p/>
+    <w:tbl>
+      <w:tblPr>
+        <w:tblStyle w:val="TableGrid"/>
+        <w:tblW w:w="0" w:type="auto"/>
+        <w:tblLook w:val="04A0" w:firstRow="1" w:lastRow="0" w:firstColumn="1" w:lastColumn="0" w:noHBand="0" w:noVBand="1"/>
+      </w:tblPr>
+      <w:tblGrid>
+        <w:gridCol w:w="2200"/>
+        <w:gridCol w:w="6160"/>
+        <w:gridCol w:w="2440"/>
+      </w:tblGrid>
+      <w:tr>
+        <w:tc>
+          <w:tcPr>
+            <w:tcW w:w="2200" w:type="dxa"/>
+          </w:tcPr>
+          <w:p>
+            <w:pPr>
+              <w:rPr>
+                <w:b/>
+                <w:bCs/>
+              </w:rPr>
+            </w:pPr>
+            <w:r>
+              <w:rPr>
+                <w:b/>
+                <w:bCs/>
+              </w:rPr>
+              <w:t>Parameter</w:t>
+            </w:r>
+          </w:p>
+        </w:tc>
+        <w:tc>
+          <w:tcPr>
+            <w:tcW w:w="6160" w:type="dxa"/>
+          </w:tcPr>
+          <w:p>
+            <w:pPr>
+              <w:rPr>
+                <w:b/>
+                <w:bCs/>
+              </w:rPr>
+            </w:pPr>
+            <w:r>
+              <w:rPr>
+                <w:b/>
+                <w:bCs/>
+              </w:rPr>
+              <w:t>Description</w:t>
+            </w:r>
+          </w:p>
+        </w:tc>
+        <w:tc>
+          <w:tcPr>
+            <w:tcW w:w="2440" w:type="dxa"/>
+          </w:tcPr>
+          <w:p>
+            <w:pPr>
+              <w:rPr>
+                <w:b/>
+                <w:bCs/>
+              </w:rPr>
+            </w:pPr>
+            <w:r>
+              <w:rPr>
+                <w:b/>
+                <w:bCs/>
+              </w:rPr>
+              <w:t>Acceptable Values</w:t>
+            </w:r>
+          </w:p>
+        </w:tc>
+      </w:tr>
+      <w:tr>
+        <w:tc>
+          <w:tcPr>
+            <w:tcW w:w="2200" w:type="dxa"/>
+          </w:tcPr>
+          <w:p>
+            <w:r>
               <w:t>timeout_sec</w:t>
             </w:r>
           </w:p>
@@ -12460,11 +12966,11 @@
           <w:numId w:val="4"/>
         </w:numPr>
       </w:pPr>
-      <w:bookmarkStart w:id="50" w:name="_Toc236385970"/>
+      <w:bookmarkStart w:id="53" w:name="_Toc237911227"/>
       <w:r>
         <w:t>Query the Watchdog Timer</w:t>
       </w:r>
-      <w:bookmarkEnd w:id="50"/>
+      <w:bookmarkEnd w:id="53"/>
     </w:p>
     <w:p>
       <w:pPr>
@@ -12496,11 +13002,11 @@
           <w:numId w:val="4"/>
         </w:numPr>
       </w:pPr>
-      <w:bookmarkStart w:id="51" w:name="_Toc236385971"/>
+      <w:bookmarkStart w:id="54" w:name="_Toc237911228"/>
       <w:r>
         <w:t>Test the Watchdog Timer</w:t>
       </w:r>
-      <w:bookmarkEnd w:id="51"/>
+      <w:bookmarkEnd w:id="54"/>
     </w:p>
     <w:p>
       <w:pPr>
@@ -12538,7 +13044,7 @@
           <w:docGrid w:linePitch="360"/>
         </w:sectPr>
       </w:pPr>
-      <w:bookmarkStart w:id="52" w:name="_Toc230658084"/>
+      <w:bookmarkStart w:id="55" w:name="_Toc230658084"/>
     </w:p>
     <w:p>
       <w:pPr>
@@ -12548,13 +13054,13 @@
           <w:numId w:val="4"/>
         </w:numPr>
       </w:pPr>
-      <w:bookmarkStart w:id="53" w:name="_Toc236385972"/>
+      <w:bookmarkStart w:id="56" w:name="_Toc237911229"/>
       <w:r>
         <w:lastRenderedPageBreak/>
         <w:t>Reporting Protocols</w:t>
       </w:r>
-      <w:bookmarkEnd w:id="52"/>
-      <w:bookmarkEnd w:id="53"/>
+      <w:bookmarkEnd w:id="55"/>
+      <w:bookmarkEnd w:id="56"/>
     </w:p>
     <w:p>
       <w:r>
@@ -12677,8 +13183,8 @@
           <w:numId w:val="4"/>
         </w:numPr>
       </w:pPr>
-      <w:bookmarkStart w:id="54" w:name="_Toc230658085"/>
-      <w:bookmarkStart w:id="55" w:name="_Toc236385973"/>
+      <w:bookmarkStart w:id="57" w:name="_Toc230658085"/>
+      <w:bookmarkStart w:id="58" w:name="_Toc237911230"/>
       <w:r>
         <w:lastRenderedPageBreak/>
         <w:t>CSB</w:t>
@@ -12686,8 +13192,8 @@
       <w:r>
         <w:t>ee</w:t>
       </w:r>
-      <w:bookmarkEnd w:id="54"/>
-      <w:bookmarkEnd w:id="55"/>
+      <w:bookmarkEnd w:id="57"/>
+      <w:bookmarkEnd w:id="58"/>
     </w:p>
     <w:p>
       <w:r>
@@ -12713,13 +13219,13 @@
           <w:numId w:val="4"/>
         </w:numPr>
       </w:pPr>
-      <w:bookmarkStart w:id="56" w:name="_Toc230658086"/>
-      <w:bookmarkStart w:id="57" w:name="_Toc236385974"/>
+      <w:bookmarkStart w:id="59" w:name="_Toc230658086"/>
+      <w:bookmarkStart w:id="60" w:name="_Toc237911231"/>
       <w:r>
         <w:t>CSBee Protocol Version History</w:t>
       </w:r>
-      <w:bookmarkEnd w:id="56"/>
-      <w:bookmarkEnd w:id="57"/>
+      <w:bookmarkEnd w:id="59"/>
+      <w:bookmarkEnd w:id="60"/>
     </w:p>
     <w:p>
       <w:r>
@@ -13124,7 +13630,7 @@
           <w:docGrid w:linePitch="360"/>
         </w:sectPr>
       </w:pPr>
-      <w:bookmarkStart w:id="58" w:name="_Toc230658087"/>
+      <w:bookmarkStart w:id="61" w:name="_Toc230658087"/>
     </w:p>
     <w:p>
       <w:pPr>
@@ -13134,7 +13640,7 @@
           <w:numId w:val="4"/>
         </w:numPr>
       </w:pPr>
-      <w:bookmarkStart w:id="59" w:name="_Toc236385975"/>
+      <w:bookmarkStart w:id="62" w:name="_Toc237911232"/>
       <w:r>
         <w:lastRenderedPageBreak/>
         <w:t xml:space="preserve">Mode S </w:t>
@@ -13142,8 +13648,8 @@
       <w:r>
         <w:t>Aircraft Message</w:t>
       </w:r>
-      <w:bookmarkEnd w:id="58"/>
-      <w:bookmarkEnd w:id="59"/>
+      <w:bookmarkEnd w:id="61"/>
+      <w:bookmarkEnd w:id="62"/>
     </w:p>
     <w:p>
       <w:r>
@@ -15343,12 +15849,12 @@
           <w:numId w:val="4"/>
         </w:numPr>
       </w:pPr>
-      <w:bookmarkStart w:id="60" w:name="_Ref176012741"/>
+      <w:bookmarkStart w:id="63" w:name="_Ref176012741"/>
       <w:r>
         <w:lastRenderedPageBreak/>
         <w:t>FLAGS Bitfield</w:t>
       </w:r>
-      <w:bookmarkEnd w:id="60"/>
+      <w:bookmarkEnd w:id="63"/>
     </w:p>
     <w:p>
       <w:r>
@@ -16414,12 +16920,12 @@
           <w:numId w:val="4"/>
         </w:numPr>
       </w:pPr>
-      <w:bookmarkStart w:id="61" w:name="_Ref176013441"/>
+      <w:bookmarkStart w:id="64" w:name="_Ref176013441"/>
       <w:r>
         <w:lastRenderedPageBreak/>
         <w:t>ECAT Field</w:t>
       </w:r>
-      <w:bookmarkEnd w:id="61"/>
+      <w:bookmarkEnd w:id="64"/>
     </w:p>
     <w:p>
       <w:r>
@@ -17136,7 +17642,7 @@
           <w:numId w:val="4"/>
         </w:numPr>
       </w:pPr>
-      <w:bookmarkStart w:id="62" w:name="_Ref176013490"/>
+      <w:bookmarkStart w:id="65" w:name="_Ref176013490"/>
     </w:p>
     <w:p>
       <w:pPr>
@@ -17146,11 +17652,11 @@
           <w:numId w:val="4"/>
         </w:numPr>
       </w:pPr>
-      <w:bookmarkStart w:id="63" w:name="_Ref206888411"/>
+      <w:bookmarkStart w:id="66" w:name="_Ref206888411"/>
       <w:r>
         <w:t>NICNAC Bitfield</w:t>
       </w:r>
-      <w:bookmarkEnd w:id="63"/>
+      <w:bookmarkEnd w:id="66"/>
     </w:p>
     <w:tbl>
       <w:tblPr>
@@ -19374,15 +19880,15 @@
           <w:numId w:val="4"/>
         </w:numPr>
       </w:pPr>
-      <w:bookmarkStart w:id="64" w:name="_Ref206888432"/>
+      <w:bookmarkStart w:id="67" w:name="_Ref206888432"/>
       <w:r>
         <w:t>ACDIMS</w:t>
       </w:r>
       <w:r>
         <w:t xml:space="preserve"> Bitfield</w:t>
       </w:r>
-      <w:bookmarkEnd w:id="62"/>
-      <w:bookmarkEnd w:id="64"/>
+      <w:bookmarkEnd w:id="65"/>
+      <w:bookmarkEnd w:id="67"/>
     </w:p>
     <w:tbl>
       <w:tblPr>
@@ -20106,7 +20612,7 @@
       <w:r>
         <w:t xml:space="preserve">Software Design Assurance categories used in this field are classified under RTCA DO-178B, Airborne Electronic Hardware Design Assurance are classified under RTCA DO-254, and failure classification levels are defined in FAA Advisory Circular </w:t>
       </w:r>
-      <w:hyperlink r:id="rId21" w:history="1">
+      <w:hyperlink r:id="rId23" w:history="1">
         <w:r>
           <w:rPr>
             <w:rStyle w:val="Hyperlink"/>
@@ -20601,12 +21107,12 @@
           <w:szCs w:val="24"/>
         </w:rPr>
       </w:pPr>
-      <w:bookmarkStart w:id="65" w:name="_Ref176041315"/>
+      <w:bookmarkStart w:id="68" w:name="_Ref176041315"/>
       <w:r>
         <w:lastRenderedPageBreak/>
         <w:t>CRC Field</w:t>
       </w:r>
-      <w:bookmarkEnd w:id="65"/>
+      <w:bookmarkEnd w:id="68"/>
     </w:p>
     <w:p>
       <w:pPr>
@@ -20754,14 +21260,14 @@
           <w:numId w:val="4"/>
         </w:numPr>
       </w:pPr>
-      <w:bookmarkStart w:id="66" w:name="_Toc230658088"/>
-      <w:bookmarkStart w:id="67" w:name="_Toc236385976"/>
+      <w:bookmarkStart w:id="69" w:name="_Toc230658088"/>
+      <w:bookmarkStart w:id="70" w:name="_Toc237911233"/>
       <w:r>
         <w:lastRenderedPageBreak/>
         <w:t>UAT Aircraft Message</w:t>
       </w:r>
-      <w:bookmarkEnd w:id="66"/>
-      <w:bookmarkEnd w:id="67"/>
+      <w:bookmarkEnd w:id="69"/>
+      <w:bookmarkEnd w:id="70"/>
     </w:p>
     <w:p>
       <w:pPr>
@@ -22996,12 +23502,12 @@
           <w:numId w:val="4"/>
         </w:numPr>
       </w:pPr>
-      <w:bookmarkStart w:id="68" w:name="_Ref228631560"/>
-      <w:bookmarkStart w:id="69" w:name="_Ref206888344"/>
+      <w:bookmarkStart w:id="71" w:name="_Ref228631560"/>
+      <w:bookmarkStart w:id="72" w:name="_Ref206888344"/>
       <w:r>
         <w:t>UAT Address Qualifier</w:t>
       </w:r>
-      <w:bookmarkEnd w:id="68"/>
+      <w:bookmarkEnd w:id="71"/>
     </w:p>
     <w:tbl>
       <w:tblPr>
@@ -23248,7 +23754,7 @@
           <w:numId w:val="4"/>
         </w:numPr>
       </w:pPr>
-      <w:bookmarkStart w:id="70" w:name="_Ref228631259"/>
+      <w:bookmarkStart w:id="73" w:name="_Ref228631259"/>
       <w:r>
         <w:lastRenderedPageBreak/>
         <w:t>UAT_FLAGS</w:t>
@@ -23256,8 +23762,8 @@
       <w:r>
         <w:t xml:space="preserve"> Bitfield</w:t>
       </w:r>
-      <w:bookmarkEnd w:id="69"/>
-      <w:bookmarkEnd w:id="70"/>
+      <w:bookmarkEnd w:id="72"/>
+      <w:bookmarkEnd w:id="73"/>
     </w:p>
     <w:tbl>
       <w:tblPr>
@@ -24420,13 +24926,13 @@
           <w:numId w:val="4"/>
         </w:numPr>
       </w:pPr>
-      <w:bookmarkStart w:id="71" w:name="_Toc230658089"/>
-      <w:bookmarkStart w:id="72" w:name="_Toc236385977"/>
+      <w:bookmarkStart w:id="74" w:name="_Toc230658089"/>
+      <w:bookmarkStart w:id="75" w:name="_Toc237911234"/>
       <w:r>
         <w:t>Statistics Message</w:t>
       </w:r>
-      <w:bookmarkEnd w:id="71"/>
-      <w:bookmarkEnd w:id="72"/>
+      <w:bookmarkEnd w:id="74"/>
+      <w:bookmarkEnd w:id="75"/>
     </w:p>
     <w:p>
       <w:r>
@@ -25768,11 +26274,11 @@
           <w:szCs w:val="26"/>
         </w:rPr>
       </w:pPr>
-      <w:bookmarkStart w:id="73" w:name="_Ref176041344"/>
+      <w:bookmarkStart w:id="76" w:name="_Ref176041344"/>
       <w:r>
         <w:t>CRC Field</w:t>
       </w:r>
-      <w:bookmarkEnd w:id="73"/>
+      <w:bookmarkEnd w:id="76"/>
     </w:p>
     <w:p>
       <w:pPr>
@@ -25816,14 +26322,14 @@
           <w:numId w:val="4"/>
         </w:numPr>
       </w:pPr>
-      <w:bookmarkStart w:id="74" w:name="_Toc230658090"/>
-      <w:bookmarkStart w:id="75" w:name="_Toc236385978"/>
+      <w:bookmarkStart w:id="77" w:name="_Toc230658090"/>
+      <w:bookmarkStart w:id="78" w:name="_Toc237911235"/>
       <w:r>
         <w:lastRenderedPageBreak/>
         <w:t>GDL90</w:t>
       </w:r>
-      <w:bookmarkEnd w:id="74"/>
-      <w:bookmarkEnd w:id="75"/>
+      <w:bookmarkEnd w:id="77"/>
+      <w:bookmarkEnd w:id="78"/>
     </w:p>
     <w:p>
       <w:pPr>
@@ -25838,7 +26344,7 @@
       <w:r>
         <w:t xml:space="preserve">ADSBee complies with the GDL90 public data interface specification </w:t>
       </w:r>
-      <w:hyperlink r:id="rId22" w:history="1">
+      <w:hyperlink r:id="rId24" w:history="1">
         <w:r>
           <w:rPr>
             <w:rStyle w:val="Hyperlink"/>
@@ -25861,14 +26367,14 @@
           <w:numId w:val="4"/>
         </w:numPr>
       </w:pPr>
-      <w:bookmarkStart w:id="76" w:name="_Toc230658091"/>
-      <w:bookmarkStart w:id="77" w:name="_Toc236385979"/>
+      <w:bookmarkStart w:id="79" w:name="_Toc230658091"/>
+      <w:bookmarkStart w:id="80" w:name="_Toc237911236"/>
       <w:r>
         <w:lastRenderedPageBreak/>
         <w:t>MAVLINK</w:t>
       </w:r>
-      <w:bookmarkEnd w:id="76"/>
-      <w:bookmarkEnd w:id="77"/>
+      <w:bookmarkEnd w:id="79"/>
+      <w:bookmarkEnd w:id="80"/>
     </w:p>
     <w:p>
       <w:r>
@@ -25920,7 +26426,7 @@
             <w:r>
               <w:t xml:space="preserve">: </w:t>
             </w:r>
-            <w:hyperlink r:id="rId23" w:anchor=":~:text=The%20COM%20port%20then%20becomes,cause%20the%20PC%20to%20crash." w:history="1">
+            <w:hyperlink r:id="rId25" w:anchor=":~:text=The%20COM%20port%20then%20becomes,cause%20the%20PC%20to%20crash." w:history="1">
               <w:r>
                 <w:rPr>
                   <w:rStyle w:val="Hyperlink"/>
@@ -25959,8 +26465,8 @@
           <w:lang w:eastAsia="zh-CN"/>
         </w:rPr>
       </w:pPr>
-      <w:bookmarkStart w:id="78" w:name="_Toc230658092"/>
-      <w:bookmarkStart w:id="79" w:name="_Toc236385980"/>
+      <w:bookmarkStart w:id="81" w:name="_Toc230658092"/>
+      <w:bookmarkStart w:id="82" w:name="_Toc237911237"/>
       <w:r>
         <w:t xml:space="preserve">MAVLINK_HEARTBEAT </w:t>
       </w:r>
@@ -25990,8 +26496,8 @@
         </w:rPr>
         <w:t xml:space="preserve"> Packet Definition</w:t>
       </w:r>
-      <w:bookmarkEnd w:id="78"/>
-      <w:bookmarkEnd w:id="79"/>
+      <w:bookmarkEnd w:id="81"/>
+      <w:bookmarkEnd w:id="82"/>
     </w:p>
     <w:tbl>
       <w:tblPr>
@@ -26570,8 +27076,8 @@
           <w:numId w:val="4"/>
         </w:numPr>
       </w:pPr>
-      <w:bookmarkStart w:id="80" w:name="_Toc230658093"/>
-      <w:bookmarkStart w:id="81" w:name="_Toc236385981"/>
+      <w:bookmarkStart w:id="83" w:name="_Toc230658093"/>
+      <w:bookmarkStart w:id="84" w:name="_Toc237911238"/>
       <w:r>
         <w:t xml:space="preserve">MAVLINK ADSB_VEHICLE (Message ID 246) </w:t>
       </w:r>
@@ -26586,14 +27092,14 @@
       <w:r>
         <w:t xml:space="preserve"> Definition</w:t>
       </w:r>
-      <w:bookmarkEnd w:id="80"/>
-      <w:bookmarkEnd w:id="81"/>
+      <w:bookmarkEnd w:id="83"/>
+      <w:bookmarkEnd w:id="84"/>
     </w:p>
     <w:p>
       <w:r>
         <w:t xml:space="preserve">From: </w:t>
       </w:r>
-      <w:hyperlink r:id="rId24" w:history="1">
+      <w:hyperlink r:id="rId26" w:history="1">
         <w:r>
           <w:rPr>
             <w:rStyle w:val="Hyperlink"/>
@@ -27000,7 +27506,7 @@
             <w:pPr>
               <w:pStyle w:val="NoSpacing"/>
             </w:pPr>
-            <w:hyperlink r:id="rId25" w:anchor="ADSB_ALTITUDE_TYPE" w:tgtFrame="_blank" w:history="1">
+            <w:hyperlink r:id="rId27" w:anchor="ADSB_ALTITUDE_TYPE" w:tgtFrame="_blank" w:history="1">
               <w:r>
                 <w:rPr>
                   <w:rStyle w:val="Hyperlink"/>
@@ -27436,7 +27942,7 @@
             <w:pPr>
               <w:pStyle w:val="NoSpacing"/>
             </w:pPr>
-            <w:hyperlink r:id="rId26" w:anchor="ADSB_EMITTER_TYPE" w:tgtFrame="_blank" w:history="1">
+            <w:hyperlink r:id="rId28" w:anchor="ADSB_EMITTER_TYPE" w:tgtFrame="_blank" w:history="1">
               <w:r>
                 <w:rPr>
                   <w:rStyle w:val="Hyperlink"/>
@@ -27587,7 +28093,7 @@
             <w:pPr>
               <w:pStyle w:val="NoSpacing"/>
             </w:pPr>
-            <w:hyperlink r:id="rId27" w:anchor="ADSB_FLAGS" w:tgtFrame="_blank" w:history="1">
+            <w:hyperlink r:id="rId29" w:anchor="ADSB_FLAGS" w:tgtFrame="_blank" w:history="1">
               <w:r>
                 <w:rPr>
                   <w:rStyle w:val="Hyperlink"/>
@@ -27706,14 +28212,14 @@
           <w:numId w:val="4"/>
         </w:numPr>
       </w:pPr>
-      <w:bookmarkStart w:id="82" w:name="_Toc230658094"/>
-      <w:bookmarkStart w:id="83" w:name="_Toc236385982"/>
+      <w:bookmarkStart w:id="85" w:name="_Toc230658094"/>
+      <w:bookmarkStart w:id="86" w:name="_Toc237911239"/>
       <w:r>
         <w:lastRenderedPageBreak/>
         <w:t>MAVLINK_REQUEST_DATA_STREAM (Message ID 66) Packet Definition</w:t>
       </w:r>
-      <w:bookmarkEnd w:id="82"/>
-      <w:bookmarkEnd w:id="83"/>
+      <w:bookmarkEnd w:id="85"/>
+      <w:bookmarkEnd w:id="86"/>
     </w:p>
     <w:p>
       <w:r>
@@ -28401,13 +28907,13 @@
           <w:numId w:val="4"/>
         </w:numPr>
       </w:pPr>
-      <w:bookmarkStart w:id="84" w:name="_Toc230658095"/>
-      <w:bookmarkStart w:id="85" w:name="_Toc236385983"/>
+      <w:bookmarkStart w:id="87" w:name="_Toc230658095"/>
+      <w:bookmarkStart w:id="88" w:name="_Toc237911240"/>
       <w:r>
         <w:t>MAVLINK MESSAGE_INTERVAL (Message ID 244) Packet Definition</w:t>
       </w:r>
-      <w:bookmarkEnd w:id="84"/>
-      <w:bookmarkEnd w:id="85"/>
+      <w:bookmarkEnd w:id="87"/>
+      <w:bookmarkEnd w:id="88"/>
     </w:p>
     <w:p>
       <w:r>
@@ -28418,7 +28924,7 @@
       <w:r>
         <w:t xml:space="preserve">From: </w:t>
       </w:r>
-      <w:hyperlink r:id="rId28" w:history="1">
+      <w:hyperlink r:id="rId30" w:history="1">
         <w:r>
           <w:rPr>
             <w:rStyle w:val="Hyperlink"/>
@@ -28875,14 +29381,14 @@
           <w:numId w:val="4"/>
         </w:numPr>
       </w:pPr>
-      <w:bookmarkStart w:id="86" w:name="_Toc230658096"/>
-      <w:bookmarkStart w:id="87" w:name="_Toc236385984"/>
+      <w:bookmarkStart w:id="89" w:name="_Toc230658096"/>
+      <w:bookmarkStart w:id="90" w:name="_Toc237911241"/>
       <w:r>
         <w:lastRenderedPageBreak/>
         <w:t>Mode S Beast</w:t>
       </w:r>
-      <w:bookmarkEnd w:id="86"/>
-      <w:bookmarkEnd w:id="87"/>
+      <w:bookmarkEnd w:id="89"/>
+      <w:bookmarkEnd w:id="90"/>
     </w:p>
     <w:p>
       <w:r>
@@ -28902,13 +29408,13 @@
           <w:numId w:val="4"/>
         </w:numPr>
       </w:pPr>
-      <w:bookmarkStart w:id="88" w:name="_Toc230658097"/>
-      <w:bookmarkStart w:id="89" w:name="_Toc236385985"/>
+      <w:bookmarkStart w:id="91" w:name="_Toc230658097"/>
+      <w:bookmarkStart w:id="92" w:name="_Toc237911242"/>
       <w:r>
         <w:t>Beast: Mode S Frames</w:t>
       </w:r>
-      <w:bookmarkEnd w:id="88"/>
-      <w:bookmarkEnd w:id="89"/>
+      <w:bookmarkEnd w:id="91"/>
+      <w:bookmarkEnd w:id="92"/>
     </w:p>
     <w:tbl>
       <w:tblPr>
@@ -29299,16 +29805,16 @@
           <w:numId w:val="4"/>
         </w:numPr>
       </w:pPr>
-      <w:bookmarkStart w:id="90" w:name="_Toc230658098"/>
-      <w:bookmarkStart w:id="91" w:name="_Toc236385986"/>
+      <w:bookmarkStart w:id="93" w:name="_Toc230658098"/>
+      <w:bookmarkStart w:id="94" w:name="_Toc237911243"/>
       <w:r>
         <w:t xml:space="preserve">Beast: UAT </w:t>
       </w:r>
       <w:r>
         <w:t>Frames</w:t>
       </w:r>
-      <w:bookmarkEnd w:id="90"/>
-      <w:bookmarkEnd w:id="91"/>
+      <w:bookmarkEnd w:id="93"/>
+      <w:bookmarkEnd w:id="94"/>
     </w:p>
     <w:tbl>
       <w:tblPr>
@@ -29796,14 +30302,14 @@
           <w:numId w:val="4"/>
         </w:numPr>
       </w:pPr>
-      <w:bookmarkStart w:id="92" w:name="_Toc230658099"/>
-      <w:bookmarkStart w:id="93" w:name="_Toc236385987"/>
+      <w:bookmarkStart w:id="95" w:name="_Toc230658099"/>
+      <w:bookmarkStart w:id="96" w:name="_Toc237911244"/>
       <w:r>
         <w:lastRenderedPageBreak/>
         <w:t>Raw Packets</w:t>
       </w:r>
-      <w:bookmarkEnd w:id="92"/>
-      <w:bookmarkEnd w:id="93"/>
+      <w:bookmarkEnd w:id="95"/>
+      <w:bookmarkEnd w:id="96"/>
     </w:p>
     <w:p>
       <w:pPr>
@@ -29813,16 +30319,16 @@
           <w:numId w:val="4"/>
         </w:numPr>
       </w:pPr>
-      <w:bookmarkStart w:id="94" w:name="_Toc230658100"/>
-      <w:bookmarkStart w:id="95" w:name="_Toc236385988"/>
+      <w:bookmarkStart w:id="97" w:name="_Toc230658100"/>
+      <w:bookmarkStart w:id="98" w:name="_Toc237911245"/>
       <w:r>
         <w:t xml:space="preserve">Raw </w:t>
       </w:r>
       <w:r>
         <w:t>Mode S Frames</w:t>
       </w:r>
-      <w:bookmarkEnd w:id="94"/>
-      <w:bookmarkEnd w:id="95"/>
+      <w:bookmarkEnd w:id="97"/>
+      <w:bookmarkEnd w:id="98"/>
     </w:p>
     <w:p>
       <w:r>
@@ -30505,8 +31011,8 @@
           <w:numId w:val="4"/>
         </w:numPr>
       </w:pPr>
-      <w:bookmarkStart w:id="96" w:name="_Toc230658101"/>
-      <w:bookmarkStart w:id="97" w:name="_Toc236385989"/>
+      <w:bookmarkStart w:id="99" w:name="_Toc230658101"/>
+      <w:bookmarkStart w:id="100" w:name="_Toc237911246"/>
       <w:r>
         <w:t>Raw</w:t>
       </w:r>
@@ -30519,8 +31025,8 @@
       <w:r>
         <w:t xml:space="preserve"> Frames</w:t>
       </w:r>
-      <w:bookmarkEnd w:id="96"/>
-      <w:bookmarkEnd w:id="97"/>
+      <w:bookmarkEnd w:id="99"/>
+      <w:bookmarkEnd w:id="100"/>
     </w:p>
     <w:p>
       <w:r>
@@ -31123,7 +31629,7 @@
           <w:docGrid w:linePitch="360"/>
         </w:sectPr>
       </w:pPr>
-      <w:bookmarkStart w:id="98" w:name="_Toc230658102"/>
+      <w:bookmarkStart w:id="101" w:name="_Toc230658102"/>
     </w:p>
     <w:p>
       <w:pPr>
@@ -31133,13 +31639,13 @@
           <w:numId w:val="4"/>
         </w:numPr>
       </w:pPr>
-      <w:bookmarkStart w:id="99" w:name="_Toc236385990"/>
+      <w:bookmarkStart w:id="102" w:name="_Toc237911247"/>
       <w:r>
         <w:lastRenderedPageBreak/>
         <w:t>Raw UAT Uplink Frames</w:t>
       </w:r>
-      <w:bookmarkEnd w:id="98"/>
-      <w:bookmarkEnd w:id="99"/>
+      <w:bookmarkEnd w:id="101"/>
+      <w:bookmarkEnd w:id="102"/>
     </w:p>
     <w:p>
       <w:r>
@@ -31706,7 +32212,7 @@
           <w:docGrid w:linePitch="360"/>
         </w:sectPr>
       </w:pPr>
-      <w:bookmarkStart w:id="100" w:name="_Toc230658103"/>
+      <w:bookmarkStart w:id="103" w:name="_Toc230658103"/>
     </w:p>
     <w:p>
       <w:pPr>
@@ -31716,13 +32222,13 @@
           <w:numId w:val="4"/>
         </w:numPr>
       </w:pPr>
-      <w:bookmarkStart w:id="101" w:name="_Toc236385991"/>
+      <w:bookmarkStart w:id="104" w:name="_Toc237911248"/>
       <w:r>
         <w:lastRenderedPageBreak/>
         <w:t>Aircraft JSON</w:t>
       </w:r>
-      <w:bookmarkEnd w:id="100"/>
-      <w:bookmarkEnd w:id="101"/>
+      <w:bookmarkEnd w:id="103"/>
+      <w:bookmarkEnd w:id="104"/>
     </w:p>
     <w:p>
       <w:r>
@@ -31733,7 +32239,7 @@
       <w:r>
         <w:t>The ADSBee Aircraft JSON format is intended to be compatible with the JSON format emitted by readsb (</w:t>
       </w:r>
-      <w:hyperlink r:id="rId29" w:history="1">
+      <w:hyperlink r:id="rId31" w:history="1">
         <w:r>
           <w:rPr>
             <w:rStyle w:val="Hyperlink"/>
@@ -31753,13 +32259,13 @@
           <w:numId w:val="4"/>
         </w:numPr>
       </w:pPr>
-      <w:bookmarkStart w:id="102" w:name="_Toc230658104"/>
-      <w:bookmarkStart w:id="103" w:name="_Toc236385992"/>
+      <w:bookmarkStart w:id="105" w:name="_Toc230658104"/>
+      <w:bookmarkStart w:id="106" w:name="_Toc237911249"/>
       <w:r>
         <w:t>Message Format</w:t>
       </w:r>
-      <w:bookmarkEnd w:id="102"/>
-      <w:bookmarkEnd w:id="103"/>
+      <w:bookmarkEnd w:id="105"/>
+      <w:bookmarkEnd w:id="106"/>
     </w:p>
     <w:p>
       <w:r>
@@ -31801,7 +32307,7 @@
           <w:docGrid w:linePitch="360"/>
         </w:sectPr>
       </w:pPr>
-      <w:bookmarkStart w:id="104" w:name="_Toc230658105"/>
+      <w:bookmarkStart w:id="107" w:name="_Toc230658105"/>
     </w:p>
     <w:p>
       <w:pPr>
@@ -31811,13 +32317,13 @@
           <w:numId w:val="4"/>
         </w:numPr>
       </w:pPr>
-      <w:bookmarkStart w:id="105" w:name="_Toc236385993"/>
+      <w:bookmarkStart w:id="108" w:name="_Toc237911250"/>
       <w:r>
         <w:lastRenderedPageBreak/>
         <w:t>JSON Fields</w:t>
       </w:r>
-      <w:bookmarkEnd w:id="104"/>
-      <w:bookmarkEnd w:id="105"/>
+      <w:bookmarkEnd w:id="107"/>
+      <w:bookmarkEnd w:id="108"/>
     </w:p>
     <w:tbl>
       <w:tblPr>
@@ -35613,7 +36119,7 @@
 </file>
 
 <file path=word/endnotes.xml><?xml version="1.0" encoding="utf-8"?>
-<w:endnotes xmlns:wpc="http://schemas.microsoft.com/office/word/2010/wordprocessingCanvas" xmlns:cx="http://schemas.microsoft.com/office/drawing/2014/chartex" xmlns:cx1="http://schemas.microsoft.com/office/drawing/2015/9/8/chartex" xmlns:cx2="http://schemas.microsoft.com/office/drawing/2015/10/21/chartex" xmlns:cx3="http://schemas.microsoft.com/office/drawing/2016/5/9/chartex" xmlns:cx4="http://schemas.microsoft.com/office/drawing/2016/5/10/chartex" xmlns:cx5="http://schemas.microsoft.com/office/drawing/2016/5/11/chartex" xmlns:cx6="http://schemas.microsoft.com/office/drawing/2016/5/12/chartex" xmlns:cx7="http://schemas.microsoft.com/office/drawing/2016/5/13/chartex" xmlns:cx8="http://schemas.microsoft.com/office/drawing/2016/5/14/chartex" xmlns:mc="http://schemas.openxmlformats.org/markup-compatibility/2006" xmlns:m="http://schemas.openxmlformats.org/officeDocument/2006/math" xmlns:aink="http://schemas.microsoft.com/office/drawing/2016/ink" xmlns:am3d="http://schemas.microsoft.com/office/drawing/2017/model3d" xmlns:oel="http://schemas.microsoft.com/office/2019/extlst" xmlns:r="http://schemas.openxmlformats.org/officeDocument/2006/relationships" xmlns:wp14="http://schemas.microsoft.com/office/word/2010/wordprocessingDrawing" xmlns:wp="http://schemas.openxmlformats.org/drawingml/2006/wordprocessingDrawing" xmlns:wpg="http://schemas.microsoft.com/office/word/2010/wordprocessingGroup" xmlns:wpi="http://schemas.microsoft.com/office/word/2010/wordprocessingInk" xmlns:wps="http://schemas.microsoft.com/office/word/2010/wordprocessingShape" xmlns:o="urn:schemas-microsoft-com:office:office" xmlns:v="urn:schemas-microsoft-com:vml" xmlns:w10="urn:schemas-microsoft-com:office:word" xmlns:w="http://schemas.openxmlformats.org/wordprocessingml/2006/main" xmlns:w14="http://schemas.microsoft.com/office/word/2010/wordml" xmlns:w15="http://schemas.microsoft.com/office/word/2012/wordml" xmlns:w16cei="http://schemas.microsoft.com/office/word/2026/wordml/cei" xmlns:w16cex="http://schemas.microsoft.com/office/word/2018/wordml/cex" xmlns:w16cid="http://schemas.microsoft.com/office/word/2016/wordml/cid" xmlns:w16="http://schemas.microsoft.com/office/word/2018/wordml" xmlns:w16sdtdh="http://schemas.microsoft.com/office/word/2020/wordml/sdtdatahash" xmlns:w16sdtfl="http://schemas.microsoft.com/office/word/2024/wordml/sdtformatlock" xmlns:w16se="http://schemas.microsoft.com/office/word/2015/wordml/symex" xmlns:w16du="http://schemas.microsoft.com/office/word/2023/wordml/word16du" xmlns:wne="http://schemas.microsoft.com/office/word/2006/wordml" mc:Ignorable="w14 w15 w16se w16cid w16 w16cex w16sdtdh w16sdtfl w16du wp14">
+<w:endnotes xmlns:wpc="http://schemas.microsoft.com/office/word/2010/wordprocessingCanvas" xmlns:cx="http://schemas.microsoft.com/office/drawing/2014/chartex" xmlns:cx1="http://schemas.microsoft.com/office/drawing/2015/9/8/chartex" xmlns:cx2="http://schemas.microsoft.com/office/drawing/2015/10/21/chartex" xmlns:cx3="http://schemas.microsoft.com/office/drawing/2016/5/9/chartex" xmlns:cx4="http://schemas.microsoft.com/office/drawing/2016/5/10/chartex" xmlns:cx5="http://schemas.microsoft.com/office/drawing/2016/5/11/chartex" xmlns:cx6="http://schemas.microsoft.com/office/drawing/2016/5/12/chartex" xmlns:cx7="http://schemas.microsoft.com/office/drawing/2016/5/13/chartex" xmlns:cx8="http://schemas.microsoft.com/office/drawing/2016/5/14/chartex" xmlns:mc="http://schemas.openxmlformats.org/markup-compatibility/2006" xmlns:m="http://schemas.openxmlformats.org/officeDocument/2006/math" xmlns:aink="http://schemas.microsoft.com/office/drawing/2016/ink" xmlns:am3d="http://schemas.microsoft.com/office/drawing/2017/model3d" xmlns:oel="http://schemas.microsoft.com/office/2019/extlst" xmlns:r="http://schemas.openxmlformats.org/officeDocument/2006/relationships" xmlns:wp14="http://schemas.microsoft.com/office/word/2010/wordprocessingDrawing" xmlns:wp="http://schemas.openxmlformats.org/drawingml/2006/wordprocessingDrawing" xmlns:wpg="http://schemas.microsoft.com/office/word/2010/wordprocessingGroup" xmlns:wpi="http://schemas.microsoft.com/office/word/2010/wordprocessingInk" xmlns:wps="http://schemas.microsoft.com/office/word/2010/wordprocessingShape" xmlns:o="urn:schemas-microsoft-com:office:office" xmlns:v="urn:schemas-microsoft-com:vml" xmlns:w10="urn:schemas-microsoft-com:office:word" xmlns:w="http://schemas.openxmlformats.org/wordprocessingml/2006/main" xmlns:w14="http://schemas.microsoft.com/office/word/2010/wordml" xmlns:w15="http://schemas.microsoft.com/office/word/2012/wordml" xmlns:w16cex="http://schemas.microsoft.com/office/word/2018/wordml/cex" xmlns:w16cid="http://schemas.microsoft.com/office/word/2016/wordml/cid" xmlns:w16="http://schemas.microsoft.com/office/word/2018/wordml" xmlns:w16sdtdh="http://schemas.microsoft.com/office/word/2020/wordml/sdtdatahash" xmlns:w16sdtfl="http://schemas.microsoft.com/office/word/2024/wordml/sdtformatlock" xmlns:w16se="http://schemas.microsoft.com/office/word/2015/wordml/symex" xmlns:w16du="http://schemas.microsoft.com/office/word/2023/wordml/word16du" xmlns:wne="http://schemas.microsoft.com/office/word/2006/wordml" mc:Ignorable="w14 w15 w16se w16cid w16 w16cex w16sdtdh w16sdtfl w16du wp14">
   <w:endnote w:type="separator" w:id="-1">
     <w:p>
       <w:pPr>
@@ -35638,7 +36144,17 @@
 </file>
 
 <file path=word/footer1.xml><?xml version="1.0" encoding="utf-8"?>
-<w:ftr xmlns:wpc="http://schemas.microsoft.com/office/word/2010/wordprocessingCanvas" xmlns:cx="http://schemas.microsoft.com/office/drawing/2014/chartex" xmlns:cx1="http://schemas.microsoft.com/office/drawing/2015/9/8/chartex" xmlns:cx2="http://schemas.microsoft.com/office/drawing/2015/10/21/chartex" xmlns:cx3="http://schemas.microsoft.com/office/drawing/2016/5/9/chartex" xmlns:cx4="http://schemas.microsoft.com/office/drawing/2016/5/10/chartex" xmlns:cx5="http://schemas.microsoft.com/office/drawing/2016/5/11/chartex" xmlns:cx6="http://schemas.microsoft.com/office/drawing/2016/5/12/chartex" xmlns:cx7="http://schemas.microsoft.com/office/drawing/2016/5/13/chartex" xmlns:cx8="http://schemas.microsoft.com/office/drawing/2016/5/14/chartex" xmlns:mc="http://schemas.openxmlformats.org/markup-compatibility/2006" xmlns:m="http://schemas.openxmlformats.org/officeDocument/2006/math" xmlns:aink="http://schemas.microsoft.com/office/drawing/2016/ink" xmlns:am3d="http://schemas.microsoft.com/office/drawing/2017/model3d" xmlns:oel="http://schemas.microsoft.com/office/2019/extlst" xmlns:r="http://schemas.openxmlformats.org/officeDocument/2006/relationships" xmlns:wp14="http://schemas.microsoft.com/office/word/2010/wordprocessingDrawing" xmlns:wp="http://schemas.openxmlformats.org/drawingml/2006/wordprocessingDrawing" xmlns:wpg="http://schemas.microsoft.com/office/word/2010/wordprocessingGroup" xmlns:wpi="http://schemas.microsoft.com/office/word/2010/wordprocessingInk" xmlns:wps="http://schemas.microsoft.com/office/word/2010/wordprocessingShape" xmlns:o="urn:schemas-microsoft-com:office:office" xmlns:v="urn:schemas-microsoft-com:vml" xmlns:w10="urn:schemas-microsoft-com:office:word" xmlns:w="http://schemas.openxmlformats.org/wordprocessingml/2006/main" xmlns:w14="http://schemas.microsoft.com/office/word/2010/wordml" xmlns:w15="http://schemas.microsoft.com/office/word/2012/wordml" xmlns:w16cei="http://schemas.microsoft.com/office/word/2026/wordml/cei" xmlns:w16cex="http://schemas.microsoft.com/office/word/2018/wordml/cex" xmlns:w16cid="http://schemas.microsoft.com/office/word/2016/wordml/cid" xmlns:w16="http://schemas.microsoft.com/office/word/2018/wordml" xmlns:w16sdtdh="http://schemas.microsoft.com/office/word/2020/wordml/sdtdatahash" xmlns:w16sdtfl="http://schemas.microsoft.com/office/word/2024/wordml/sdtformatlock" xmlns:w16se="http://schemas.microsoft.com/office/word/2015/wordml/symex" xmlns:w16du="http://schemas.microsoft.com/office/word/2023/wordml/word16du" xmlns:wne="http://schemas.microsoft.com/office/word/2006/wordml" mc:Ignorable="w14 w15 w16se w16cid w16 w16cex w16sdtdh w16sdtfl w16du wp14">
+<w:ftr xmlns:wpc="http://schemas.microsoft.com/office/word/2010/wordprocessingCanvas" xmlns:cx="http://schemas.microsoft.com/office/drawing/2014/chartex" xmlns:cx1="http://schemas.microsoft.com/office/drawing/2015/9/8/chartex" xmlns:cx2="http://schemas.microsoft.com/office/drawing/2015/10/21/chartex" xmlns:cx3="http://schemas.microsoft.com/office/drawing/2016/5/9/chartex" xmlns:cx4="http://schemas.microsoft.com/office/drawing/2016/5/10/chartex" xmlns:cx5="http://schemas.microsoft.com/office/drawing/2016/5/11/chartex" xmlns:cx6="http://schemas.microsoft.com/office/drawing/2016/5/12/chartex" xmlns:cx7="http://schemas.microsoft.com/office/drawing/2016/5/13/chartex" xmlns:cx8="http://schemas.microsoft.com/office/drawing/2016/5/14/chartex" xmlns:mc="http://schemas.openxmlformats.org/markup-compatibility/2006" xmlns:m="http://schemas.openxmlformats.org/officeDocument/2006/math" xmlns:aink="http://schemas.microsoft.com/office/drawing/2016/ink" xmlns:am3d="http://schemas.microsoft.com/office/drawing/2017/model3d" xmlns:oel="http://schemas.microsoft.com/office/2019/extlst" xmlns:r="http://schemas.openxmlformats.org/officeDocument/2006/relationships" xmlns:wp14="http://schemas.microsoft.com/office/word/2010/wordprocessingDrawing" xmlns:wp="http://schemas.openxmlformats.org/drawingml/2006/wordprocessingDrawing" xmlns:wpg="http://schemas.microsoft.com/office/word/2010/wordprocessingGroup" xmlns:wpi="http://schemas.microsoft.com/office/word/2010/wordprocessingInk" xmlns:wps="http://schemas.microsoft.com/office/word/2010/wordprocessingShape" xmlns:o="urn:schemas-microsoft-com:office:office" xmlns:v="urn:schemas-microsoft-com:vml" xmlns:w10="urn:schemas-microsoft-com:office:word" xmlns:w="http://schemas.openxmlformats.org/wordprocessingml/2006/main" xmlns:w14="http://schemas.microsoft.com/office/word/2010/wordml" xmlns:w15="http://schemas.microsoft.com/office/word/2012/wordml" xmlns:w16cex="http://schemas.microsoft.com/office/word/2018/wordml/cex" xmlns:w16cid="http://schemas.microsoft.com/office/word/2016/wordml/cid" xmlns:w16="http://schemas.microsoft.com/office/word/2018/wordml" xmlns:w16sdtdh="http://schemas.microsoft.com/office/word/2020/wordml/sdtdatahash" xmlns:w16sdtfl="http://schemas.microsoft.com/office/word/2024/wordml/sdtformatlock" xmlns:w16se="http://schemas.microsoft.com/office/word/2015/wordml/symex" xmlns:w16du="http://schemas.microsoft.com/office/word/2023/wordml/word16du" xmlns:wne="http://schemas.microsoft.com/office/word/2006/wordml" mc:Ignorable="w14 w15 w16se w16cid w16 w16cex w16sdtdh w16sdtfl w16du wp14">
+  <w:p>
+    <w:pPr>
+      <w:pStyle w:val="Footer"/>
+    </w:pPr>
+  </w:p>
+</w:ftr>
+</file>
+
+<file path=word/footer2.xml><?xml version="1.0" encoding="utf-8"?>
+<w:ftr xmlns:wpc="http://schemas.microsoft.com/office/word/2010/wordprocessingCanvas" xmlns:cx="http://schemas.microsoft.com/office/drawing/2014/chartex" xmlns:cx1="http://schemas.microsoft.com/office/drawing/2015/9/8/chartex" xmlns:cx2="http://schemas.microsoft.com/office/drawing/2015/10/21/chartex" xmlns:cx3="http://schemas.microsoft.com/office/drawing/2016/5/9/chartex" xmlns:cx4="http://schemas.microsoft.com/office/drawing/2016/5/10/chartex" xmlns:cx5="http://schemas.microsoft.com/office/drawing/2016/5/11/chartex" xmlns:cx6="http://schemas.microsoft.com/office/drawing/2016/5/12/chartex" xmlns:cx7="http://schemas.microsoft.com/office/drawing/2016/5/13/chartex" xmlns:cx8="http://schemas.microsoft.com/office/drawing/2016/5/14/chartex" xmlns:mc="http://schemas.openxmlformats.org/markup-compatibility/2006" xmlns:m="http://schemas.openxmlformats.org/officeDocument/2006/math" xmlns:aink="http://schemas.microsoft.com/office/drawing/2016/ink" xmlns:am3d="http://schemas.microsoft.com/office/drawing/2017/model3d" xmlns:oel="http://schemas.microsoft.com/office/2019/extlst" xmlns:r="http://schemas.openxmlformats.org/officeDocument/2006/relationships" xmlns:wp14="http://schemas.microsoft.com/office/word/2010/wordprocessingDrawing" xmlns:wp="http://schemas.openxmlformats.org/drawingml/2006/wordprocessingDrawing" xmlns:wpg="http://schemas.microsoft.com/office/word/2010/wordprocessingGroup" xmlns:wpi="http://schemas.microsoft.com/office/word/2010/wordprocessingInk" xmlns:wps="http://schemas.microsoft.com/office/word/2010/wordprocessingShape" xmlns:o="urn:schemas-microsoft-com:office:office" xmlns:v="urn:schemas-microsoft-com:vml" xmlns:w10="urn:schemas-microsoft-com:office:word" xmlns:w="http://schemas.openxmlformats.org/wordprocessingml/2006/main" xmlns:w14="http://schemas.microsoft.com/office/word/2010/wordml" xmlns:w15="http://schemas.microsoft.com/office/word/2012/wordml" xmlns:w16cex="http://schemas.microsoft.com/office/word/2018/wordml/cex" xmlns:w16cid="http://schemas.microsoft.com/office/word/2016/wordml/cid" xmlns:w16="http://schemas.microsoft.com/office/word/2018/wordml" xmlns:w16sdtdh="http://schemas.microsoft.com/office/word/2020/wordml/sdtdatahash" xmlns:w16sdtfl="http://schemas.microsoft.com/office/word/2024/wordml/sdtformatlock" xmlns:w16se="http://schemas.microsoft.com/office/word/2015/wordml/symex" xmlns:w16du="http://schemas.microsoft.com/office/word/2023/wordml/word16du" xmlns:wne="http://schemas.microsoft.com/office/word/2006/wordml" mc:Ignorable="w14 w15 w16se w16cid w16 w16cex w16sdtdh w16sdtfl w16du wp14">
   <w:p>
     <w:pPr>
       <w:pStyle w:val="NoSpacing"/>
@@ -35656,8 +36172,8 @@
         <w:noProof/>
         <w:color w:val="FFFFFF" w:themeColor="background1"/>
       </w:rPr>
-      <w:pict w14:anchorId="5F2B3C50">
-        <v:rect id="_x0000_s1026" alt="" style="position:absolute;left:0;text-align:left;margin-left:-82.1pt;margin-top:.05pt;width:664.9pt;height:84.5pt;z-index:-251657728;mso-wrap-edited:f;mso-width-percent:0;mso-height-percent:0;mso-width-percent:0;mso-height-percent:0" fillcolor="#00ad4d" stroked="f"/>
+      <w:pict w14:anchorId="4830D1EC">
+        <v:rect id="_x0000_s1025" alt="" style="position:absolute;left:0;text-align:left;margin-left:-82.1pt;margin-top:.05pt;width:664.9pt;height:84.5pt;z-index:-251657728;mso-wrap-edited:f;mso-width-percent:0;mso-height-percent:0;mso-width-percent:0;mso-height-percent:0" fillcolor="#00ad4d" stroked="f"/>
       </w:pict>
     </w:r>
     <w:r>
@@ -35847,7 +36363,7 @@
       <w:rPr>
         <w:color w:val="FFFFFF" w:themeColor="background1"/>
       </w:rPr>
-      <w:t>729</w:t>
+      <w:t>818</w:t>
     </w:r>
     <w:r>
       <w:rPr>
@@ -35860,14 +36376,30 @@
       <w:rPr>
         <w:color w:val="FFFFFF" w:themeColor="background1"/>
       </w:rPr>
-      <w:t>3.5</w:t>
+      <w:t>3.</w:t>
+    </w:r>
+    <w:r>
+      <w:rPr>
+        <w:color w:val="FFFFFF" w:themeColor="background1"/>
+      </w:rPr>
+      <w:t>8</w:t>
     </w:r>
   </w:p>
 </w:ftr>
 </file>
 
+<file path=word/footer3.xml><?xml version="1.0" encoding="utf-8"?>
+<w:ftr xmlns:wpc="http://schemas.microsoft.com/office/word/2010/wordprocessingCanvas" xmlns:cx="http://schemas.microsoft.com/office/drawing/2014/chartex" xmlns:cx1="http://schemas.microsoft.com/office/drawing/2015/9/8/chartex" xmlns:cx2="http://schemas.microsoft.com/office/drawing/2015/10/21/chartex" xmlns:cx3="http://schemas.microsoft.com/office/drawing/2016/5/9/chartex" xmlns:cx4="http://schemas.microsoft.com/office/drawing/2016/5/10/chartex" xmlns:cx5="http://schemas.microsoft.com/office/drawing/2016/5/11/chartex" xmlns:cx6="http://schemas.microsoft.com/office/drawing/2016/5/12/chartex" xmlns:cx7="http://schemas.microsoft.com/office/drawing/2016/5/13/chartex" xmlns:cx8="http://schemas.microsoft.com/office/drawing/2016/5/14/chartex" xmlns:mc="http://schemas.openxmlformats.org/markup-compatibility/2006" xmlns:m="http://schemas.openxmlformats.org/officeDocument/2006/math" xmlns:aink="http://schemas.microsoft.com/office/drawing/2016/ink" xmlns:am3d="http://schemas.microsoft.com/office/drawing/2017/model3d" xmlns:oel="http://schemas.microsoft.com/office/2019/extlst" xmlns:r="http://schemas.openxmlformats.org/officeDocument/2006/relationships" xmlns:wp14="http://schemas.microsoft.com/office/word/2010/wordprocessingDrawing" xmlns:wp="http://schemas.openxmlformats.org/drawingml/2006/wordprocessingDrawing" xmlns:wpg="http://schemas.microsoft.com/office/word/2010/wordprocessingGroup" xmlns:wpi="http://schemas.microsoft.com/office/word/2010/wordprocessingInk" xmlns:wps="http://schemas.microsoft.com/office/word/2010/wordprocessingShape" xmlns:o="urn:schemas-microsoft-com:office:office" xmlns:v="urn:schemas-microsoft-com:vml" xmlns:w10="urn:schemas-microsoft-com:office:word" xmlns:w="http://schemas.openxmlformats.org/wordprocessingml/2006/main" xmlns:w14="http://schemas.microsoft.com/office/word/2010/wordml" xmlns:w15="http://schemas.microsoft.com/office/word/2012/wordml" xmlns:w16cex="http://schemas.microsoft.com/office/word/2018/wordml/cex" xmlns:w16cid="http://schemas.microsoft.com/office/word/2016/wordml/cid" xmlns:w16="http://schemas.microsoft.com/office/word/2018/wordml" xmlns:w16sdtdh="http://schemas.microsoft.com/office/word/2020/wordml/sdtdatahash" xmlns:w16sdtfl="http://schemas.microsoft.com/office/word/2024/wordml/sdtformatlock" xmlns:w16se="http://schemas.microsoft.com/office/word/2015/wordml/symex" xmlns:w16du="http://schemas.microsoft.com/office/word/2023/wordml/word16du" xmlns:wne="http://schemas.microsoft.com/office/word/2006/wordml" mc:Ignorable="w14 w15 w16se w16cid w16 w16cex w16sdtdh w16sdtfl w16du wp14">
+  <w:p>
+    <w:pPr>
+      <w:pStyle w:val="Footer"/>
+    </w:pPr>
+  </w:p>
+</w:ftr>
+</file>
+
 <file path=word/footnotes.xml><?xml version="1.0" encoding="utf-8"?>
-<w:footnotes xmlns:wpc="http://schemas.microsoft.com/office/word/2010/wordprocessingCanvas" xmlns:cx="http://schemas.microsoft.com/office/drawing/2014/chartex" xmlns:cx1="http://schemas.microsoft.com/office/drawing/2015/9/8/chartex" xmlns:cx2="http://schemas.microsoft.com/office/drawing/2015/10/21/chartex" xmlns:cx3="http://schemas.microsoft.com/office/drawing/2016/5/9/chartex" xmlns:cx4="http://schemas.microsoft.com/office/drawing/2016/5/10/chartex" xmlns:cx5="http://schemas.microsoft.com/office/drawing/2016/5/11/chartex" xmlns:cx6="http://schemas.microsoft.com/office/drawing/2016/5/12/chartex" xmlns:cx7="http://schemas.microsoft.com/office/drawing/2016/5/13/chartex" xmlns:cx8="http://schemas.microsoft.com/office/drawing/2016/5/14/chartex" xmlns:mc="http://schemas.openxmlformats.org/markup-compatibility/2006" xmlns:m="http://schemas.openxmlformats.org/officeDocument/2006/math" xmlns:aink="http://schemas.microsoft.com/office/drawing/2016/ink" xmlns:am3d="http://schemas.microsoft.com/office/drawing/2017/model3d" xmlns:oel="http://schemas.microsoft.com/office/2019/extlst" xmlns:r="http://schemas.openxmlformats.org/officeDocument/2006/relationships" xmlns:wp14="http://schemas.microsoft.com/office/word/2010/wordprocessingDrawing" xmlns:wp="http://schemas.openxmlformats.org/drawingml/2006/wordprocessingDrawing" xmlns:wpg="http://schemas.microsoft.com/office/word/2010/wordprocessingGroup" xmlns:wpi="http://schemas.microsoft.com/office/word/2010/wordprocessingInk" xmlns:wps="http://schemas.microsoft.com/office/word/2010/wordprocessingShape" xmlns:o="urn:schemas-microsoft-com:office:office" xmlns:v="urn:schemas-microsoft-com:vml" xmlns:w10="urn:schemas-microsoft-com:office:word" xmlns:w="http://schemas.openxmlformats.org/wordprocessingml/2006/main" xmlns:w14="http://schemas.microsoft.com/office/word/2010/wordml" xmlns:w15="http://schemas.microsoft.com/office/word/2012/wordml" xmlns:w16cei="http://schemas.microsoft.com/office/word/2026/wordml/cei" xmlns:w16cex="http://schemas.microsoft.com/office/word/2018/wordml/cex" xmlns:w16cid="http://schemas.microsoft.com/office/word/2016/wordml/cid" xmlns:w16="http://schemas.microsoft.com/office/word/2018/wordml" xmlns:w16sdtdh="http://schemas.microsoft.com/office/word/2020/wordml/sdtdatahash" xmlns:w16sdtfl="http://schemas.microsoft.com/office/word/2024/wordml/sdtformatlock" xmlns:w16se="http://schemas.microsoft.com/office/word/2015/wordml/symex" xmlns:w16du="http://schemas.microsoft.com/office/word/2023/wordml/word16du" xmlns:wne="http://schemas.microsoft.com/office/word/2006/wordml" mc:Ignorable="w14 w15 w16se w16cid w16 w16cex w16sdtdh w16sdtfl w16du wp14">
+<w:footnotes xmlns:wpc="http://schemas.microsoft.com/office/word/2010/wordprocessingCanvas" xmlns:cx="http://schemas.microsoft.com/office/drawing/2014/chartex" xmlns:cx1="http://schemas.microsoft.com/office/drawing/2015/9/8/chartex" xmlns:cx2="http://schemas.microsoft.com/office/drawing/2015/10/21/chartex" xmlns:cx3="http://schemas.microsoft.com/office/drawing/2016/5/9/chartex" xmlns:cx4="http://schemas.microsoft.com/office/drawing/2016/5/10/chartex" xmlns:cx5="http://schemas.microsoft.com/office/drawing/2016/5/11/chartex" xmlns:cx6="http://schemas.microsoft.com/office/drawing/2016/5/12/chartex" xmlns:cx7="http://schemas.microsoft.com/office/drawing/2016/5/13/chartex" xmlns:cx8="http://schemas.microsoft.com/office/drawing/2016/5/14/chartex" xmlns:mc="http://schemas.openxmlformats.org/markup-compatibility/2006" xmlns:m="http://schemas.openxmlformats.org/officeDocument/2006/math" xmlns:aink="http://schemas.microsoft.com/office/drawing/2016/ink" xmlns:am3d="http://schemas.microsoft.com/office/drawing/2017/model3d" xmlns:oel="http://schemas.microsoft.com/office/2019/extlst" xmlns:r="http://schemas.openxmlformats.org/officeDocument/2006/relationships" xmlns:wp14="http://schemas.microsoft.com/office/word/2010/wordprocessingDrawing" xmlns:wp="http://schemas.openxmlformats.org/drawingml/2006/wordprocessingDrawing" xmlns:wpg="http://schemas.microsoft.com/office/word/2010/wordprocessingGroup" xmlns:wpi="http://schemas.microsoft.com/office/word/2010/wordprocessingInk" xmlns:wps="http://schemas.microsoft.com/office/word/2010/wordprocessingShape" xmlns:o="urn:schemas-microsoft-com:office:office" xmlns:v="urn:schemas-microsoft-com:vml" xmlns:w10="urn:schemas-microsoft-com:office:word" xmlns:w="http://schemas.openxmlformats.org/wordprocessingml/2006/main" xmlns:w14="http://schemas.microsoft.com/office/word/2010/wordml" xmlns:w15="http://schemas.microsoft.com/office/word/2012/wordml" xmlns:w16cex="http://schemas.microsoft.com/office/word/2018/wordml/cex" xmlns:w16cid="http://schemas.microsoft.com/office/word/2016/wordml/cid" xmlns:w16="http://schemas.microsoft.com/office/word/2018/wordml" xmlns:w16sdtdh="http://schemas.microsoft.com/office/word/2020/wordml/sdtdatahash" xmlns:w16sdtfl="http://schemas.microsoft.com/office/word/2024/wordml/sdtformatlock" xmlns:w16se="http://schemas.microsoft.com/office/word/2015/wordml/symex" xmlns:w16du="http://schemas.microsoft.com/office/word/2023/wordml/word16du" xmlns:wne="http://schemas.microsoft.com/office/word/2006/wordml" mc:Ignorable="w14 w15 w16se w16cid w16 w16cex w16sdtdh w16sdtfl w16du wp14">
   <w:footnote w:type="separator" w:id="-1">
     <w:p>
       <w:pPr>
@@ -35892,91 +36424,21 @@
 </file>
 
 <file path=word/header1.xml><?xml version="1.0" encoding="utf-8"?>
-<w:hdr xmlns:wpc="http://schemas.microsoft.com/office/word/2010/wordprocessingCanvas" xmlns:cx="http://schemas.microsoft.com/office/drawing/2014/chartex" xmlns:cx1="http://schemas.microsoft.com/office/drawing/2015/9/8/chartex" xmlns:cx2="http://schemas.microsoft.com/office/drawing/2015/10/21/chartex" xmlns:cx3="http://schemas.microsoft.com/office/drawing/2016/5/9/chartex" xmlns:cx4="http://schemas.microsoft.com/office/drawing/2016/5/10/chartex" xmlns:cx5="http://schemas.microsoft.com/office/drawing/2016/5/11/chartex" xmlns:cx6="http://schemas.microsoft.com/office/drawing/2016/5/12/chartex" xmlns:cx7="http://schemas.microsoft.com/office/drawing/2016/5/13/chartex" xmlns:cx8="http://schemas.microsoft.com/office/drawing/2016/5/14/chartex" xmlns:mc="http://schemas.openxmlformats.org/markup-compatibility/2006" xmlns:m="http://schemas.openxmlformats.org/officeDocument/2006/math" xmlns:aink="http://schemas.microsoft.com/office/drawing/2016/ink" xmlns:am3d="http://schemas.microsoft.com/office/drawing/2017/model3d" xmlns:oel="http://schemas.microsoft.com/office/2019/extlst" xmlns:r="http://schemas.openxmlformats.org/officeDocument/2006/relationships" xmlns:wp14="http://schemas.microsoft.com/office/word/2010/wordprocessingDrawing" xmlns:wp="http://schemas.openxmlformats.org/drawingml/2006/wordprocessingDrawing" xmlns:wpg="http://schemas.microsoft.com/office/word/2010/wordprocessingGroup" xmlns:wpi="http://schemas.microsoft.com/office/word/2010/wordprocessingInk" xmlns:wps="http://schemas.microsoft.com/office/word/2010/wordprocessingShape" xmlns:o="urn:schemas-microsoft-com:office:office" xmlns:v="urn:schemas-microsoft-com:vml" xmlns:w10="urn:schemas-microsoft-com:office:word" xmlns:w="http://schemas.openxmlformats.org/wordprocessingml/2006/main" xmlns:w14="http://schemas.microsoft.com/office/word/2010/wordml" xmlns:w15="http://schemas.microsoft.com/office/word/2012/wordml" xmlns:w16cei="http://schemas.microsoft.com/office/word/2026/wordml/cei" xmlns:w16cex="http://schemas.microsoft.com/office/word/2018/wordml/cex" xmlns:w16cid="http://schemas.microsoft.com/office/word/2016/wordml/cid" xmlns:w16="http://schemas.microsoft.com/office/word/2018/wordml" xmlns:w16sdtdh="http://schemas.microsoft.com/office/word/2020/wordml/sdtdatahash" xmlns:w16sdtfl="http://schemas.microsoft.com/office/word/2024/wordml/sdtformatlock" xmlns:w16se="http://schemas.microsoft.com/office/word/2015/wordml/symex" xmlns:w16du="http://schemas.microsoft.com/office/word/2023/wordml/word16du" xmlns:wne="http://schemas.microsoft.com/office/word/2006/wordml" mc:Ignorable="w14 w15 w16se w16cid w16 w16cex w16sdtdh w16sdtfl w16du wp14">
+<w:hdr xmlns:wpc="http://schemas.microsoft.com/office/word/2010/wordprocessingCanvas" xmlns:cx="http://schemas.microsoft.com/office/drawing/2014/chartex" xmlns:cx1="http://schemas.microsoft.com/office/drawing/2015/9/8/chartex" xmlns:cx2="http://schemas.microsoft.com/office/drawing/2015/10/21/chartex" xmlns:cx3="http://schemas.microsoft.com/office/drawing/2016/5/9/chartex" xmlns:cx4="http://schemas.microsoft.com/office/drawing/2016/5/10/chartex" xmlns:cx5="http://schemas.microsoft.com/office/drawing/2016/5/11/chartex" xmlns:cx6="http://schemas.microsoft.com/office/drawing/2016/5/12/chartex" xmlns:cx7="http://schemas.microsoft.com/office/drawing/2016/5/13/chartex" xmlns:cx8="http://schemas.microsoft.com/office/drawing/2016/5/14/chartex" xmlns:mc="http://schemas.openxmlformats.org/markup-compatibility/2006" xmlns:m="http://schemas.openxmlformats.org/officeDocument/2006/math" xmlns:aink="http://schemas.microsoft.com/office/drawing/2016/ink" xmlns:am3d="http://schemas.microsoft.com/office/drawing/2017/model3d" xmlns:oel="http://schemas.microsoft.com/office/2019/extlst" xmlns:r="http://schemas.openxmlformats.org/officeDocument/2006/relationships" xmlns:wp14="http://schemas.microsoft.com/office/word/2010/wordprocessingDrawing" xmlns:wp="http://schemas.openxmlformats.org/drawingml/2006/wordprocessingDrawing" xmlns:wpg="http://schemas.microsoft.com/office/word/2010/wordprocessingGroup" xmlns:wpi="http://schemas.microsoft.com/office/word/2010/wordprocessingInk" xmlns:wps="http://schemas.microsoft.com/office/word/2010/wordprocessingShape" xmlns:o="urn:schemas-microsoft-com:office:office" xmlns:v="urn:schemas-microsoft-com:vml" xmlns:w10="urn:schemas-microsoft-com:office:word" xmlns:w="http://schemas.openxmlformats.org/wordprocessingml/2006/main" xmlns:w14="http://schemas.microsoft.com/office/word/2010/wordml" xmlns:w15="http://schemas.microsoft.com/office/word/2012/wordml" xmlns:w16cex="http://schemas.microsoft.com/office/word/2018/wordml/cex" xmlns:w16cid="http://schemas.microsoft.com/office/word/2016/wordml/cid" xmlns:w16="http://schemas.microsoft.com/office/word/2018/wordml" xmlns:w16sdtdh="http://schemas.microsoft.com/office/word/2020/wordml/sdtdatahash" xmlns:w16sdtfl="http://schemas.microsoft.com/office/word/2024/wordml/sdtformatlock" xmlns:w16se="http://schemas.microsoft.com/office/word/2015/wordml/symex" xmlns:w16du="http://schemas.microsoft.com/office/word/2023/wordml/word16du" xmlns:wne="http://schemas.microsoft.com/office/word/2006/wordml" mc:Ignorable="w14 w15 w16se w16cid w16 w16cex w16sdtdh w16sdtfl w16du wp14">
   <w:p>
     <w:pPr>
       <w:pStyle w:val="Header"/>
     </w:pPr>
-    <w:r>
-      <w:rPr>
-        <w:noProof/>
-      </w:rPr>
-      <w:pict w14:anchorId="7C002D74">
-        <v:shapetype id="_x0000_t136" coordsize="21600,21600" o:spt="136" adj="10800" path="m@7,l@8,m@5,21600l@6,21600e">
-          <v:formulas>
-            <v:f eqn="sum #0 0 10800"/>
-            <v:f eqn="prod #0 2 1"/>
-            <v:f eqn="sum 21600 0 @1"/>
-            <v:f eqn="sum 0 0 @2"/>
-            <v:f eqn="sum 21600 0 @3"/>
-            <v:f eqn="if @0 @3 0"/>
-            <v:f eqn="if @0 21600 @1"/>
-            <v:f eqn="if @0 0 @2"/>
-            <v:f eqn="if @0 @4 21600"/>
-            <v:f eqn="mid @5 @6"/>
-            <v:f eqn="mid @8 @5"/>
-            <v:f eqn="mid @7 @8"/>
-            <v:f eqn="mid @6 @7"/>
-            <v:f eqn="sum @6 0 @5"/>
-          </v:formulas>
-          <v:path textpathok="t" o:connecttype="custom" o:connectlocs="@9,0;@10,10800;@11,21600;@12,10800" o:connectangles="270,180,90,0"/>
-          <v:textpath on="t" fitshape="t"/>
-          <v:handles>
-            <v:h position="#0,bottomRight" xrange="6629,14971"/>
-          </v:handles>
-          <o:lock v:ext="edit" text="t" shapetype="t"/>
-        </v:shapetype>
-        <v:shape id="PowerPlusWaterMarkObject35111193" o:spid="_x0000_s1028" type="#_x0000_t136" alt="" style="position:absolute;margin-left:0;margin-top:0;width:629.8pt;height:131.6pt;rotation:315;z-index:-251644416;mso-wrap-edited:f;mso-width-percent:0;mso-height-percent:0;mso-position-horizontal:center;mso-position-horizontal-relative:margin;mso-position-vertical:center;mso-position-vertical-relative:margin;mso-width-percent:0;mso-height-percent:0" o:allowincell="f" fillcolor="silver" stroked="f">
-          <v:textpath style="font-family:&quot;Calibri&quot;;font-size:1pt" string="PRELIMINARY"/>
-          <w10:wrap anchorx="margin" anchory="margin"/>
-        </v:shape>
-      </w:pict>
-    </w:r>
   </w:p>
 </w:hdr>
 </file>
 
 <file path=word/header2.xml><?xml version="1.0" encoding="utf-8"?>
-<w:hdr xmlns:wpc="http://schemas.microsoft.com/office/word/2010/wordprocessingCanvas" xmlns:cx="http://schemas.microsoft.com/office/drawing/2014/chartex" xmlns:cx1="http://schemas.microsoft.com/office/drawing/2015/9/8/chartex" xmlns:cx2="http://schemas.microsoft.com/office/drawing/2015/10/21/chartex" xmlns:cx3="http://schemas.microsoft.com/office/drawing/2016/5/9/chartex" xmlns:cx4="http://schemas.microsoft.com/office/drawing/2016/5/10/chartex" xmlns:cx5="http://schemas.microsoft.com/office/drawing/2016/5/11/chartex" xmlns:cx6="http://schemas.microsoft.com/office/drawing/2016/5/12/chartex" xmlns:cx7="http://schemas.microsoft.com/office/drawing/2016/5/13/chartex" xmlns:cx8="http://schemas.microsoft.com/office/drawing/2016/5/14/chartex" xmlns:mc="http://schemas.openxmlformats.org/markup-compatibility/2006" xmlns:m="http://schemas.openxmlformats.org/officeDocument/2006/math" xmlns:aink="http://schemas.microsoft.com/office/drawing/2016/ink" xmlns:am3d="http://schemas.microsoft.com/office/drawing/2017/model3d" xmlns:oel="http://schemas.microsoft.com/office/2019/extlst" xmlns:r="http://schemas.openxmlformats.org/officeDocument/2006/relationships" xmlns:wp14="http://schemas.microsoft.com/office/word/2010/wordprocessingDrawing" xmlns:wp="http://schemas.openxmlformats.org/drawingml/2006/wordprocessingDrawing" xmlns:wpg="http://schemas.microsoft.com/office/word/2010/wordprocessingGroup" xmlns:wpi="http://schemas.microsoft.com/office/word/2010/wordprocessingInk" xmlns:wps="http://schemas.microsoft.com/office/word/2010/wordprocessingShape" xmlns:o="urn:schemas-microsoft-com:office:office" xmlns:v="urn:schemas-microsoft-com:vml" xmlns:w10="urn:schemas-microsoft-com:office:word" xmlns:w="http://schemas.openxmlformats.org/wordprocessingml/2006/main" xmlns:w14="http://schemas.microsoft.com/office/word/2010/wordml" xmlns:w15="http://schemas.microsoft.com/office/word/2012/wordml" xmlns:w16cei="http://schemas.microsoft.com/office/word/2026/wordml/cei" xmlns:w16cex="http://schemas.microsoft.com/office/word/2018/wordml/cex" xmlns:w16cid="http://schemas.microsoft.com/office/word/2016/wordml/cid" xmlns:w16="http://schemas.microsoft.com/office/word/2018/wordml" xmlns:w16sdtdh="http://schemas.microsoft.com/office/word/2020/wordml/sdtdatahash" xmlns:w16sdtfl="http://schemas.microsoft.com/office/word/2024/wordml/sdtformatlock" xmlns:w16se="http://schemas.microsoft.com/office/word/2015/wordml/symex" xmlns:w16du="http://schemas.microsoft.com/office/word/2023/wordml/word16du" xmlns:wne="http://schemas.microsoft.com/office/word/2006/wordml" mc:Ignorable="w14 w15 w16se w16cid w16 w16cex w16sdtdh w16sdtfl w16du wp14">
+<w:hdr xmlns:wpc="http://schemas.microsoft.com/office/word/2010/wordprocessingCanvas" xmlns:cx="http://schemas.microsoft.com/office/drawing/2014/chartex" xmlns:cx1="http://schemas.microsoft.com/office/drawing/2015/9/8/chartex" xmlns:cx2="http://schemas.microsoft.com/office/drawing/2015/10/21/chartex" xmlns:cx3="http://schemas.microsoft.com/office/drawing/2016/5/9/chartex" xmlns:cx4="http://schemas.microsoft.com/office/drawing/2016/5/10/chartex" xmlns:cx5="http://schemas.microsoft.com/office/drawing/2016/5/11/chartex" xmlns:cx6="http://schemas.microsoft.com/office/drawing/2016/5/12/chartex" xmlns:cx7="http://schemas.microsoft.com/office/drawing/2016/5/13/chartex" xmlns:cx8="http://schemas.microsoft.com/office/drawing/2016/5/14/chartex" xmlns:mc="http://schemas.openxmlformats.org/markup-compatibility/2006" xmlns:m="http://schemas.openxmlformats.org/officeDocument/2006/math" xmlns:aink="http://schemas.microsoft.com/office/drawing/2016/ink" xmlns:am3d="http://schemas.microsoft.com/office/drawing/2017/model3d" xmlns:oel="http://schemas.microsoft.com/office/2019/extlst" xmlns:r="http://schemas.openxmlformats.org/officeDocument/2006/relationships" xmlns:wp14="http://schemas.microsoft.com/office/word/2010/wordprocessingDrawing" xmlns:wp="http://schemas.openxmlformats.org/drawingml/2006/wordprocessingDrawing" xmlns:wpg="http://schemas.microsoft.com/office/word/2010/wordprocessingGroup" xmlns:wpi="http://schemas.microsoft.com/office/word/2010/wordprocessingInk" xmlns:wps="http://schemas.microsoft.com/office/word/2010/wordprocessingShape" xmlns:o="urn:schemas-microsoft-com:office:office" xmlns:v="urn:schemas-microsoft-com:vml" xmlns:w10="urn:schemas-microsoft-com:office:word" xmlns:w="http://schemas.openxmlformats.org/wordprocessingml/2006/main" xmlns:w14="http://schemas.microsoft.com/office/word/2010/wordml" xmlns:w15="http://schemas.microsoft.com/office/word/2012/wordml" xmlns:w16cex="http://schemas.microsoft.com/office/word/2018/wordml/cex" xmlns:w16cid="http://schemas.microsoft.com/office/word/2016/wordml/cid" xmlns:w16="http://schemas.microsoft.com/office/word/2018/wordml" xmlns:w16sdtdh="http://schemas.microsoft.com/office/word/2020/wordml/sdtdatahash" xmlns:w16sdtfl="http://schemas.microsoft.com/office/word/2024/wordml/sdtformatlock" xmlns:w16se="http://schemas.microsoft.com/office/word/2015/wordml/symex" xmlns:w16du="http://schemas.microsoft.com/office/word/2023/wordml/word16du" xmlns:wne="http://schemas.microsoft.com/office/word/2006/wordml" mc:Ignorable="w14 w15 w16se w16cid w16 w16cex w16sdtdh w16sdtfl w16du wp14">
   <w:p>
     <w:pPr>
       <w:pStyle w:val="Header"/>
     </w:pPr>
-    <w:r>
-      <w:rPr>
-        <w:noProof/>
-      </w:rPr>
-      <w:pict w14:anchorId="0CE38051">
-        <v:shapetype id="_x0000_t136" coordsize="21600,21600" o:spt="136" adj="10800" path="m@7,l@8,m@5,21600l@6,21600e">
-          <v:formulas>
-            <v:f eqn="sum #0 0 10800"/>
-            <v:f eqn="prod #0 2 1"/>
-            <v:f eqn="sum 21600 0 @1"/>
-            <v:f eqn="sum 0 0 @2"/>
-            <v:f eqn="sum 21600 0 @3"/>
-            <v:f eqn="if @0 @3 0"/>
-            <v:f eqn="if @0 21600 @1"/>
-            <v:f eqn="if @0 0 @2"/>
-            <v:f eqn="if @0 @4 21600"/>
-            <v:f eqn="mid @5 @6"/>
-            <v:f eqn="mid @8 @5"/>
-            <v:f eqn="mid @7 @8"/>
-            <v:f eqn="mid @6 @7"/>
-            <v:f eqn="sum @6 0 @5"/>
-          </v:formulas>
-          <v:path textpathok="t" o:connecttype="custom" o:connectlocs="@9,0;@10,10800;@11,21600;@12,10800" o:connectangles="270,180,90,0"/>
-          <v:textpath on="t" fitshape="t"/>
-          <v:handles>
-            <v:h position="#0,bottomRight" xrange="6629,14971"/>
-          </v:handles>
-          <o:lock v:ext="edit" text="t" shapetype="t"/>
-        </v:shapetype>
-        <v:shape id="PowerPlusWaterMarkObject35111194" o:spid="_x0000_s1027" type="#_x0000_t136" alt="" style="position:absolute;margin-left:0;margin-top:0;width:629.8pt;height:131.6pt;rotation:315;z-index:-251640320;mso-wrap-edited:f;mso-width-percent:0;mso-height-percent:0;mso-position-horizontal:center;mso-position-horizontal-relative:margin;mso-position-vertical:center;mso-position-vertical-relative:margin;mso-width-percent:0;mso-height-percent:0" o:allowincell="f" fillcolor="silver" stroked="f">
-          <v:textpath style="font-family:&quot;Calibri&quot;;font-size:1pt" string="PRELIMINARY"/>
-          <w10:wrap anchorx="margin" anchory="margin"/>
-        </v:shape>
-      </w:pict>
-    </w:r>
     <w:r>
       <w:rPr>
         <w:noProof/>
@@ -36126,46 +36588,11 @@
 </file>
 
 <file path=word/header3.xml><?xml version="1.0" encoding="utf-8"?>
-<w:hdr xmlns:wpc="http://schemas.microsoft.com/office/word/2010/wordprocessingCanvas" xmlns:cx="http://schemas.microsoft.com/office/drawing/2014/chartex" xmlns:cx1="http://schemas.microsoft.com/office/drawing/2015/9/8/chartex" xmlns:cx2="http://schemas.microsoft.com/office/drawing/2015/10/21/chartex" xmlns:cx3="http://schemas.microsoft.com/office/drawing/2016/5/9/chartex" xmlns:cx4="http://schemas.microsoft.com/office/drawing/2016/5/10/chartex" xmlns:cx5="http://schemas.microsoft.com/office/drawing/2016/5/11/chartex" xmlns:cx6="http://schemas.microsoft.com/office/drawing/2016/5/12/chartex" xmlns:cx7="http://schemas.microsoft.com/office/drawing/2016/5/13/chartex" xmlns:cx8="http://schemas.microsoft.com/office/drawing/2016/5/14/chartex" xmlns:mc="http://schemas.openxmlformats.org/markup-compatibility/2006" xmlns:m="http://schemas.openxmlformats.org/officeDocument/2006/math" xmlns:aink="http://schemas.microsoft.com/office/drawing/2016/ink" xmlns:am3d="http://schemas.microsoft.com/office/drawing/2017/model3d" xmlns:oel="http://schemas.microsoft.com/office/2019/extlst" xmlns:r="http://schemas.openxmlformats.org/officeDocument/2006/relationships" xmlns:wp14="http://schemas.microsoft.com/office/word/2010/wordprocessingDrawing" xmlns:wp="http://schemas.openxmlformats.org/drawingml/2006/wordprocessingDrawing" xmlns:wpg="http://schemas.microsoft.com/office/word/2010/wordprocessingGroup" xmlns:wpi="http://schemas.microsoft.com/office/word/2010/wordprocessingInk" xmlns:wps="http://schemas.microsoft.com/office/word/2010/wordprocessingShape" xmlns:o="urn:schemas-microsoft-com:office:office" xmlns:v="urn:schemas-microsoft-com:vml" xmlns:w10="urn:schemas-microsoft-com:office:word" xmlns:w="http://schemas.openxmlformats.org/wordprocessingml/2006/main" xmlns:w14="http://schemas.microsoft.com/office/word/2010/wordml" xmlns:w15="http://schemas.microsoft.com/office/word/2012/wordml" xmlns:w16cei="http://schemas.microsoft.com/office/word/2026/wordml/cei" xmlns:w16cex="http://schemas.microsoft.com/office/word/2018/wordml/cex" xmlns:w16cid="http://schemas.microsoft.com/office/word/2016/wordml/cid" xmlns:w16="http://schemas.microsoft.com/office/word/2018/wordml" xmlns:w16sdtdh="http://schemas.microsoft.com/office/word/2020/wordml/sdtdatahash" xmlns:w16sdtfl="http://schemas.microsoft.com/office/word/2024/wordml/sdtformatlock" xmlns:w16se="http://schemas.microsoft.com/office/word/2015/wordml/symex" xmlns:w16du="http://schemas.microsoft.com/office/word/2023/wordml/word16du" xmlns:wne="http://schemas.microsoft.com/office/word/2006/wordml" mc:Ignorable="w14 w15 w16se w16cid w16 w16cex w16sdtdh w16sdtfl w16du wp14">
+<w:hdr xmlns:wpc="http://schemas.microsoft.com/office/word/2010/wordprocessingCanvas" xmlns:cx="http://schemas.microsoft.com/office/drawing/2014/chartex" xmlns:cx1="http://schemas.microsoft.com/office/drawing/2015/9/8/chartex" xmlns:cx2="http://schemas.microsoft.com/office/drawing/2015/10/21/chartex" xmlns:cx3="http://schemas.microsoft.com/office/drawing/2016/5/9/chartex" xmlns:cx4="http://schemas.microsoft.com/office/drawing/2016/5/10/chartex" xmlns:cx5="http://schemas.microsoft.com/office/drawing/2016/5/11/chartex" xmlns:cx6="http://schemas.microsoft.com/office/drawing/2016/5/12/chartex" xmlns:cx7="http://schemas.microsoft.com/office/drawing/2016/5/13/chartex" xmlns:cx8="http://schemas.microsoft.com/office/drawing/2016/5/14/chartex" xmlns:mc="http://schemas.openxmlformats.org/markup-compatibility/2006" xmlns:m="http://schemas.openxmlformats.org/officeDocument/2006/math" xmlns:aink="http://schemas.microsoft.com/office/drawing/2016/ink" xmlns:am3d="http://schemas.microsoft.com/office/drawing/2017/model3d" xmlns:oel="http://schemas.microsoft.com/office/2019/extlst" xmlns:r="http://schemas.openxmlformats.org/officeDocument/2006/relationships" xmlns:wp14="http://schemas.microsoft.com/office/word/2010/wordprocessingDrawing" xmlns:wp="http://schemas.openxmlformats.org/drawingml/2006/wordprocessingDrawing" xmlns:wpg="http://schemas.microsoft.com/office/word/2010/wordprocessingGroup" xmlns:wpi="http://schemas.microsoft.com/office/word/2010/wordprocessingInk" xmlns:wps="http://schemas.microsoft.com/office/word/2010/wordprocessingShape" xmlns:o="urn:schemas-microsoft-com:office:office" xmlns:v="urn:schemas-microsoft-com:vml" xmlns:w10="urn:schemas-microsoft-com:office:word" xmlns:w="http://schemas.openxmlformats.org/wordprocessingml/2006/main" xmlns:w14="http://schemas.microsoft.com/office/word/2010/wordml" xmlns:w15="http://schemas.microsoft.com/office/word/2012/wordml" xmlns:w16cex="http://schemas.microsoft.com/office/word/2018/wordml/cex" xmlns:w16cid="http://schemas.microsoft.com/office/word/2016/wordml/cid" xmlns:w16="http://schemas.microsoft.com/office/word/2018/wordml" xmlns:w16sdtdh="http://schemas.microsoft.com/office/word/2020/wordml/sdtdatahash" xmlns:w16sdtfl="http://schemas.microsoft.com/office/word/2024/wordml/sdtformatlock" xmlns:w16se="http://schemas.microsoft.com/office/word/2015/wordml/symex" xmlns:w16du="http://schemas.microsoft.com/office/word/2023/wordml/word16du" xmlns:wne="http://schemas.microsoft.com/office/word/2006/wordml" mc:Ignorable="w14 w15 w16se w16cid w16 w16cex w16sdtdh w16sdtfl w16du wp14">
   <w:p>
     <w:pPr>
       <w:pStyle w:val="Header"/>
     </w:pPr>
-    <w:r>
-      <w:rPr>
-        <w:noProof/>
-      </w:rPr>
-      <w:pict w14:anchorId="3F0A5ED8">
-        <v:shapetype id="_x0000_t136" coordsize="21600,21600" o:spt="136" adj="10800" path="m@7,l@8,m@5,21600l@6,21600e">
-          <v:formulas>
-            <v:f eqn="sum #0 0 10800"/>
-            <v:f eqn="prod #0 2 1"/>
-            <v:f eqn="sum 21600 0 @1"/>
-            <v:f eqn="sum 0 0 @2"/>
-            <v:f eqn="sum 21600 0 @3"/>
-            <v:f eqn="if @0 @3 0"/>
-            <v:f eqn="if @0 21600 @1"/>
-            <v:f eqn="if @0 0 @2"/>
-            <v:f eqn="if @0 @4 21600"/>
-            <v:f eqn="mid @5 @6"/>
-            <v:f eqn="mid @8 @5"/>
-            <v:f eqn="mid @7 @8"/>
-            <v:f eqn="mid @6 @7"/>
-            <v:f eqn="sum @6 0 @5"/>
-          </v:formulas>
-          <v:path textpathok="t" o:connecttype="custom" o:connectlocs="@9,0;@10,10800;@11,21600;@12,10800" o:connectangles="270,180,90,0"/>
-          <v:textpath on="t" fitshape="t"/>
-          <v:handles>
-            <v:h position="#0,bottomRight" xrange="6629,14971"/>
-          </v:handles>
-          <o:lock v:ext="edit" text="t" shapetype="t"/>
-        </v:shapetype>
-        <v:shape id="PowerPlusWaterMarkObject35111192" o:spid="_x0000_s1025" type="#_x0000_t136" alt="" style="position:absolute;margin-left:0;margin-top:0;width:629.8pt;height:131.6pt;rotation:315;z-index:-251648512;mso-wrap-edited:f;mso-width-percent:0;mso-height-percent:0;mso-position-horizontal:center;mso-position-horizontal-relative:margin;mso-position-vertical:center;mso-position-vertical-relative:margin;mso-width-percent:0;mso-height-percent:0" o:allowincell="f" fillcolor="silver" stroked="f">
-          <v:textpath style="font-family:&quot;Calibri&quot;;font-size:1pt" string="PRELIMINARY"/>
-          <w10:wrap anchorx="margin" anchory="margin"/>
-        </v:shape>
-      </w:pict>
-    </w:r>
     <w:r>
       <w:rPr>
         <w:noProof/>
@@ -36321,7 +36748,7 @@
 </file>
 
 <file path=word/numbering.xml><?xml version="1.0" encoding="utf-8"?>
-<w:numbering xmlns:wpc="http://schemas.microsoft.com/office/word/2010/wordprocessingCanvas" xmlns:cx="http://schemas.microsoft.com/office/drawing/2014/chartex" xmlns:cx1="http://schemas.microsoft.com/office/drawing/2015/9/8/chartex" xmlns:cx2="http://schemas.microsoft.com/office/drawing/2015/10/21/chartex" xmlns:cx3="http://schemas.microsoft.com/office/drawing/2016/5/9/chartex" xmlns:cx4="http://schemas.microsoft.com/office/drawing/2016/5/10/chartex" xmlns:cx5="http://schemas.microsoft.com/office/drawing/2016/5/11/chartex" xmlns:cx6="http://schemas.microsoft.com/office/drawing/2016/5/12/chartex" xmlns:cx7="http://schemas.microsoft.com/office/drawing/2016/5/13/chartex" xmlns:cx8="http://schemas.microsoft.com/office/drawing/2016/5/14/chartex" xmlns:mc="http://schemas.openxmlformats.org/markup-compatibility/2006" xmlns:m="http://schemas.openxmlformats.org/officeDocument/2006/math" xmlns:aink="http://schemas.microsoft.com/office/drawing/2016/ink" xmlns:am3d="http://schemas.microsoft.com/office/drawing/2017/model3d" xmlns:oel="http://schemas.microsoft.com/office/2019/extlst" xmlns:r="http://schemas.openxmlformats.org/officeDocument/2006/relationships" xmlns:wp14="http://schemas.microsoft.com/office/word/2010/wordprocessingDrawing" xmlns:wp="http://schemas.openxmlformats.org/drawingml/2006/wordprocessingDrawing" xmlns:wpg="http://schemas.microsoft.com/office/word/2010/wordprocessingGroup" xmlns:wpi="http://schemas.microsoft.com/office/word/2010/wordprocessingInk" xmlns:wps="http://schemas.microsoft.com/office/word/2010/wordprocessingShape" xmlns:o="urn:schemas-microsoft-com:office:office" xmlns:v="urn:schemas-microsoft-com:vml" xmlns:w10="urn:schemas-microsoft-com:office:word" xmlns:w="http://schemas.openxmlformats.org/wordprocessingml/2006/main" xmlns:w14="http://schemas.microsoft.com/office/word/2010/wordml" xmlns:w15="http://schemas.microsoft.com/office/word/2012/wordml" xmlns:w16cei="http://schemas.microsoft.com/office/word/2026/wordml/cei" xmlns:w16cex="http://schemas.microsoft.com/office/word/2018/wordml/cex" xmlns:w16cid="http://schemas.microsoft.com/office/word/2016/wordml/cid" xmlns:w16="http://schemas.microsoft.com/office/word/2018/wordml" xmlns:w16sdtdh="http://schemas.microsoft.com/office/word/2020/wordml/sdtdatahash" xmlns:w16sdtfl="http://schemas.microsoft.com/office/word/2024/wordml/sdtformatlock" xmlns:w16se="http://schemas.microsoft.com/office/word/2015/wordml/symex" xmlns:w16du="http://schemas.microsoft.com/office/word/2023/wordml/word16du" xmlns:wne="http://schemas.microsoft.com/office/word/2006/wordml" mc:Ignorable="w14 w15 w16se w16cid w16 w16cex w16sdtdh w16sdtfl w16du wp14">
+<w:numbering xmlns:wpc="http://schemas.microsoft.com/office/word/2010/wordprocessingCanvas" xmlns:cx="http://schemas.microsoft.com/office/drawing/2014/chartex" xmlns:cx1="http://schemas.microsoft.com/office/drawing/2015/9/8/chartex" xmlns:cx2="http://schemas.microsoft.com/office/drawing/2015/10/21/chartex" xmlns:cx3="http://schemas.microsoft.com/office/drawing/2016/5/9/chartex" xmlns:cx4="http://schemas.microsoft.com/office/drawing/2016/5/10/chartex" xmlns:cx5="http://schemas.microsoft.com/office/drawing/2016/5/11/chartex" xmlns:cx6="http://schemas.microsoft.com/office/drawing/2016/5/12/chartex" xmlns:cx7="http://schemas.microsoft.com/office/drawing/2016/5/13/chartex" xmlns:cx8="http://schemas.microsoft.com/office/drawing/2016/5/14/chartex" xmlns:mc="http://schemas.openxmlformats.org/markup-compatibility/2006" xmlns:m="http://schemas.openxmlformats.org/officeDocument/2006/math" xmlns:aink="http://schemas.microsoft.com/office/drawing/2016/ink" xmlns:am3d="http://schemas.microsoft.com/office/drawing/2017/model3d" xmlns:oel="http://schemas.microsoft.com/office/2019/extlst" xmlns:r="http://schemas.openxmlformats.org/officeDocument/2006/relationships" xmlns:wp14="http://schemas.microsoft.com/office/word/2010/wordprocessingDrawing" xmlns:wp="http://schemas.openxmlformats.org/drawingml/2006/wordprocessingDrawing" xmlns:wpg="http://schemas.microsoft.com/office/word/2010/wordprocessingGroup" xmlns:wpi="http://schemas.microsoft.com/office/word/2010/wordprocessingInk" xmlns:wps="http://schemas.microsoft.com/office/word/2010/wordprocessingShape" xmlns:o="urn:schemas-microsoft-com:office:office" xmlns:v="urn:schemas-microsoft-com:vml" xmlns:w10="urn:schemas-microsoft-com:office:word" xmlns:w="http://schemas.openxmlformats.org/wordprocessingml/2006/main" xmlns:w14="http://schemas.microsoft.com/office/word/2010/wordml" xmlns:w15="http://schemas.microsoft.com/office/word/2012/wordml" xmlns:w16cex="http://schemas.microsoft.com/office/word/2018/wordml/cex" xmlns:w16cid="http://schemas.microsoft.com/office/word/2016/wordml/cid" xmlns:w16="http://schemas.microsoft.com/office/word/2018/wordml" xmlns:w16sdtdh="http://schemas.microsoft.com/office/word/2020/wordml/sdtdatahash" xmlns:w16sdtfl="http://schemas.microsoft.com/office/word/2024/wordml/sdtformatlock" xmlns:w16se="http://schemas.microsoft.com/office/word/2015/wordml/symex" xmlns:w16du="http://schemas.microsoft.com/office/word/2023/wordml/word16du" xmlns:wne="http://schemas.microsoft.com/office/word/2006/wordml" mc:Ignorable="w14 w15 w16se w16cid w16 w16cex w16sdtdh w16sdtfl w16du wp14">
   <w:abstractNum w:abstractNumId="0" w15:restartNumberingAfterBreak="0">
     <w:nsid w:val="2A3E5377"/>
     <w:multiLevelType w:val="hybridMultilevel"/>

</xml_diff>